<commit_message>
Review Changes Done !!
</commit_message>
<xml_diff>
--- a/source/MySEProject/Documentation/ML 2425-06 Implement_Temporal_Memory_Parallel_Version_Alabaster_Neo.docx
+++ b/source/MySEProject/Documentation/ML 2425-06 Implement_Temporal_Memory_Parallel_Version_Alabaster_Neo.docx
@@ -1139,14 +1139,23 @@
         <w:t xml:space="preserve"> </w:t>
       </w:r>
       <w:r>
-        <w:t>Prior parallel implementations of HTM achieved limited speedup(≤2x) due to sequential bottlenecks in critical function</w:t>
+        <w:t xml:space="preserve">Prior parallel implementations of HTM achieved limited speedup(≤2x) due to sequential bottlenecks in critical </w:t>
+      </w:r>
+      <w:proofErr w:type="spellStart"/>
+      <w:r>
+        <w:t>function</w:t>
       </w:r>
       <w:r>
         <w:t>l</w:t>
       </w:r>
       <w:r>
-        <w:t>ike </w:t>
-      </w:r>
+        <w:t>ike</w:t>
+      </w:r>
+      <w:proofErr w:type="spellEnd"/>
+      <w:r>
+        <w:t> </w:t>
+      </w:r>
+      <w:proofErr w:type="spellStart"/>
       <w:r>
         <w:rPr>
           <w:b/>
@@ -1154,9 +1163,11 @@
         </w:rPr>
         <w:t>segmentActive</w:t>
       </w:r>
+      <w:proofErr w:type="spellEnd"/>
       <w:r>
         <w:t> and </w:t>
       </w:r>
+      <w:proofErr w:type="spellStart"/>
       <w:r>
         <w:rPr>
           <w:b/>
@@ -1164,6 +1175,7 @@
         </w:rPr>
         <w:t>getBestMatchingSegment</w:t>
       </w:r>
+      <w:proofErr w:type="spellEnd"/>
       <w:r>
         <w:t> </w:t>
       </w:r>
@@ -2154,7 +2166,23 @@
           <w:spacing w:val="-1"/>
           <w:lang w:eastAsia="x-none"/>
         </w:rPr>
-        <w:t>Figure 1 presents our systematic optimization framework for parallelizing Temporal Memory, following an engineered pipeline from analysis to deployment. Beginning with computational profiling of the single-threaded implementation, we identified three key bottlenecks: column initialization latency, matrix operation dependencies, and SDR processing overhead. These findings informed our design of thread-safe parallel patterns that respect HTM's biological constraints while exploiting modern multi-core architectures. Four implementation variants were rigorously evaluated against both performance benchmarks (achieving 3.2× speedup) and functional accuracy requirements (&lt;1% prediction variance), with the ConcurrentDictionary method emerging as the optimal solution. This end-to-end process ensures our parallelized version maintains the algorithm's core intelligence while meeting real-world speed demands.</w:t>
+        <w:t xml:space="preserve">Figure 1 presents our systematic optimization framework for parallelizing Temporal Memory, following an engineered pipeline from analysis to deployment. Beginning with computational profiling of the single-threaded implementation, we identified three key bottlenecks: column initialization latency, matrix operation dependencies, and SDR processing overhead. These findings informed our design of thread-safe parallel patterns that respect HTM's biological constraints while exploiting modern multi-core architectures. Four implementation variants were rigorously evaluated against both performance benchmarks (achieving 3.2× speedup) and functional accuracy requirements (&lt;1% prediction variance), with the </w:t>
+      </w:r>
+      <w:proofErr w:type="spellStart"/>
+      <w:r>
+        <w:rPr>
+          <w:spacing w:val="-1"/>
+          <w:lang w:eastAsia="x-none"/>
+        </w:rPr>
+        <w:t>ConcurrentDictionary</w:t>
+      </w:r>
+      <w:proofErr w:type="spellEnd"/>
+      <w:r>
+        <w:rPr>
+          <w:spacing w:val="-1"/>
+          <w:lang w:eastAsia="x-none"/>
+        </w:rPr>
+        <w:t xml:space="preserve"> method emerging as the optimal solution. This end-to-end process ensures our parallelized version maintains the algorithm's core intelligence while meeting real-world speed demands.</w:t>
       </w:r>
     </w:p>
     <w:p>
@@ -2346,6 +2374,7 @@
         </w:rPr>
         <w:t xml:space="preserve"> </w:t>
       </w:r>
+      <w:proofErr w:type="gramStart"/>
       <w:r>
         <w:rPr>
           <w:b/>
@@ -2364,6 +2393,7 @@
         </w:rPr>
         <w:t>  loops</w:t>
       </w:r>
+      <w:proofErr w:type="gramEnd"/>
       <w:r>
         <w:rPr>
           <w:iCs/>
@@ -2380,6 +2410,7 @@
         </w:rPr>
         <w:t>were replaced with </w:t>
       </w:r>
+      <w:proofErr w:type="spellStart"/>
       <w:r>
         <w:rPr>
           <w:b/>
@@ -2389,6 +2420,7 @@
         </w:rPr>
         <w:t>Parallel.For</w:t>
       </w:r>
+      <w:proofErr w:type="spellEnd"/>
       <w:r>
         <w:rPr>
           <w:iCs/>
@@ -2552,6 +2584,7 @@
         </w:rPr>
         <w:t>where </w:t>
       </w:r>
+      <w:proofErr w:type="spellStart"/>
       <w:r>
         <w:rPr>
           <w:i/>
@@ -2561,6 +2594,7 @@
         </w:rPr>
         <w:t>ti</w:t>
       </w:r>
+      <w:proofErr w:type="spellEnd"/>
       <w:r>
         <w:rPr>
           <w:iCs/>
@@ -2569,6 +2603,7 @@
         </w:rPr>
         <w:t>​ is the time taken to process the </w:t>
       </w:r>
+      <w:proofErr w:type="spellStart"/>
       <w:r>
         <w:rPr>
           <w:i/>
@@ -2584,7 +2619,16 @@
           <w:spacing w:val="5"/>
           <w:lang w:val="en-US"/>
         </w:rPr>
-        <w:t>-th iteration. By parallelizing the loop, the execution time is reduced to:</w:t>
+        <w:t>-th</w:t>
+      </w:r>
+      <w:proofErr w:type="spellEnd"/>
+      <w:r>
+        <w:rPr>
+          <w:iCs/>
+          <w:spacing w:val="5"/>
+          <w:lang w:val="en-US"/>
+        </w:rPr>
+        <w:t xml:space="preserve"> iteration. By parallelizing the loop, the execution time is reduced to:</w:t>
       </w:r>
     </w:p>
     <w:p>
@@ -2775,8 +2819,9 @@
           <w:spacing w:val="5"/>
           <w:lang w:val="en-US"/>
         </w:rPr>
-        <w:t xml:space="preserve">B.1  </w:t>
-      </w:r>
+        <w:t>B.</w:t>
+      </w:r>
+      <w:proofErr w:type="gramStart"/>
       <w:r>
         <w:rPr>
           <w:i/>
@@ -2784,7 +2829,7 @@
           <w:spacing w:val="5"/>
           <w:lang w:val="en-US"/>
         </w:rPr>
-        <w:t>Why Parallel.For is the Better Choice</w:t>
+        <w:t xml:space="preserve">1  </w:t>
       </w:r>
       <w:r>
         <w:rPr>
@@ -2793,8 +2838,58 @@
           <w:spacing w:val="5"/>
           <w:lang w:val="en-US"/>
         </w:rPr>
+        <w:t>Why</w:t>
+      </w:r>
+      <w:proofErr w:type="gramEnd"/>
+      <w:r>
+        <w:rPr>
+          <w:i/>
+          <w:iCs/>
+          <w:spacing w:val="5"/>
+          <w:lang w:val="en-US"/>
+        </w:rPr>
+        <w:t xml:space="preserve"> </w:t>
+      </w:r>
+      <w:proofErr w:type="spellStart"/>
+      <w:r>
+        <w:rPr>
+          <w:i/>
+          <w:iCs/>
+          <w:spacing w:val="5"/>
+          <w:lang w:val="en-US"/>
+        </w:rPr>
+        <w:t>Parallel.For</w:t>
+      </w:r>
+      <w:proofErr w:type="spellEnd"/>
+      <w:r>
+        <w:rPr>
+          <w:i/>
+          <w:iCs/>
+          <w:spacing w:val="5"/>
+          <w:lang w:val="en-US"/>
+        </w:rPr>
+        <w:t xml:space="preserve"> is the Better </w:t>
+      </w:r>
+      <w:proofErr w:type="gramStart"/>
+      <w:r>
+        <w:rPr>
+          <w:i/>
+          <w:iCs/>
+          <w:spacing w:val="5"/>
+          <w:lang w:val="en-US"/>
+        </w:rPr>
+        <w:t>Choice</w:t>
+      </w:r>
+      <w:r>
+        <w:rPr>
+          <w:i/>
+          <w:iCs/>
+          <w:spacing w:val="5"/>
+          <w:lang w:val="en-US"/>
+        </w:rPr>
         <w:t xml:space="preserve"> ?</w:t>
       </w:r>
+      <w:proofErr w:type="gramEnd"/>
     </w:p>
     <w:p>
       <w:pPr>
@@ -2815,21 +2910,23 @@
         </w:rPr>
         <w:t xml:space="preserve">       </w:t>
       </w:r>
+      <w:proofErr w:type="spellStart"/>
       <w:r>
         <w:rPr>
           <w:iCs/>
           <w:spacing w:val="5"/>
           <w:lang w:val="en-US"/>
         </w:rPr>
-        <w:t>Parallel.For is the preferred choice for CPU-bound tasks due to its efficient load balancing and scalability. It automatically divides tasks into chunks and distributes them across available CPU cores, optimizing execution without requiring explicit thread management. This approach is particularly beneficial for computationally expensive yet short-lived operations like matrix initialization. By</w:t>
-      </w:r>
+        <w:t>Parallel.For</w:t>
+      </w:r>
+      <w:proofErr w:type="spellEnd"/>
       <w:r>
         <w:rPr>
           <w:iCs/>
           <w:spacing w:val="5"/>
           <w:lang w:val="en-US"/>
         </w:rPr>
-        <w:t xml:space="preserve"> </w:t>
+        <w:t xml:space="preserve"> is the preferred choice for CPU-bound tasks due to its efficient load balancing and scalability. It automatically divides tasks into chunks and distributes them across available CPU cores, optimizing execution without requiring explicit thread management. This approach is particularly beneficial for computationally expensive yet short-lived operations like matrix initialization. By</w:t>
       </w:r>
       <w:r>
         <w:rPr>
@@ -2837,7 +2934,7 @@
           <w:spacing w:val="5"/>
           <w:lang w:val="en-US"/>
         </w:rPr>
-        <w:t xml:space="preserve">reducing synchronization overhead, Parallel.For eliminates complex locking mechanisms, minimizing performance bottlenecks. Moreover, it dynamically adjusts the number of threads based on system resources, ensuring optimal performance on both multi-core and single-core systems. Unlike manual threading, it abstracts thread management using the .NET </w:t>
+        <w:t xml:space="preserve"> </w:t>
       </w:r>
       <w:r>
         <w:rPr>
@@ -2845,8 +2942,62 @@
           <w:spacing w:val="5"/>
           <w:lang w:val="en-US"/>
         </w:rPr>
+        <w:t xml:space="preserve">reducing synchronization overhead, </w:t>
+      </w:r>
+      <w:proofErr w:type="spellStart"/>
+      <w:r>
+        <w:rPr>
+          <w:iCs/>
+          <w:spacing w:val="5"/>
+          <w:lang w:val="en-US"/>
+        </w:rPr>
+        <w:t>Parallel.For</w:t>
+      </w:r>
+      <w:proofErr w:type="spellEnd"/>
+      <w:r>
+        <w:rPr>
+          <w:iCs/>
+          <w:spacing w:val="5"/>
+          <w:lang w:val="en-US"/>
+        </w:rPr>
+        <w:t xml:space="preserve"> eliminates complex locking mechanisms, minimizing performance bottlenecks. Moreover, it dynamically adjusts the number of threads based on system resources, ensuring optimal performance on both multi-core and single-core systems. Unlike manual threading, it abstracts thread management using the .NET </w:t>
+      </w:r>
+      <w:proofErr w:type="spellStart"/>
+      <w:r>
+        <w:rPr>
+          <w:iCs/>
+          <w:spacing w:val="5"/>
+          <w:lang w:val="en-US"/>
+        </w:rPr>
         <w:lastRenderedPageBreak/>
-        <w:t>ThreadPool, simplifying implementation while maintaining non-blocking execution. As a result, Parallel.For maximizes throughput by running multiple threads concurrently, making it an ideal solution for scalable parallel processing.</w:t>
+        <w:t>ThreadPool</w:t>
+      </w:r>
+      <w:proofErr w:type="spellEnd"/>
+      <w:r>
+        <w:rPr>
+          <w:iCs/>
+          <w:spacing w:val="5"/>
+          <w:lang w:val="en-US"/>
+        </w:rPr>
+        <w:t xml:space="preserve">, simplifying implementation while maintaining non-blocking execution. As a result, </w:t>
+      </w:r>
+      <w:proofErr w:type="spellStart"/>
+      <w:r>
+        <w:rPr>
+          <w:iCs/>
+          <w:spacing w:val="5"/>
+          <w:lang w:val="en-US"/>
+        </w:rPr>
+        <w:t>Parallel.For</w:t>
+      </w:r>
+      <w:proofErr w:type="spellEnd"/>
+      <w:r>
+        <w:rPr>
+          <w:iCs/>
+          <w:spacing w:val="5"/>
+          <w:lang w:val="en-US"/>
+        </w:rPr>
+        <w:t xml:space="preserve"> maximizes throughput by running multiple threads concurrently, making it an ideal solution for scalable parallel processing.</w:t>
       </w:r>
       <w:r>
         <w:rPr>
@@ -2933,6 +3084,7 @@
                 <w:lang w:val="en-US"/>
               </w:rPr>
             </w:pPr>
+            <w:proofErr w:type="spellStart"/>
             <w:r>
               <w:rPr>
                 <w:b/>
@@ -2941,7 +3093,18 @@
                 <w:spacing w:val="5"/>
                 <w:lang w:val="en-US"/>
               </w:rPr>
-              <w:t>Parallel.For (Recommended)</w:t>
+              <w:t>Parallel.For</w:t>
+            </w:r>
+            <w:proofErr w:type="spellEnd"/>
+            <w:r>
+              <w:rPr>
+                <w:b/>
+                <w:bCs/>
+                <w:iCs/>
+                <w:spacing w:val="5"/>
+                <w:lang w:val="en-US"/>
+              </w:rPr>
+              <w:t xml:space="preserve"> (Recommended)</w:t>
             </w:r>
           </w:p>
         </w:tc>
@@ -3215,8 +3378,18 @@
                 <w:spacing w:val="5"/>
                 <w:lang w:val="en-US"/>
               </w:rPr>
-              <w:t>Use of ThreadPool</w:t>
+              <w:t xml:space="preserve">Use of </w:t>
             </w:r>
+            <w:proofErr w:type="spellStart"/>
+            <w:r>
+              <w:rPr>
+                <w:iCs/>
+                <w:spacing w:val="5"/>
+                <w:lang w:val="en-US"/>
+              </w:rPr>
+              <w:t>ThreadPool</w:t>
+            </w:r>
+            <w:proofErr w:type="spellEnd"/>
           </w:p>
         </w:tc>
         <w:tc>
@@ -3402,7 +3575,27 @@
           <w:szCs w:val="16"/>
           <w:shd w:val="clear" w:color="auto" w:fill="FFFFFF"/>
         </w:rPr>
-        <w:t>Comparison: Parallel.For vs async for CPU-Bound Tasks</w:t>
+        <w:t xml:space="preserve">Comparison: </w:t>
+      </w:r>
+      <w:proofErr w:type="spellStart"/>
+      <w:r>
+        <w:rPr>
+          <w:color w:val="0D0D0D"/>
+          <w:sz w:val="16"/>
+          <w:szCs w:val="16"/>
+          <w:shd w:val="clear" w:color="auto" w:fill="FFFFFF"/>
+        </w:rPr>
+        <w:t>Parallel.For</w:t>
+      </w:r>
+      <w:proofErr w:type="spellEnd"/>
+      <w:r>
+        <w:rPr>
+          <w:color w:val="0D0D0D"/>
+          <w:sz w:val="16"/>
+          <w:szCs w:val="16"/>
+          <w:shd w:val="clear" w:color="auto" w:fill="FFFFFF"/>
+        </w:rPr>
+        <w:t xml:space="preserve"> vs async for CPU-Bound Tasks</w:t>
       </w:r>
     </w:p>
     <w:p>
@@ -3469,13 +3662,41 @@
           <w:lang w:val="en-US"/>
         </w:rPr>
       </w:pPr>
+      <w:proofErr w:type="spellStart"/>
       <w:r>
         <w:rPr>
           <w:b/>
           <w:bCs/>
           <w:lang w:val="en-US"/>
         </w:rPr>
-        <w:t>Single_Threaded_Optimized_Init()</w:t>
+        <w:t>Single_Threaded_Optimized_</w:t>
+      </w:r>
+      <w:proofErr w:type="gramStart"/>
+      <w:r>
+        <w:rPr>
+          <w:b/>
+          <w:bCs/>
+          <w:lang w:val="en-US"/>
+        </w:rPr>
+        <w:t>Init</w:t>
+      </w:r>
+      <w:proofErr w:type="spellEnd"/>
+      <w:r>
+        <w:rPr>
+          <w:b/>
+          <w:bCs/>
+          <w:lang w:val="en-US"/>
+        </w:rPr>
+        <w:t>(</w:t>
+      </w:r>
+      <w:proofErr w:type="gramEnd"/>
+      <w:r>
+        <w:rPr>
+          <w:b/>
+          <w:bCs/>
+          <w:lang w:val="en-US"/>
+        </w:rPr>
+        <w:t>)</w:t>
       </w:r>
       <w:r>
         <w:rPr>
@@ -3495,19 +3716,53 @@
           <w:lang w:val="en-US"/>
         </w:rPr>
       </w:pPr>
+      <w:proofErr w:type="spellStart"/>
+      <w:proofErr w:type="gramStart"/>
       <w:r>
         <w:rPr>
           <w:b/>
           <w:bCs/>
           <w:lang w:val="en-US"/>
         </w:rPr>
-        <w:t>InitParallelRegularDictionary()</w:t>
-      </w:r>
-      <w:r>
-        <w:rPr>
+        <w:t>InitParallelRegularDictionary</w:t>
+      </w:r>
+      <w:proofErr w:type="spellEnd"/>
+      <w:r>
+        <w:rPr>
+          <w:b/>
+          <w:bCs/>
           <w:lang w:val="en-US"/>
         </w:rPr>
-        <w:t>: This method introduced parallel execution using Parallel.For loops and regular dictionaries. Thread safety was ensured using locks, which prevented race conditions during concurrent updates.</w:t>
+        <w:t>(</w:t>
+      </w:r>
+      <w:proofErr w:type="gramEnd"/>
+      <w:r>
+        <w:rPr>
+          <w:b/>
+          <w:bCs/>
+          <w:lang w:val="en-US"/>
+        </w:rPr>
+        <w:t>)</w:t>
+      </w:r>
+      <w:r>
+        <w:rPr>
+          <w:lang w:val="en-US"/>
+        </w:rPr>
+        <w:t>: This method introduced parallel execution using </w:t>
+      </w:r>
+      <w:proofErr w:type="spellStart"/>
+      <w:r>
+        <w:rPr>
+          <w:lang w:val="en-US"/>
+        </w:rPr>
+        <w:t>Parallel.For</w:t>
+      </w:r>
+      <w:proofErr w:type="spellEnd"/>
+      <w:r>
+        <w:rPr>
+          <w:lang w:val="en-US"/>
+        </w:rPr>
+        <w:t> loops and regular dictionaries. Thread safety was ensured using locks, which prevented race conditions during concurrent updates.</w:t>
       </w:r>
     </w:p>
     <w:p>
@@ -3521,18 +3776,38 @@
           <w:lang w:val="en-US"/>
         </w:rPr>
       </w:pPr>
+      <w:proofErr w:type="spellStart"/>
+      <w:proofErr w:type="gramStart"/>
       <w:r>
         <w:rPr>
           <w:b/>
           <w:bCs/>
           <w:lang w:val="en-US"/>
         </w:rPr>
-        <w:t>InitParallelWithConcurrentDictionary()</w:t>
-      </w:r>
-      <w:r>
-        <w:rPr>
+        <w:t>InitParallelWithConcurrentDictionary</w:t>
+      </w:r>
+      <w:proofErr w:type="spellEnd"/>
+      <w:r>
+        <w:rPr>
+          <w:b/>
+          <w:bCs/>
           <w:lang w:val="en-US"/>
         </w:rPr>
+        <w:t>(</w:t>
+      </w:r>
+      <w:proofErr w:type="gramEnd"/>
+      <w:r>
+        <w:rPr>
+          <w:b/>
+          <w:bCs/>
+          <w:lang w:val="en-US"/>
+        </w:rPr>
+        <w:t>)</w:t>
+      </w:r>
+      <w:r>
+        <w:rPr>
+          <w:lang w:val="en-US"/>
+        </w:rPr>
         <w:t>: This method improved upon the previous approach by replacing</w:t>
       </w:r>
       <w:r>
@@ -3569,19 +3844,33 @@
         <w:rPr>
           <w:lang w:val="en-US"/>
         </w:rPr>
-        <w:t>with ConcurrentDicti</w:t>
-      </w:r>
+        <w:t>with </w:t>
+      </w:r>
+      <w:proofErr w:type="spellStart"/>
       <w:r>
         <w:rPr>
           <w:lang w:val="en-US"/>
         </w:rPr>
+        <w:t>ConcurrentDicti</w:t>
+      </w:r>
+      <w:r>
+        <w:rPr>
+          <w:lang w:val="en-US"/>
+        </w:rPr>
         <w:t>-</w:t>
       </w:r>
       <w:r>
         <w:rPr>
           <w:lang w:val="en-US"/>
         </w:rPr>
-        <w:t>onary, a thread-safe data structure. This eliminated the need for explicit locks, reducing synchronization overhead and improving performance.</w:t>
+        <w:t>onary</w:t>
+      </w:r>
+      <w:proofErr w:type="spellEnd"/>
+      <w:r>
+        <w:rPr>
+          <w:lang w:val="en-US"/>
+        </w:rPr>
+        <w:t>, a thread-safe data structure. This eliminated the need for explicit locks, reducing synchronization overhead and improving performance.</w:t>
       </w:r>
     </w:p>
     <w:p>
@@ -3595,20 +3884,49 @@
           <w:lang w:val="en-US"/>
         </w:rPr>
       </w:pPr>
+      <w:proofErr w:type="spellStart"/>
+      <w:proofErr w:type="gramStart"/>
       <w:r>
         <w:rPr>
           <w:b/>
           <w:bCs/>
           <w:lang w:val="en-US"/>
         </w:rPr>
-        <w:t>InitParallelPartitioned()</w:t>
-      </w:r>
-      <w:r>
-        <w:rPr>
+        <w:t>InitParallelPartitioned</w:t>
+      </w:r>
+      <w:proofErr w:type="spellEnd"/>
+      <w:r>
+        <w:rPr>
+          <w:b/>
+          <w:bCs/>
           <w:lang w:val="en-US"/>
         </w:rPr>
+        <w:t>(</w:t>
+      </w:r>
+      <w:proofErr w:type="gramEnd"/>
+      <w:r>
+        <w:rPr>
+          <w:b/>
+          <w:bCs/>
+          <w:lang w:val="en-US"/>
+        </w:rPr>
+        <w:t>)</w:t>
+      </w:r>
+      <w:r>
+        <w:rPr>
+          <w:lang w:val="en-US"/>
+        </w:rPr>
         <w:t>: This method further optimized parallel execution by partitioning the workload into smaller chunks. This approach was particularly effective for large datasets, as it minimized overhead and improved resource utilization.</w:t>
       </w:r>
+    </w:p>
+    <w:p>
+      <w:pPr>
+        <w:pStyle w:val="BodyText"/>
+        <w:ind w:left="720" w:firstLine="0"/>
+        <w:rPr>
+          <w:lang w:val="en-US"/>
+        </w:rPr>
+      </w:pPr>
     </w:p>
     <w:p>
       <w:pPr>
@@ -3776,12 +4094,24 @@
         <w:lastRenderedPageBreak/>
         <w:t>Single_Threaded_Optimized_Init()</w:t>
       </w:r>
-      <w:hyperlink r:id="rId20" w:history="1">
+      <w:hyperlink r:id="rId20" w:anchor="L44-L83" w:history="1">
         <w:r>
           <w:rPr>
             <w:rStyle w:val="Hyperlink"/>
           </w:rPr>
-          <w:t>[GitHub</w:t>
+          <w:t>[GitH</w:t>
+        </w:r>
+        <w:r>
+          <w:rPr>
+            <w:rStyle w:val="Hyperlink"/>
+          </w:rPr>
+          <w:t>u</w:t>
+        </w:r>
+        <w:r>
+          <w:rPr>
+            <w:rStyle w:val="Hyperlink"/>
+          </w:rPr>
+          <w:t>b</w:t>
         </w:r>
         <w:r>
           <w:rPr>
@@ -3808,7 +4138,23 @@
     <w:p/>
     <w:p>
       <w:r>
-        <w:t xml:space="preserve">The first method, Single_Threaded_Optimized_Init(), served as a baseline for comparison. It refines the original single-threaded implementation by reducing redundant checks and improving efficiency without introducing parallelism. </w:t>
+        <w:t xml:space="preserve">The first method, </w:t>
+      </w:r>
+      <w:proofErr w:type="spellStart"/>
+      <w:r>
+        <w:t>Single_Threaded_Optimized_</w:t>
+      </w:r>
+      <w:proofErr w:type="gramStart"/>
+      <w:r>
+        <w:t>Init</w:t>
+      </w:r>
+      <w:proofErr w:type="spellEnd"/>
+      <w:r>
+        <w:t>(</w:t>
+      </w:r>
+      <w:proofErr w:type="gramEnd"/>
+      <w:r>
+        <w:t xml:space="preserve">), served as a baseline for comparison. It refines the original single-threaded implementation by reducing redundant checks and improving efficiency without introducing parallelism. </w:t>
       </w:r>
     </w:p>
     <w:p/>
@@ -3829,7 +4175,28 @@
         <w:t>Null-Coalescing Operator (??):</w:t>
       </w:r>
       <w:r>
-        <w:t xml:space="preserve"> The null-coalescing operator is used to simplify the assignment of the matrix variable. If this.connections.Memory is null, a new SparseObjectMatrix&lt;Column&gt; is created. This eliminates unnecessary type casting and improves readability.</w:t>
+        <w:t xml:space="preserve"> The null-coalescing operator is used to simplify the assignment of the matrix variable. If </w:t>
+      </w:r>
+      <w:proofErr w:type="spellStart"/>
+      <w:proofErr w:type="gramStart"/>
+      <w:r>
+        <w:t>this.connections</w:t>
+      </w:r>
+      <w:proofErr w:type="gramEnd"/>
+      <w:r>
+        <w:t>.Memory</w:t>
+      </w:r>
+      <w:proofErr w:type="spellEnd"/>
+      <w:r>
+        <w:t xml:space="preserve"> is null, a new </w:t>
+      </w:r>
+      <w:proofErr w:type="spellStart"/>
+      <w:r>
+        <w:t>SparseObjectMatrix</w:t>
+      </w:r>
+      <w:proofErr w:type="spellEnd"/>
+      <w:r>
+        <w:t>&lt;Column&gt; is created. This eliminates unnecessary type casting and improves readability.</w:t>
       </w:r>
       <w:r>
         <w:t xml:space="preserve"> </w:t>
@@ -3895,7 +4262,25 @@
         <w:spacing w:after="120" w:line="228" w:lineRule="auto"/>
       </w:pPr>
       <w:r>
-        <w:t>A createNewColumns flag is introduced to store the result of matrix.GetObject(0) == null. This avoids repeated checks inside the loop, reducing overhead.</w:t>
+        <w:t>A </w:t>
+      </w:r>
+      <w:proofErr w:type="spellStart"/>
+      <w:r>
+        <w:t>createNewColumns</w:t>
+      </w:r>
+      <w:proofErr w:type="spellEnd"/>
+      <w:r>
+        <w:t> flag is introduced to store the result of </w:t>
+      </w:r>
+      <w:proofErr w:type="spellStart"/>
+      <w:proofErr w:type="gramStart"/>
+      <w:r>
+        <w:t>matrix.GetObject</w:t>
+      </w:r>
+      <w:proofErr w:type="spellEnd"/>
+      <w:proofErr w:type="gramEnd"/>
+      <w:r>
+        <w:t>(0) == null. This avoids repeated checks inside the loop, reducing overhead.</w:t>
       </w:r>
       <w:r>
         <w:t xml:space="preserve"> </w:t>
@@ -3938,7 +4323,23 @@
           <w:b/>
           <w:bCs/>
         </w:rPr>
-        <w:t>(colZero)</w:t>
+        <w:t>(</w:t>
+      </w:r>
+      <w:proofErr w:type="spellStart"/>
+      <w:r>
+        <w:rPr>
+          <w:b/>
+          <w:bCs/>
+        </w:rPr>
+        <w:t>colZero</w:t>
+      </w:r>
+      <w:proofErr w:type="spellEnd"/>
+      <w:r>
+        <w:rPr>
+          <w:b/>
+          <w:bCs/>
+        </w:rPr>
+        <w:t>)</w:t>
       </w:r>
       <w:r>
         <w:rPr>
@@ -3971,13 +4372,36 @@
         </w:tabs>
       </w:pPr>
       <w:r>
-        <w:t>The colZero variable in the Init method is used as a flag to determine if the Column objects have been previously created and initialized in the matrix.</w:t>
+        <w:t xml:space="preserve">The </w:t>
+      </w:r>
+      <w:proofErr w:type="spellStart"/>
+      <w:r>
+        <w:t>colZero</w:t>
+      </w:r>
+      <w:proofErr w:type="spellEnd"/>
+      <w:r>
+        <w:t xml:space="preserve"> variable in the Init method is used as a flag to determine if the Column objects have been previously created and initialized in the matrix.</w:t>
       </w:r>
       <w:r>
         <w:t xml:space="preserve"> </w:t>
       </w:r>
-      <w:r>
-        <w:t xml:space="preserve">colZero is assigned the value of the first column in the matrix using matrix.GetObject(0). </w:t>
+      <w:proofErr w:type="spellStart"/>
+      <w:r>
+        <w:t>colZero</w:t>
+      </w:r>
+      <w:proofErr w:type="spellEnd"/>
+      <w:r>
+        <w:t xml:space="preserve"> is assigned the value of the first column in the matrix using </w:t>
+      </w:r>
+      <w:proofErr w:type="spellStart"/>
+      <w:proofErr w:type="gramStart"/>
+      <w:r>
+        <w:t>matrix.GetObject</w:t>
+      </w:r>
+      <w:proofErr w:type="spellEnd"/>
+      <w:proofErr w:type="gramEnd"/>
+      <w:r>
+        <w:t xml:space="preserve">(0). </w:t>
       </w:r>
     </w:p>
     <w:p>
@@ -4021,7 +4445,15 @@
         </w:tabs>
       </w:pPr>
       <w:r>
-        <w:t>If colZero is null, new Column objects are created and added to the matrix. This happens during the initialization phase, ensuring that the columns are properly set up before they are accessed in subsequent code.</w:t>
+        <w:t xml:space="preserve">If </w:t>
+      </w:r>
+      <w:proofErr w:type="spellStart"/>
+      <w:r>
+        <w:t>colZero</w:t>
+      </w:r>
+      <w:proofErr w:type="spellEnd"/>
+      <w:r>
+        <w:t xml:space="preserve"> is null, new Column objects are created and added to the matrix. This happens during the initialization phase, ensuring that the columns are properly set up before they are accessed in subsequent code.</w:t>
       </w:r>
     </w:p>
     <w:p>
@@ -4043,7 +4475,25 @@
         </w:tabs>
       </w:pPr>
       <w:r>
-        <w:t>In the updated version of the code, the colZero variable was removed to simplify the logic. The check for whether the first column is null has been streamlined into a direct check with matrix.GetObject(0) == null.</w:t>
+        <w:t xml:space="preserve">In the updated version of the code, the </w:t>
+      </w:r>
+      <w:proofErr w:type="spellStart"/>
+      <w:r>
+        <w:t>colZero</w:t>
+      </w:r>
+      <w:proofErr w:type="spellEnd"/>
+      <w:r>
+        <w:t xml:space="preserve"> variable was removed to simplify the logic. The check for whether the first column is null has been streamlined into a direct check with </w:t>
+      </w:r>
+      <w:proofErr w:type="spellStart"/>
+      <w:proofErr w:type="gramStart"/>
+      <w:r>
+        <w:t>matrix.GetObject</w:t>
+      </w:r>
+      <w:proofErr w:type="spellEnd"/>
+      <w:proofErr w:type="gramEnd"/>
+      <w:r>
+        <w:t>(0) == null.</w:t>
       </w:r>
     </w:p>
     <w:p>
@@ -4065,12 +4515,24 @@
       <w:r>
         <w:t>InitParallelRegularDictionary()</w:t>
       </w:r>
-      <w:hyperlink r:id="rId21" w:history="1">
+      <w:hyperlink r:id="rId21" w:anchor="L96-L166" w:history="1">
         <w:r>
           <w:rPr>
             <w:rStyle w:val="Hyperlink"/>
           </w:rPr>
-          <w:t>[GitHub</w:t>
+          <w:t>[GitH</w:t>
+        </w:r>
+        <w:r>
+          <w:rPr>
+            <w:rStyle w:val="Hyperlink"/>
+          </w:rPr>
+          <w:t>u</w:t>
+        </w:r>
+        <w:r>
+          <w:rPr>
+            <w:rStyle w:val="Hyperlink"/>
+          </w:rPr>
+          <w:t>b</w:t>
         </w:r>
         <w:r>
           <w:rPr>
@@ -4106,7 +4568,28 @@
         <w:tab/>
       </w:r>
       <w:r>
-        <w:t xml:space="preserve">The second method, InitParallelRegularDictionary(), introduces parallel execution using Parallel.For loops and regular dictionaries. </w:t>
+        <w:t xml:space="preserve">The second method, </w:t>
+      </w:r>
+      <w:proofErr w:type="spellStart"/>
+      <w:proofErr w:type="gramStart"/>
+      <w:r>
+        <w:t>InitParallelRegularDictionary</w:t>
+      </w:r>
+      <w:proofErr w:type="spellEnd"/>
+      <w:r>
+        <w:t>(</w:t>
+      </w:r>
+      <w:proofErr w:type="gramEnd"/>
+      <w:r>
+        <w:t xml:space="preserve">), introduces parallel execution using </w:t>
+      </w:r>
+      <w:proofErr w:type="spellStart"/>
+      <w:r>
+        <w:t>Parallel.For</w:t>
+      </w:r>
+      <w:proofErr w:type="spellEnd"/>
+      <w:r>
+        <w:t xml:space="preserve"> loops and regular dictionaries. </w:t>
       </w:r>
     </w:p>
     <w:p>
@@ -4123,7 +4606,15 @@
         <w:jc w:val="both"/>
       </w:pPr>
       <w:r>
-        <w:t>Parallel Column Initialization: The Parallel.For loop is used to distribute the initialization of columns across multiple threads. Each thread creates a new Column object and assigns it to the matrix.</w:t>
+        <w:t xml:space="preserve">Parallel Column Initialization: The </w:t>
+      </w:r>
+      <w:proofErr w:type="spellStart"/>
+      <w:r>
+        <w:t>Parallel.For</w:t>
+      </w:r>
+      <w:proofErr w:type="spellEnd"/>
+      <w:r>
+        <w:t xml:space="preserve"> loop is used to distribute the initialization of columns across multiple threads. Each thread creates a new Column object and assigns it to the matrix.</w:t>
       </w:r>
     </w:p>
     <w:p>
@@ -4159,12 +4650,24 @@
       <w:r>
         <w:t>InitParallelWithConcurrentDictionary()</w:t>
       </w:r>
-      <w:hyperlink r:id="rId22" w:history="1">
+      <w:hyperlink r:id="rId22" w:anchor="L180-L238" w:history="1">
         <w:r>
           <w:rPr>
             <w:rStyle w:val="Hyperlink"/>
           </w:rPr>
-          <w:t>[GitHub</w:t>
+          <w:t>[Git</w:t>
+        </w:r>
+        <w:r>
+          <w:rPr>
+            <w:rStyle w:val="Hyperlink"/>
+          </w:rPr>
+          <w:t>H</w:t>
+        </w:r>
+        <w:r>
+          <w:rPr>
+            <w:rStyle w:val="Hyperlink"/>
+          </w:rPr>
+          <w:t>ub</w:t>
         </w:r>
         <w:r>
           <w:rPr>
@@ -4191,7 +4694,28 @@
     <w:p/>
     <w:p>
       <w:r>
-        <w:t xml:space="preserve">The third method, InitParallelWithConcurrentDictionary(), improves upon the previous approach by using ConcurrentDictionary for thread-safe operations. </w:t>
+        <w:t>The third method, </w:t>
+      </w:r>
+      <w:proofErr w:type="spellStart"/>
+      <w:proofErr w:type="gramStart"/>
+      <w:r>
+        <w:t>InitParallelWithConcurrentDictionary</w:t>
+      </w:r>
+      <w:proofErr w:type="spellEnd"/>
+      <w:r>
+        <w:t>(</w:t>
+      </w:r>
+      <w:proofErr w:type="gramEnd"/>
+      <w:r>
+        <w:t>), improves upon the previous approach by using </w:t>
+      </w:r>
+      <w:proofErr w:type="spellStart"/>
+      <w:r>
+        <w:t>ConcurrentDictionary</w:t>
+      </w:r>
+      <w:proofErr w:type="spellEnd"/>
+      <w:r>
+        <w:t xml:space="preserve"> for thread-safe operations. </w:t>
       </w:r>
     </w:p>
     <w:p/>
@@ -4202,15 +4726,40 @@
           <w:numId w:val="14"/>
         </w:numPr>
       </w:pPr>
+      <w:proofErr w:type="spellStart"/>
       <w:r>
         <w:rPr>
           <w:b/>
           <w:bCs/>
         </w:rPr>
-        <w:t>ConcurrentDictionary for Thread Safety</w:t>
-      </w:r>
-      <w:r>
-        <w:t>: The ConcurrentDictionary data structure is used to store columns during parallel initialization. This eliminates the need for explicit locks, as ConcurrentDictionary handles thread safety internally</w:t>
+        <w:t>ConcurrentDictionary</w:t>
+      </w:r>
+      <w:proofErr w:type="spellEnd"/>
+      <w:r>
+        <w:rPr>
+          <w:b/>
+          <w:bCs/>
+        </w:rPr>
+        <w:t xml:space="preserve"> for Thread Safety</w:t>
+      </w:r>
+      <w:r>
+        <w:t>: The </w:t>
+      </w:r>
+      <w:proofErr w:type="spellStart"/>
+      <w:r>
+        <w:t>ConcurrentDictionary</w:t>
+      </w:r>
+      <w:proofErr w:type="spellEnd"/>
+      <w:r>
+        <w:t> data structure is used to store columns during parallel initialization. This eliminates the need for explicit locks, as </w:t>
+      </w:r>
+      <w:proofErr w:type="spellStart"/>
+      <w:r>
+        <w:t>ConcurrentDictionary</w:t>
+      </w:r>
+      <w:proofErr w:type="spellEnd"/>
+      <w:r>
+        <w:t> handles thread safety internally</w:t>
       </w:r>
       <w:r>
         <w:t>.</w:t>
@@ -4232,7 +4781,15 @@
         <w:t>Reduced Redundant Checks</w:t>
       </w:r>
       <w:r>
-        <w:t>: The createNewColumns flag is used to avoid repeated checks inside the loop, similar to the previous methods.</w:t>
+        <w:t>: The </w:t>
+      </w:r>
+      <w:proofErr w:type="spellStart"/>
+      <w:r>
+        <w:t>createNewColumns</w:t>
+      </w:r>
+      <w:proofErr w:type="spellEnd"/>
+      <w:r>
+        <w:t> flag is used to avoid repeated checks inside the loop, similar to the previous methods.</w:t>
       </w:r>
     </w:p>
     <w:p>
@@ -4246,12 +4803,24 @@
       <w:r>
         <w:t>InitParallelPartitioned()</w:t>
       </w:r>
-      <w:hyperlink r:id="rId23" w:history="1">
+      <w:hyperlink r:id="rId23" w:anchor="L250-L334" w:history="1">
         <w:r>
           <w:rPr>
             <w:rStyle w:val="Hyperlink"/>
           </w:rPr>
-          <w:t>[GitHub</w:t>
+          <w:t>[GitH</w:t>
+        </w:r>
+        <w:r>
+          <w:rPr>
+            <w:rStyle w:val="Hyperlink"/>
+          </w:rPr>
+          <w:t>u</w:t>
+        </w:r>
+        <w:r>
+          <w:rPr>
+            <w:rStyle w:val="Hyperlink"/>
+          </w:rPr>
+          <w:t>b</w:t>
         </w:r>
         <w:r>
           <w:rPr>
@@ -4278,7 +4847,20 @@
     <w:p/>
     <w:p>
       <w:r>
-        <w:t xml:space="preserve">The fourth method, InitParallelPartitioned(), further optimizes parallel execution by partitioning the workload into smaller chunks. </w:t>
+        <w:t>The fourth method, </w:t>
+      </w:r>
+      <w:proofErr w:type="spellStart"/>
+      <w:proofErr w:type="gramStart"/>
+      <w:r>
+        <w:t>InitParallelPartitioned</w:t>
+      </w:r>
+      <w:proofErr w:type="spellEnd"/>
+      <w:r>
+        <w:t>(</w:t>
+      </w:r>
+      <w:proofErr w:type="gramEnd"/>
+      <w:r>
+        <w:t xml:space="preserve">), further optimizes parallel execution by partitioning the workload into smaller chunks. </w:t>
       </w:r>
     </w:p>
     <w:p>
@@ -4296,7 +4878,15 @@
         <w:t>Partitioned Parallel Initialization</w:t>
       </w:r>
       <w:r>
-        <w:t>: The Partitioner.Create method is used to divide the workload into smaller partitions. This reduces overhead and improves performance for large datasets.</w:t>
+        <w:t>: The </w:t>
+      </w:r>
+      <w:proofErr w:type="spellStart"/>
+      <w:r>
+        <w:t>Partitioner.Create</w:t>
+      </w:r>
+      <w:proofErr w:type="spellEnd"/>
+      <w:r>
+        <w:t> method is used to divide the workload into smaller partitions. This reduces overhead and improves performance for large datasets.</w:t>
       </w:r>
     </w:p>
     <w:p/>
@@ -4440,6 +5030,62 @@
         </w:rPr>
         <w:t>results</w:t>
       </w:r>
+      <w:r>
+        <w:rPr>
+          <w:rStyle w:val="Strong"/>
+        </w:rPr>
+        <w:t xml:space="preserve"> </w:t>
+      </w:r>
+      <w:hyperlink r:id="rId24" w:history="1">
+        <w:r>
+          <w:rPr>
+            <w:rStyle w:val="Hyperlink"/>
+          </w:rPr>
+          <w:t>[</w:t>
+        </w:r>
+        <w:r>
+          <w:rPr>
+            <w:rStyle w:val="Hyperlink"/>
+            <w:bCs/>
+          </w:rPr>
+          <w:t>Performance No</w:t>
+        </w:r>
+        <w:r>
+          <w:rPr>
+            <w:rStyle w:val="Hyperlink"/>
+            <w:bCs/>
+          </w:rPr>
+          <w:t>t</w:t>
+        </w:r>
+        <w:r>
+          <w:rPr>
+            <w:rStyle w:val="Hyperlink"/>
+            <w:bCs/>
+          </w:rPr>
+          <w:t>ebook</w:t>
+        </w:r>
+        <w:r>
+          <w:rPr>
+            <w:rStyle w:val="Hyperlink"/>
+            <w:bCs/>
+          </w:rPr>
+          <w:t xml:space="preserve"> </w:t>
+        </w:r>
+        <w:r>
+          <w:rPr>
+            <w:rStyle w:val="Hyperlink"/>
+            <w:rFonts w:hint="eastAsia"/>
+            <w:bCs/>
+          </w:rPr>
+          <w:t>↗</w:t>
+        </w:r>
+        <w:r>
+          <w:rPr>
+            <w:rStyle w:val="Hyperlink"/>
+          </w:rPr>
+          <w:t>]</w:t>
+        </w:r>
+      </w:hyperlink>
     </w:p>
     <w:p>
       <w:pPr>
@@ -4490,7 +5136,78 @@
         <w:rPr>
           <w:color w:val="0D0D0D" w:themeColor="text1" w:themeTint="F2"/>
         </w:rPr>
-        <w:t>Single_Threaded_Optimized_Init(), InitParallelRegularDictionary(), InitParallelWithConcurrentDictionary(), and InitParallelPartitioned(). The performance metrics are visualized using bar charts and scatter plots to provide a clear understanding of the improvements.</w:t>
+        <w:t>Single_Threaded_Optimized_</w:t>
+      </w:r>
+      <w:proofErr w:type="gramStart"/>
+      <w:r>
+        <w:rPr>
+          <w:color w:val="0D0D0D" w:themeColor="text1" w:themeTint="F2"/>
+        </w:rPr>
+        <w:t>Init(</w:t>
+      </w:r>
+      <w:proofErr w:type="gramEnd"/>
+      <w:r>
+        <w:rPr>
+          <w:color w:val="0D0D0D" w:themeColor="text1" w:themeTint="F2"/>
+        </w:rPr>
+        <w:t>), </w:t>
+      </w:r>
+      <w:proofErr w:type="gramStart"/>
+      <w:r>
+        <w:rPr>
+          <w:color w:val="0D0D0D" w:themeColor="text1" w:themeTint="F2"/>
+        </w:rPr>
+        <w:t>InitParallelRegularDictionary(</w:t>
+      </w:r>
+      <w:proofErr w:type="gramEnd"/>
+      <w:r>
+        <w:rPr>
+          <w:color w:val="0D0D0D" w:themeColor="text1" w:themeTint="F2"/>
+        </w:rPr>
+        <w:t>), </w:t>
+      </w:r>
+      <w:proofErr w:type="gramStart"/>
+      <w:r>
+        <w:rPr>
+          <w:color w:val="0D0D0D" w:themeColor="text1" w:themeTint="F2"/>
+        </w:rPr>
+        <w:t>InitParallelWithConcurrentDictionary(</w:t>
+      </w:r>
+      <w:proofErr w:type="gramEnd"/>
+      <w:r>
+        <w:rPr>
+          <w:color w:val="0D0D0D" w:themeColor="text1" w:themeTint="F2"/>
+        </w:rPr>
+        <w:t>), and </w:t>
+      </w:r>
+      <w:proofErr w:type="spellStart"/>
+      <w:proofErr w:type="gramStart"/>
+      <w:r>
+        <w:rPr>
+          <w:color w:val="0D0D0D" w:themeColor="text1" w:themeTint="F2"/>
+        </w:rPr>
+        <w:t>InitParallelPartitioned</w:t>
+      </w:r>
+      <w:proofErr w:type="spellEnd"/>
+      <w:r>
+        <w:rPr>
+          <w:color w:val="0D0D0D" w:themeColor="text1" w:themeTint="F2"/>
+        </w:rPr>
+        <w:t>(</w:t>
+      </w:r>
+      <w:proofErr w:type="gramEnd"/>
+      <w:r>
+        <w:rPr>
+          <w:color w:val="0D0D0D" w:themeColor="text1" w:themeTint="F2"/>
+        </w:rPr>
+        <w:t xml:space="preserve">). The performance metrics are </w:t>
+      </w:r>
+      <w:r>
+        <w:rPr>
+          <w:color w:val="0D0D0D" w:themeColor="text1" w:themeTint="F2"/>
+        </w:rPr>
+        <w:lastRenderedPageBreak/>
+        <w:t>visualized using bar charts and scatter plots to provide a clear understanding of the improvements.</w:t>
       </w:r>
     </w:p>
     <w:p>
@@ -4504,7 +5221,6 @@
         <w:rPr>
           <w:shd w:val="clear" w:color="auto" w:fill="FFFFFF"/>
         </w:rPr>
-        <w:lastRenderedPageBreak/>
         <w:t>Performance Analysis</w:t>
       </w:r>
       <w:r>
@@ -4665,6 +5381,8 @@
           <w:shd w:val="clear" w:color="auto" w:fill="FFFFFF"/>
         </w:rPr>
       </w:pPr>
+      <w:proofErr w:type="spellStart"/>
+      <w:proofErr w:type="gramStart"/>
       <w:r>
         <w:rPr>
           <w:b/>
@@ -4672,7 +5390,27 @@
           <w:color w:val="0D0D0D"/>
           <w:shd w:val="clear" w:color="auto" w:fill="FFFFFF"/>
         </w:rPr>
-        <w:t>InitParallelWithConcurrentDictionary()</w:t>
+        <w:t>InitParallelWithConcurrentDictionary</w:t>
+      </w:r>
+      <w:proofErr w:type="spellEnd"/>
+      <w:r>
+        <w:rPr>
+          <w:b/>
+          <w:bCs/>
+          <w:color w:val="0D0D0D"/>
+          <w:shd w:val="clear" w:color="auto" w:fill="FFFFFF"/>
+        </w:rPr>
+        <w:t>(</w:t>
+      </w:r>
+      <w:proofErr w:type="gramEnd"/>
+      <w:r>
+        <w:rPr>
+          <w:b/>
+          <w:bCs/>
+          <w:color w:val="0D0D0D"/>
+          <w:shd w:val="clear" w:color="auto" w:fill="FFFFFF"/>
+        </w:rPr>
+        <w:t>)</w:t>
       </w:r>
       <w:r>
         <w:rPr>
@@ -5104,8 +5842,21 @@
             <w:tcW w:w="1879" w:type="dxa"/>
           </w:tcPr>
           <w:p>
+            <w:proofErr w:type="spellStart"/>
             <w:r>
-              <w:t>Single_Threaded_Optimized_Init()</w:t>
+              <w:t>Single_Threaded_Optimized_</w:t>
+            </w:r>
+            <w:proofErr w:type="gramStart"/>
+            <w:r>
+              <w:t>Init</w:t>
+            </w:r>
+            <w:proofErr w:type="spellEnd"/>
+            <w:r>
+              <w:t>(</w:t>
+            </w:r>
+            <w:proofErr w:type="gramEnd"/>
+            <w:r>
+              <w:t>)</w:t>
             </w:r>
           </w:p>
           <w:p/>
@@ -5157,8 +5908,18 @@
             <w:tcW w:w="1879" w:type="dxa"/>
           </w:tcPr>
           <w:p>
+            <w:proofErr w:type="spellStart"/>
+            <w:proofErr w:type="gramStart"/>
             <w:r>
-              <w:t>InitParallelRegularDictionary()</w:t>
+              <w:t>InitParallelRegularDictionary</w:t>
+            </w:r>
+            <w:proofErr w:type="spellEnd"/>
+            <w:r>
+              <w:t>(</w:t>
+            </w:r>
+            <w:proofErr w:type="gramEnd"/>
+            <w:r>
+              <w:t>)</w:t>
             </w:r>
           </w:p>
           <w:p/>
@@ -5216,12 +5977,30 @@
                 <w:bCs/>
               </w:rPr>
             </w:pPr>
+            <w:proofErr w:type="spellStart"/>
+            <w:proofErr w:type="gramStart"/>
             <w:r>
               <w:rPr>
                 <w:b/>
                 <w:bCs/>
               </w:rPr>
-              <w:t>InitParallelWithConcurrentDictionary()</w:t>
+              <w:t>InitParallelWithConcurrentDictionary</w:t>
+            </w:r>
+            <w:proofErr w:type="spellEnd"/>
+            <w:r>
+              <w:rPr>
+                <w:b/>
+                <w:bCs/>
+              </w:rPr>
+              <w:t>(</w:t>
+            </w:r>
+            <w:proofErr w:type="gramEnd"/>
+            <w:r>
+              <w:rPr>
+                <w:b/>
+                <w:bCs/>
+              </w:rPr>
+              <w:t>)</w:t>
             </w:r>
           </w:p>
           <w:p/>
@@ -5313,8 +6092,18 @@
             <w:tcW w:w="1879" w:type="dxa"/>
           </w:tcPr>
           <w:p>
+            <w:proofErr w:type="spellStart"/>
+            <w:proofErr w:type="gramStart"/>
             <w:r>
-              <w:t>InitParallelPartitioned()</w:t>
+              <w:t>InitParallelPartitioned</w:t>
+            </w:r>
+            <w:proofErr w:type="spellEnd"/>
+            <w:r>
+              <w:t>(</w:t>
+            </w:r>
+            <w:proofErr w:type="gramEnd"/>
+            <w:r>
+              <w:t>)</w:t>
             </w:r>
           </w:p>
           <w:p/>
@@ -5474,8 +6263,21 @@
           <w:numId w:val="22"/>
         </w:numPr>
       </w:pPr>
-      <w:r>
-        <w:t>Single_Threaded_Optimized_Init() - Our optimized baseline</w:t>
+      <w:proofErr w:type="spellStart"/>
+      <w:r>
+        <w:t>Single_Threaded_Optimized_</w:t>
+      </w:r>
+      <w:proofErr w:type="gramStart"/>
+      <w:r>
+        <w:t>Init</w:t>
+      </w:r>
+      <w:proofErr w:type="spellEnd"/>
+      <w:r>
+        <w:t>(</w:t>
+      </w:r>
+      <w:proofErr w:type="gramEnd"/>
+      <w:r>
+        <w:t>) - Our optimized baseline</w:t>
       </w:r>
     </w:p>
     <w:p>
@@ -5485,8 +6287,18 @@
           <w:numId w:val="22"/>
         </w:numPr>
       </w:pPr>
-      <w:r>
-        <w:t>InitParallelRegularDictionary() - Parallel with locks</w:t>
+      <w:proofErr w:type="spellStart"/>
+      <w:proofErr w:type="gramStart"/>
+      <w:r>
+        <w:t>InitParallelRegularDictionary</w:t>
+      </w:r>
+      <w:proofErr w:type="spellEnd"/>
+      <w:r>
+        <w:t>(</w:t>
+      </w:r>
+      <w:proofErr w:type="gramEnd"/>
+      <w:r>
+        <w:t>) - Parallel with locks</w:t>
       </w:r>
     </w:p>
     <w:p>
@@ -5496,9 +6308,24 @@
           <w:numId w:val="22"/>
         </w:numPr>
       </w:pPr>
-      <w:r>
-        <w:t>InitParallelWithConcurrentDictionary() - Parallel with ConcurrentDictionary</w:t>
-      </w:r>
+      <w:proofErr w:type="spellStart"/>
+      <w:proofErr w:type="gramStart"/>
+      <w:r>
+        <w:t>InitParallelWithConcurrentDictionary</w:t>
+      </w:r>
+      <w:proofErr w:type="spellEnd"/>
+      <w:r>
+        <w:t>(</w:t>
+      </w:r>
+      <w:proofErr w:type="gramEnd"/>
+      <w:r>
+        <w:t xml:space="preserve">) - Parallel with </w:t>
+      </w:r>
+      <w:proofErr w:type="spellStart"/>
+      <w:r>
+        <w:t>ConcurrentDictionary</w:t>
+      </w:r>
+      <w:proofErr w:type="spellEnd"/>
     </w:p>
     <w:p>
       <w:pPr>
@@ -5507,8 +6334,18 @@
           <w:numId w:val="22"/>
         </w:numPr>
       </w:pPr>
-      <w:r>
-        <w:t>InitParallelPartitioned() - Parallel with partitioned workload</w:t>
+      <w:proofErr w:type="spellStart"/>
+      <w:proofErr w:type="gramStart"/>
+      <w:r>
+        <w:t>InitParallelPartitioned</w:t>
+      </w:r>
+      <w:proofErr w:type="spellEnd"/>
+      <w:r>
+        <w:t>(</w:t>
+      </w:r>
+      <w:proofErr w:type="gramEnd"/>
+      <w:r>
+        <w:t>) - Parallel with partitioned workload</w:t>
       </w:r>
     </w:p>
     <w:p>
@@ -5577,8 +6414,29 @@
                           </w:p>
                           <w:p>
                             <w:r>
-                              <w:t xml:space="preserve"> HtmConfig htmConfig = new HtmConfig</w:t>
+                              <w:t xml:space="preserve"> </w:t>
                             </w:r>
+                            <w:proofErr w:type="spellStart"/>
+                            <w:r>
+                              <w:t>HtmConfig</w:t>
+                            </w:r>
+                            <w:proofErr w:type="spellEnd"/>
+                            <w:r>
+                              <w:t xml:space="preserve"> </w:t>
+                            </w:r>
+                            <w:proofErr w:type="spellStart"/>
+                            <w:r>
+                              <w:t>htmConfig</w:t>
+                            </w:r>
+                            <w:proofErr w:type="spellEnd"/>
+                            <w:r>
+                              <w:t xml:space="preserve"> = new </w:t>
+                            </w:r>
+                            <w:proofErr w:type="spellStart"/>
+                            <w:r>
+                              <w:t>HtmConfig</w:t>
+                            </w:r>
+                            <w:proofErr w:type="spellEnd"/>
                           </w:p>
                           <w:p>
                             <w:r>
@@ -5587,22 +6445,70 @@
                           </w:p>
                           <w:p>
                             <w:r>
-                              <w:t xml:space="preserve">     ColumnDimensions = new int[] { 100 }, // Example dimensions</w:t>
+                              <w:t xml:space="preserve">     </w:t>
+                            </w:r>
+                            <w:proofErr w:type="spellStart"/>
+                            <w:r>
+                              <w:t>ColumnDimensions</w:t>
+                            </w:r>
+                            <w:proofErr w:type="spellEnd"/>
+                            <w:r>
+                              <w:t xml:space="preserve"> = new </w:t>
+                            </w:r>
+                            <w:proofErr w:type="gramStart"/>
+                            <w:r>
+                              <w:t>int[</w:t>
+                            </w:r>
+                            <w:proofErr w:type="gramEnd"/>
+                            <w:r>
+                              <w:t xml:space="preserve">] </w:t>
+                            </w:r>
+                            <w:proofErr w:type="gramStart"/>
+                            <w:r>
+                              <w:t>{ 100</w:t>
+                            </w:r>
+                            <w:proofErr w:type="gramEnd"/>
+                            <w:r>
+                              <w:t xml:space="preserve"> }, // Example dimensions</w:t>
                             </w:r>
                           </w:p>
                           <w:p>
                             <w:r>
-                              <w:t xml:space="preserve">     CellsPerColumn = 32,</w:t>
+                              <w:t xml:space="preserve">     </w:t>
+                            </w:r>
+                            <w:proofErr w:type="spellStart"/>
+                            <w:r>
+                              <w:t>CellsPerColumn</w:t>
+                            </w:r>
+                            <w:proofErr w:type="spellEnd"/>
+                            <w:r>
+                              <w:t xml:space="preserve"> = 32,</w:t>
                             </w:r>
                           </w:p>
                           <w:p>
                             <w:r>
-                              <w:t xml:space="preserve">     SynPermConnected = 0.1,</w:t>
+                              <w:t xml:space="preserve">     </w:t>
+                            </w:r>
+                            <w:proofErr w:type="spellStart"/>
+                            <w:r>
+                              <w:t>SynPermConnected</w:t>
+                            </w:r>
+                            <w:proofErr w:type="spellEnd"/>
+                            <w:r>
+                              <w:t xml:space="preserve"> = 0.1,</w:t>
                             </w:r>
                           </w:p>
                           <w:p>
                             <w:r>
-                              <w:t xml:space="preserve">     NumInputs = 100</w:t>
+                              <w:t xml:space="preserve">     </w:t>
+                            </w:r>
+                            <w:proofErr w:type="spellStart"/>
+                            <w:r>
+                              <w:t>NumInputs</w:t>
+                            </w:r>
+                            <w:proofErr w:type="spellEnd"/>
+                            <w:r>
+                              <w:t xml:space="preserve"> = 100</w:t>
                             </w:r>
                           </w:p>
                           <w:p>
@@ -5759,7 +6665,7 @@
                     <pic:cNvPicPr/>
                   </pic:nvPicPr>
                   <pic:blipFill>
-                    <a:blip r:embed="rId24"/>
+                    <a:blip r:embed="rId25"/>
                     <a:stretch>
                       <a:fillRect/>
                     </a:stretch>
@@ -5968,7 +6874,11 @@
           </w:tcPr>
           <w:p>
             <w:r>
-              <w:t>Max Initialization Time (s)</w:t>
+              <w:t xml:space="preserve">Max Initialization </w:t>
+            </w:r>
+            <w:r>
+              <w:lastRenderedPageBreak/>
+              <w:t>Time (s)</w:t>
             </w:r>
           </w:p>
         </w:tc>
@@ -5978,7 +6888,12 @@
           </w:tcPr>
           <w:p>
             <w:r>
-              <w:t>Min Initialization Time (s)</w:t>
+              <w:lastRenderedPageBreak/>
+              <w:t xml:space="preserve">Min Initialization </w:t>
+            </w:r>
+            <w:r>
+              <w:lastRenderedPageBreak/>
+              <w:t>Time (s)</w:t>
             </w:r>
           </w:p>
         </w:tc>
@@ -5988,6 +6903,7 @@
           </w:tcPr>
           <w:p>
             <w:r>
+              <w:lastRenderedPageBreak/>
               <w:t>Ratio (Max/Min)</w:t>
             </w:r>
           </w:p>
@@ -5999,9 +6915,21 @@
             <w:tcW w:w="3196" w:type="dxa"/>
           </w:tcPr>
           <w:p>
+            <w:proofErr w:type="spellStart"/>
             <w:r>
-              <w:lastRenderedPageBreak/>
-              <w:t>Single_Threaded_Optimized_Init()</w:t>
+              <w:t>Single_Threaded_Optimized_</w:t>
+            </w:r>
+            <w:proofErr w:type="gramStart"/>
+            <w:r>
+              <w:t>Init</w:t>
+            </w:r>
+            <w:proofErr w:type="spellEnd"/>
+            <w:r>
+              <w:t>(</w:t>
+            </w:r>
+            <w:proofErr w:type="gramEnd"/>
+            <w:r>
+              <w:t>)</w:t>
             </w:r>
           </w:p>
         </w:tc>
@@ -6042,8 +6970,18 @@
             <w:tcW w:w="3196" w:type="dxa"/>
           </w:tcPr>
           <w:p>
+            <w:proofErr w:type="spellStart"/>
+            <w:proofErr w:type="gramStart"/>
             <w:r>
-              <w:t>InitParallelRegularDictionary()</w:t>
+              <w:t>InitParallelRegularDictionary</w:t>
+            </w:r>
+            <w:proofErr w:type="spellEnd"/>
+            <w:r>
+              <w:t>(</w:t>
+            </w:r>
+            <w:proofErr w:type="gramEnd"/>
+            <w:r>
+              <w:t>)</w:t>
             </w:r>
           </w:p>
         </w:tc>
@@ -6084,8 +7022,18 @@
             <w:tcW w:w="3196" w:type="dxa"/>
           </w:tcPr>
           <w:p>
+            <w:proofErr w:type="spellStart"/>
+            <w:proofErr w:type="gramStart"/>
             <w:r>
-              <w:t>InitParallelWithConcurrentDictionary()</w:t>
+              <w:t>InitParallelWithConcurrentDictionary</w:t>
+            </w:r>
+            <w:proofErr w:type="spellEnd"/>
+            <w:r>
+              <w:t>(</w:t>
+            </w:r>
+            <w:proofErr w:type="gramEnd"/>
+            <w:r>
+              <w:t>)</w:t>
             </w:r>
           </w:p>
         </w:tc>
@@ -6136,8 +7084,18 @@
             <w:tcW w:w="3196" w:type="dxa"/>
           </w:tcPr>
           <w:p>
+            <w:proofErr w:type="spellStart"/>
+            <w:proofErr w:type="gramStart"/>
             <w:r>
-              <w:t>InitParallelPartitioned()</w:t>
+              <w:t>InitParallelPartitioned</w:t>
+            </w:r>
+            <w:proofErr w:type="spellEnd"/>
+            <w:r>
+              <w:t>(</w:t>
+            </w:r>
+            <w:proofErr w:type="gramEnd"/>
+            <w:r>
+              <w:t>)</w:t>
             </w:r>
           </w:p>
         </w:tc>
@@ -6265,7 +7223,32 @@
           <w:color w:val="0D0D0D"/>
           <w:shd w:val="clear" w:color="auto" w:fill="FFFFFF"/>
         </w:rPr>
-        <w:t>The InitParallelWithConcurrentDictionary() method demonstrates the lowest max/min ratio, indicating that it offers the most consistent performance even in worst-case scenarios.</w:t>
+        <w:t>The </w:t>
+      </w:r>
+      <w:proofErr w:type="spellStart"/>
+      <w:proofErr w:type="gramStart"/>
+      <w:r>
+        <w:rPr>
+          <w:color w:val="0D0D0D"/>
+          <w:shd w:val="clear" w:color="auto" w:fill="FFFFFF"/>
+        </w:rPr>
+        <w:t>InitParallelWithConcurrentDictionary</w:t>
+      </w:r>
+      <w:proofErr w:type="spellEnd"/>
+      <w:r>
+        <w:rPr>
+          <w:color w:val="0D0D0D"/>
+          <w:shd w:val="clear" w:color="auto" w:fill="FFFFFF"/>
+        </w:rPr>
+        <w:t>(</w:t>
+      </w:r>
+      <w:proofErr w:type="gramEnd"/>
+      <w:r>
+        <w:rPr>
+          <w:color w:val="0D0D0D"/>
+          <w:shd w:val="clear" w:color="auto" w:fill="FFFFFF"/>
+        </w:rPr>
+        <w:t>) method demonstrates the lowest max/min ratio, indicating that it offers the most consistent performance even in worst-case scenarios.</w:t>
       </w:r>
     </w:p>
     <w:p>
@@ -6360,12 +7343,30 @@
           <w:shd w:val="clear" w:color="auto" w:fill="FFFFFF"/>
         </w:rPr>
       </w:pPr>
-      <w:r>
-        <w:rPr>
-          <w:color w:val="0D0D0D"/>
-          <w:shd w:val="clear" w:color="auto" w:fill="FFFFFF"/>
-        </w:rPr>
-        <w:t>InitParallelWithConcurrentDictionary() method outperforms the other methods in terms of </w:t>
+      <w:proofErr w:type="spellStart"/>
+      <w:proofErr w:type="gramStart"/>
+      <w:r>
+        <w:rPr>
+          <w:color w:val="0D0D0D"/>
+          <w:shd w:val="clear" w:color="auto" w:fill="FFFFFF"/>
+        </w:rPr>
+        <w:t>InitParallelWithConcurrentDictionary</w:t>
+      </w:r>
+      <w:proofErr w:type="spellEnd"/>
+      <w:r>
+        <w:rPr>
+          <w:color w:val="0D0D0D"/>
+          <w:shd w:val="clear" w:color="auto" w:fill="FFFFFF"/>
+        </w:rPr>
+        <w:t>(</w:t>
+      </w:r>
+      <w:proofErr w:type="gramEnd"/>
+      <w:r>
+        <w:rPr>
+          <w:color w:val="0D0D0D"/>
+          <w:shd w:val="clear" w:color="auto" w:fill="FFFFFF"/>
+        </w:rPr>
+        <w:t>) method outperforms the other methods in terms of </w:t>
       </w:r>
       <w:r>
         <w:rPr>
@@ -6475,7 +7476,32 @@
           <w:color w:val="0D0D0D"/>
           <w:shd w:val="clear" w:color="auto" w:fill="FFFFFF"/>
         </w:rPr>
-        <w:t>The InitParallelWithConcurrentDictionary() meth</w:t>
+        <w:t>The </w:t>
+      </w:r>
+      <w:proofErr w:type="spellStart"/>
+      <w:proofErr w:type="gramStart"/>
+      <w:r>
+        <w:rPr>
+          <w:color w:val="0D0D0D"/>
+          <w:shd w:val="clear" w:color="auto" w:fill="FFFFFF"/>
+        </w:rPr>
+        <w:t>InitParallelWithConcurrentDictionary</w:t>
+      </w:r>
+      <w:proofErr w:type="spellEnd"/>
+      <w:r>
+        <w:rPr>
+          <w:color w:val="0D0D0D"/>
+          <w:shd w:val="clear" w:color="auto" w:fill="FFFFFF"/>
+        </w:rPr>
+        <w:t>(</w:t>
+      </w:r>
+      <w:proofErr w:type="gramEnd"/>
+      <w:r>
+        <w:rPr>
+          <w:color w:val="0D0D0D"/>
+          <w:shd w:val="clear" w:color="auto" w:fill="FFFFFF"/>
+        </w:rPr>
+        <w:t>) meth</w:t>
       </w:r>
       <w:r>
         <w:rPr>
@@ -6703,19 +7729,44 @@
         </w:rPr>
         <w:t xml:space="preserve">compares the initialization and </w:t>
       </w:r>
-      <w:r>
-        <w:rPr>
-          <w:color w:val="0D0D0D"/>
-          <w:shd w:val="clear" w:color="auto" w:fill="FFFFFF"/>
-        </w:rPr>
-        <w:t>computation  time for </w:t>
-      </w:r>
-      <w:r>
-        <w:rPr>
-          <w:color w:val="0D0D0D"/>
-          <w:shd w:val="clear" w:color="auto" w:fill="FFFFFF"/>
-        </w:rPr>
-        <w:t>the InitParallelWithConcurrentDictionary() method across different test cases. The X-axis represents the test cases, and the Y-axis represents the time in seconds. The chart uses blue bars for initialization time and green bars for computation time.</w:t>
+      <w:proofErr w:type="gramStart"/>
+      <w:r>
+        <w:rPr>
+          <w:color w:val="0D0D0D"/>
+          <w:shd w:val="clear" w:color="auto" w:fill="FFFFFF"/>
+        </w:rPr>
+        <w:t>computation  time</w:t>
+      </w:r>
+      <w:proofErr w:type="gramEnd"/>
+      <w:r>
+        <w:rPr>
+          <w:color w:val="0D0D0D"/>
+          <w:shd w:val="clear" w:color="auto" w:fill="FFFFFF"/>
+        </w:rPr>
+        <w:t> for </w:t>
+      </w:r>
+      <w:r>
+        <w:rPr>
+          <w:color w:val="0D0D0D"/>
+          <w:shd w:val="clear" w:color="auto" w:fill="FFFFFF"/>
+        </w:rPr>
+        <w:t>the </w:t>
+      </w:r>
+      <w:proofErr w:type="gramStart"/>
+      <w:r>
+        <w:rPr>
+          <w:color w:val="0D0D0D"/>
+          <w:shd w:val="clear" w:color="auto" w:fill="FFFFFF"/>
+        </w:rPr>
+        <w:t>InitParallelWithConcurrentDictionary(</w:t>
+      </w:r>
+      <w:proofErr w:type="gramEnd"/>
+      <w:r>
+        <w:rPr>
+          <w:color w:val="0D0D0D"/>
+          <w:shd w:val="clear" w:color="auto" w:fill="FFFFFF"/>
+        </w:rPr>
+        <w:t>) method across different test cases. The X-axis represents the test cases, and the Y-axis represents the time in seconds. The chart uses blue bars for initialization time and green bars for computation time.</w:t>
       </w:r>
     </w:p>
     <w:p>
@@ -6738,14 +7789,32 @@
           <w:color w:val="0D0D0D"/>
           <w:shd w:val="clear" w:color="auto" w:fill="FFFFFF"/>
         </w:rPr>
-        <w:t xml:space="preserve">Initialization Time: The parallelized method (InitParallelWithConcurrentDictionary()) </w:t>
-      </w:r>
-      <w:r>
-        <w:rPr>
-          <w:color w:val="0D0D0D"/>
-          <w:shd w:val="clear" w:color="auto" w:fill="FFFFFF"/>
-        </w:rPr>
-        <w:t>consistently outperforms the single-threaded method, with a significant reduction in initialization time.</w:t>
+        <w:t>Initialization Time: The parallelized method (</w:t>
+      </w:r>
+      <w:proofErr w:type="spellStart"/>
+      <w:proofErr w:type="gramStart"/>
+      <w:r>
+        <w:rPr>
+          <w:color w:val="0D0D0D"/>
+          <w:shd w:val="clear" w:color="auto" w:fill="FFFFFF"/>
+        </w:rPr>
+        <w:t>InitParallelWithConcurrentDictionary</w:t>
+      </w:r>
+      <w:proofErr w:type="spellEnd"/>
+      <w:r>
+        <w:rPr>
+          <w:color w:val="0D0D0D"/>
+          <w:shd w:val="clear" w:color="auto" w:fill="FFFFFF"/>
+        </w:rPr>
+        <w:t>(</w:t>
+      </w:r>
+      <w:proofErr w:type="gramEnd"/>
+      <w:r>
+        <w:rPr>
+          <w:color w:val="0D0D0D"/>
+          <w:shd w:val="clear" w:color="auto" w:fill="FFFFFF"/>
+        </w:rPr>
+        <w:t>)) consistently outperforms the single-threaded method, with a significant reduction in initialization time.</w:t>
       </w:r>
     </w:p>
     <w:p>
@@ -6825,6 +7894,8 @@
         </w:rPr>
         <w:t> performance of the </w:t>
       </w:r>
+      <w:proofErr w:type="spellStart"/>
+      <w:proofErr w:type="gramStart"/>
       <w:r>
         <w:rPr>
           <w:b/>
@@ -6832,21 +7903,57 @@
           <w:color w:val="0D0D0D"/>
           <w:shd w:val="clear" w:color="auto" w:fill="FFFFFF"/>
         </w:rPr>
-        <w:t>InitParallelWithConcurrentDictionary()</w:t>
-      </w:r>
-      <w:r>
-        <w:rPr>
-          <w:color w:val="0D0D0D"/>
-          <w:shd w:val="clear" w:color="auto" w:fill="FFFFFF"/>
-        </w:rPr>
-        <w:t> method in relation to traditional methods.</w:t>
-      </w:r>
-      <w:r>
-        <w:rPr>
-          <w:color w:val="0D0D0D"/>
-          <w:shd w:val="clear" w:color="auto" w:fill="FFFFFF"/>
-        </w:rPr>
-        <w:t xml:space="preserve">[Figure </w:t>
+        <w:t>InitParallelWithConcurrentDictionary</w:t>
+      </w:r>
+      <w:proofErr w:type="spellEnd"/>
+      <w:r>
+        <w:rPr>
+          <w:b/>
+          <w:bCs/>
+          <w:color w:val="0D0D0D"/>
+          <w:shd w:val="clear" w:color="auto" w:fill="FFFFFF"/>
+        </w:rPr>
+        <w:t>(</w:t>
+      </w:r>
+      <w:proofErr w:type="gramEnd"/>
+      <w:r>
+        <w:rPr>
+          <w:b/>
+          <w:bCs/>
+          <w:color w:val="0D0D0D"/>
+          <w:shd w:val="clear" w:color="auto" w:fill="FFFFFF"/>
+        </w:rPr>
+        <w:t>)</w:t>
+      </w:r>
+      <w:r>
+        <w:rPr>
+          <w:color w:val="0D0D0D"/>
+          <w:shd w:val="clear" w:color="auto" w:fill="FFFFFF"/>
+        </w:rPr>
+        <w:t xml:space="preserve"> method in relation to traditional </w:t>
+      </w:r>
+      <w:proofErr w:type="gramStart"/>
+      <w:r>
+        <w:rPr>
+          <w:color w:val="0D0D0D"/>
+          <w:shd w:val="clear" w:color="auto" w:fill="FFFFFF"/>
+        </w:rPr>
+        <w:t>methods.</w:t>
+      </w:r>
+      <w:r>
+        <w:rPr>
+          <w:color w:val="0D0D0D"/>
+          <w:shd w:val="clear" w:color="auto" w:fill="FFFFFF"/>
+        </w:rPr>
+        <w:t>[</w:t>
+      </w:r>
+      <w:proofErr w:type="gramEnd"/>
+      <w:r>
+        <w:rPr>
+          <w:color w:val="0D0D0D"/>
+          <w:shd w:val="clear" w:color="auto" w:fill="FFFFFF"/>
+        </w:rPr>
+        <w:t xml:space="preserve">Figure </w:t>
       </w:r>
       <w:r>
         <w:rPr>
@@ -6935,7 +8042,7 @@
                     </pic:cNvPicPr>
                   </pic:nvPicPr>
                   <pic:blipFill>
-                    <a:blip r:embed="rId25" cstate="print">
+                    <a:blip r:embed="rId26" cstate="print">
                       <a:extLst>
                         <a:ext uri="{28A0092B-C50C-407E-A947-70E740481C1C}">
                           <a14:useLocalDpi xmlns:a14="http://schemas.microsoft.com/office/drawing/2010/main" val="0"/>
@@ -7068,7 +8175,7 @@
                     </pic:cNvPicPr>
                   </pic:nvPicPr>
                   <pic:blipFill>
-                    <a:blip r:embed="rId26" cstate="print">
+                    <a:blip r:embed="rId27" cstate="print">
                       <a:extLst>
                         <a:ext uri="{28A0092B-C50C-407E-A947-70E740481C1C}">
                           <a14:useLocalDpi xmlns:a14="http://schemas.microsoft.com/office/drawing/2010/main" val="0"/>
@@ -7227,6 +8334,7 @@
           <w:color w:val="0D0D0D"/>
           <w:shd w:val="clear" w:color="auto" w:fill="FFFFFF"/>
         </w:rPr>
+        <w:lastRenderedPageBreak/>
         <w:t xml:space="preserve">The </w:t>
       </w:r>
       <w:r>
@@ -7262,22 +8370,55 @@
           <w:color w:val="0D0D0D"/>
           <w:shd w:val="clear" w:color="auto" w:fill="FFFFFF"/>
         </w:rPr>
-        <w:t xml:space="preserve">ation of </w:t>
-      </w:r>
-      <w:r>
-        <w:rPr>
-          <w:color w:val="0D0D0D"/>
-          <w:shd w:val="clear" w:color="auto" w:fill="FFFFFF"/>
-        </w:rPr>
-        <w:t xml:space="preserve"> the relationship between initialization time and computation time </w:t>
-      </w:r>
-      <w:r>
-        <w:rPr>
-          <w:color w:val="0D0D0D"/>
-          <w:shd w:val="clear" w:color="auto" w:fill="FFFFFF"/>
-        </w:rPr>
-        <w:lastRenderedPageBreak/>
-        <w:t>for the InitParallelWithConcurrentDictionary() method. The X-axis represents the test cases, and the Y-axis represents the execution times in seconds. Blue circles represent the standard initialization time, while red crosses represent the parallel initialization time.</w:t>
+        <w:t xml:space="preserve">ation </w:t>
+      </w:r>
+      <w:proofErr w:type="gramStart"/>
+      <w:r>
+        <w:rPr>
+          <w:color w:val="0D0D0D"/>
+          <w:shd w:val="clear" w:color="auto" w:fill="FFFFFF"/>
+        </w:rPr>
+        <w:t xml:space="preserve">of </w:t>
+      </w:r>
+      <w:r>
+        <w:rPr>
+          <w:color w:val="0D0D0D"/>
+          <w:shd w:val="clear" w:color="auto" w:fill="FFFFFF"/>
+        </w:rPr>
+        <w:t xml:space="preserve"> the</w:t>
+      </w:r>
+      <w:proofErr w:type="gramEnd"/>
+      <w:r>
+        <w:rPr>
+          <w:color w:val="0D0D0D"/>
+          <w:shd w:val="clear" w:color="auto" w:fill="FFFFFF"/>
+        </w:rPr>
+        <w:t xml:space="preserve"> relationship between initialization time and computation time for the </w:t>
+      </w:r>
+      <w:proofErr w:type="spellStart"/>
+      <w:proofErr w:type="gramStart"/>
+      <w:r>
+        <w:rPr>
+          <w:color w:val="0D0D0D"/>
+          <w:shd w:val="clear" w:color="auto" w:fill="FFFFFF"/>
+        </w:rPr>
+        <w:t>InitParallelWithConcurrentDictionary</w:t>
+      </w:r>
+      <w:proofErr w:type="spellEnd"/>
+      <w:r>
+        <w:rPr>
+          <w:color w:val="0D0D0D"/>
+          <w:shd w:val="clear" w:color="auto" w:fill="FFFFFF"/>
+        </w:rPr>
+        <w:t>(</w:t>
+      </w:r>
+      <w:proofErr w:type="gramEnd"/>
+      <w:r>
+        <w:rPr>
+          <w:color w:val="0D0D0D"/>
+          <w:shd w:val="clear" w:color="auto" w:fill="FFFFFF"/>
+        </w:rPr>
+        <w:t>) method. The X-axis represents the test cases, and the Y-axis represents the execution times in seconds. Blue circles represent the standard initialization time, while red crosses represent the parallel initialization time.</w:t>
       </w:r>
     </w:p>
     <w:p>
@@ -7314,7 +8455,32 @@
           <w:color w:val="0D0D0D"/>
           <w:shd w:val="clear" w:color="auto" w:fill="FFFFFF"/>
         </w:rPr>
-        <w:t xml:space="preserve"> method (InitParallelWithConcurrentDictionary()) has a lower initialization time compared to the single-threaded method across all test cases.</w:t>
+        <w:t xml:space="preserve"> method (</w:t>
+      </w:r>
+      <w:proofErr w:type="spellStart"/>
+      <w:proofErr w:type="gramStart"/>
+      <w:r>
+        <w:rPr>
+          <w:color w:val="0D0D0D"/>
+          <w:shd w:val="clear" w:color="auto" w:fill="FFFFFF"/>
+        </w:rPr>
+        <w:t>InitParallelWithConcurrentDictionary</w:t>
+      </w:r>
+      <w:proofErr w:type="spellEnd"/>
+      <w:r>
+        <w:rPr>
+          <w:color w:val="0D0D0D"/>
+          <w:shd w:val="clear" w:color="auto" w:fill="FFFFFF"/>
+        </w:rPr>
+        <w:t>(</w:t>
+      </w:r>
+      <w:proofErr w:type="gramEnd"/>
+      <w:r>
+        <w:rPr>
+          <w:color w:val="0D0D0D"/>
+          <w:shd w:val="clear" w:color="auto" w:fill="FFFFFF"/>
+        </w:rPr>
+        <w:t>)) has a lower initialization time compared to the single-threaded method across all test cases.</w:t>
       </w:r>
     </w:p>
     <w:p>
@@ -7337,14 +8503,30 @@
           <w:color w:val="0D0D0D"/>
           <w:shd w:val="clear" w:color="auto" w:fill="FFFFFF"/>
         </w:rPr>
-        <w:t>Computation Time: The scatter plot also highlights the consistency of the parallelized method, with most data points clustered around lower execution times.</w:t>
-      </w:r>
-      <w:r>
-        <w:rPr>
-          <w:color w:val="0D0D0D"/>
-          <w:shd w:val="clear" w:color="auto" w:fill="FFFFFF"/>
-        </w:rPr>
-        <w:t xml:space="preserve">[Figure </w:t>
+        <w:t xml:space="preserve">Computation Time: The scatter plot also highlights the consistency of the parallelized method, with most data points clustered around lower execution </w:t>
+      </w:r>
+      <w:proofErr w:type="gramStart"/>
+      <w:r>
+        <w:rPr>
+          <w:color w:val="0D0D0D"/>
+          <w:shd w:val="clear" w:color="auto" w:fill="FFFFFF"/>
+        </w:rPr>
+        <w:t>times.</w:t>
+      </w:r>
+      <w:r>
+        <w:rPr>
+          <w:color w:val="0D0D0D"/>
+          <w:shd w:val="clear" w:color="auto" w:fill="FFFFFF"/>
+        </w:rPr>
+        <w:t>[</w:t>
+      </w:r>
+      <w:proofErr w:type="gramEnd"/>
+      <w:r>
+        <w:rPr>
+          <w:color w:val="0D0D0D"/>
+          <w:shd w:val="clear" w:color="auto" w:fill="FFFFFF"/>
+        </w:rPr>
+        <w:t xml:space="preserve">Figure </w:t>
       </w:r>
       <w:r>
         <w:rPr>
@@ -7421,7 +8603,7 @@
                     </pic:cNvPicPr>
                   </pic:nvPicPr>
                   <pic:blipFill>
-                    <a:blip r:embed="rId27" cstate="print">
+                    <a:blip r:embed="rId28" cstate="print">
                       <a:extLst>
                         <a:ext uri="{28A0092B-C50C-407E-A947-70E740481C1C}">
                           <a14:useLocalDpi xmlns:a14="http://schemas.microsoft.com/office/drawing/2010/main" val="0"/>
@@ -7575,7 +8757,7 @@
                     </pic:cNvPicPr>
                   </pic:nvPicPr>
                   <pic:blipFill>
-                    <a:blip r:embed="rId28" cstate="print">
+                    <a:blip r:embed="rId29" cstate="print">
                       <a:extLst>
                         <a:ext uri="{28A0092B-C50C-407E-A947-70E740481C1C}">
                           <a14:useLocalDpi xmlns:a14="http://schemas.microsoft.com/office/drawing/2010/main" val="0"/>
@@ -7731,10 +8913,23 @@
     <w:p/>
     <w:p>
       <w:r>
-        <w:t xml:space="preserve">In this section, we compare the performance of the new multi-threaded method (InitParallel) with the old single-threaded method (Init) across different CPU core </w:t>
-      </w:r>
-      <w:r>
-        <w:t>configurations (4, 6, 8, 10, and All cores) on differnt PC'S. The results are visualized through box-and-whisker plots, highlighting the differences in initialization and computation times.</w:t>
+        <w:t>In this section, we compare the performance of the new multi-threaded method (</w:t>
+      </w:r>
+      <w:proofErr w:type="spellStart"/>
+      <w:r>
+        <w:t>InitParallel</w:t>
+      </w:r>
+      <w:proofErr w:type="spellEnd"/>
+      <w:r>
+        <w:t xml:space="preserve">) with the old single-threaded method (Init) across different CPU core configurations (4, 6, 8, 10, and All cores) on </w:t>
+      </w:r>
+      <w:proofErr w:type="spellStart"/>
+      <w:r>
+        <w:t>differnt</w:t>
+      </w:r>
+      <w:proofErr w:type="spellEnd"/>
+      <w:r>
+        <w:t xml:space="preserve"> PC'S. The results are visualized through box-and-whisker plots, highlighting the differences in initialization and computation times.</w:t>
       </w:r>
     </w:p>
     <w:p>
@@ -7749,7 +8944,23 @@
           <w:b/>
           <w:bCs/>
         </w:rPr>
-        <w:t>New Method (InitParallel)</w:t>
+        <w:t>New Method (</w:t>
+      </w:r>
+      <w:proofErr w:type="spellStart"/>
+      <w:r>
+        <w:rPr>
+          <w:b/>
+          <w:bCs/>
+        </w:rPr>
+        <w:t>InitParallel</w:t>
+      </w:r>
+      <w:proofErr w:type="spellEnd"/>
+      <w:r>
+        <w:rPr>
+          <w:b/>
+          <w:bCs/>
+        </w:rPr>
+        <w:t>)</w:t>
       </w:r>
       <w:r>
         <w:t>: Utilizes a multi-threading approach for faster initialization.</w:t>
@@ -7780,13 +8991,45 @@
     </w:p>
     <w:p>
       <w:r>
-        <w:t>Graph between InitParallel_Time vs ComputeParallel_Time for All CPU Cores on Different PCs-</w:t>
+        <w:t xml:space="preserve">Graph between </w:t>
+      </w:r>
+      <w:proofErr w:type="spellStart"/>
+      <w:r>
+        <w:t>InitParallel_Time</w:t>
+      </w:r>
+      <w:proofErr w:type="spellEnd"/>
+      <w:r>
+        <w:t xml:space="preserve"> vs </w:t>
+      </w:r>
+      <w:proofErr w:type="spellStart"/>
+      <w:r>
+        <w:t>ComputeParallel_Time</w:t>
+      </w:r>
+      <w:proofErr w:type="spellEnd"/>
+      <w:r>
+        <w:t xml:space="preserve"> for All CPU Cores on Different PCs-</w:t>
       </w:r>
     </w:p>
     <w:p/>
     <w:p>
       <w:r>
-        <w:t>This graph visualizes the performance comparison between initialization time (InitParallel_Time) and computation time (iComputeParallel_Time) for different CPU core configurations across multiple PCs. The graph provides insight into how both tasks scale with the number of CPU cores</w:t>
+        <w:t>This graph visualizes the performance comparison between initialization time (</w:t>
+      </w:r>
+      <w:proofErr w:type="spellStart"/>
+      <w:r>
+        <w:t>InitParallel_Time</w:t>
+      </w:r>
+      <w:proofErr w:type="spellEnd"/>
+      <w:r>
+        <w:t>) and computation time (</w:t>
+      </w:r>
+      <w:proofErr w:type="spellStart"/>
+      <w:r>
+        <w:t>iComputeParallel_Time</w:t>
+      </w:r>
+      <w:proofErr w:type="spellEnd"/>
+      <w:r>
+        <w:t>) for different CPU core configurations across multiple PCs. The graph provides insight into how both tasks scale with the number of CPU cores</w:t>
       </w:r>
       <w:r>
         <w:t xml:space="preserve"> </w:t>
@@ -7834,7 +9077,7 @@
                     </pic:cNvPicPr>
                   </pic:nvPicPr>
                   <pic:blipFill>
-                    <a:blip r:embed="rId29" cstate="print">
+                    <a:blip r:embed="rId30" cstate="print">
                       <a:extLst>
                         <a:ext uri="{28A0092B-C50C-407E-A947-70E740481C1C}">
                           <a14:useLocalDpi xmlns:a14="http://schemas.microsoft.com/office/drawing/2010/main" val="0"/>
@@ -7931,8 +9174,9 @@
           <w:szCs w:val="16"/>
           <w:shd w:val="clear" w:color="auto" w:fill="FFFFFF"/>
         </w:rPr>
-        <w:t>omparison between initialization time (InitParallel_Time) and computation time (ComputeParallel_Time) for CPU core</w:t>
-      </w:r>
+        <w:t>omparison between initialization time (</w:t>
+      </w:r>
+      <w:proofErr w:type="spellStart"/>
       <w:r>
         <w:rPr>
           <w:color w:val="0D0D0D"/>
@@ -7940,8 +9184,9 @@
           <w:szCs w:val="16"/>
           <w:shd w:val="clear" w:color="auto" w:fill="FFFFFF"/>
         </w:rPr>
-        <w:t xml:space="preserve"> 4 &amp; 6</w:t>
-      </w:r>
+        <w:t>InitParallel_Time</w:t>
+      </w:r>
+      <w:proofErr w:type="spellEnd"/>
       <w:r>
         <w:rPr>
           <w:color w:val="0D0D0D"/>
@@ -7949,8 +9194,9 @@
           <w:szCs w:val="16"/>
           <w:shd w:val="clear" w:color="auto" w:fill="FFFFFF"/>
         </w:rPr>
-        <w:t xml:space="preserve"> configurations across multiple PCs</w:t>
-      </w:r>
+        <w:t>) and computation time (</w:t>
+      </w:r>
+      <w:proofErr w:type="spellStart"/>
       <w:r>
         <w:rPr>
           <w:color w:val="0D0D0D"/>
@@ -7958,6 +9204,43 @@
           <w:szCs w:val="16"/>
           <w:shd w:val="clear" w:color="auto" w:fill="FFFFFF"/>
         </w:rPr>
+        <w:t>ComputeParallel_Time</w:t>
+      </w:r>
+      <w:proofErr w:type="spellEnd"/>
+      <w:r>
+        <w:rPr>
+          <w:color w:val="0D0D0D"/>
+          <w:sz w:val="16"/>
+          <w:szCs w:val="16"/>
+          <w:shd w:val="clear" w:color="auto" w:fill="FFFFFF"/>
+        </w:rPr>
+        <w:t>) for CPU core</w:t>
+      </w:r>
+      <w:r>
+        <w:rPr>
+          <w:color w:val="0D0D0D"/>
+          <w:sz w:val="16"/>
+          <w:szCs w:val="16"/>
+          <w:shd w:val="clear" w:color="auto" w:fill="FFFFFF"/>
+        </w:rPr>
+        <w:t xml:space="preserve"> 4 &amp; 6</w:t>
+      </w:r>
+      <w:r>
+        <w:rPr>
+          <w:color w:val="0D0D0D"/>
+          <w:sz w:val="16"/>
+          <w:szCs w:val="16"/>
+          <w:shd w:val="clear" w:color="auto" w:fill="FFFFFF"/>
+        </w:rPr>
+        <w:t xml:space="preserve"> configurations across multiple PCs</w:t>
+      </w:r>
+      <w:r>
+        <w:rPr>
+          <w:color w:val="0D0D0D"/>
+          <w:sz w:val="16"/>
+          <w:szCs w:val="16"/>
+          <w:shd w:val="clear" w:color="auto" w:fill="FFFFFF"/>
+        </w:rPr>
         <w:t>.</w:t>
       </w:r>
     </w:p>
@@ -7968,9 +9251,9 @@
           <w:noProof/>
         </w:rPr>
         <w:drawing>
-          <wp:inline distT="0" distB="0" distL="0" distR="0" wp14:anchorId="14825D7C" wp14:editId="5D093966">
-            <wp:extent cx="3325495" cy="2516505"/>
-            <wp:effectExtent l="0" t="0" r="8255" b="0"/>
+          <wp:inline distT="0" distB="0" distL="0" distR="0" wp14:anchorId="14825D7C" wp14:editId="02B0D50B">
+            <wp:extent cx="3325495" cy="2164080"/>
+            <wp:effectExtent l="0" t="0" r="8255" b="7620"/>
             <wp:docPr id="1162038797" name="Picture 5" descr="A group of boxes with different colored squares&#10;&#10;AI-generated content may be incorrect."/>
             <wp:cNvGraphicFramePr>
               <a:graphicFrameLocks xmlns:a="http://schemas.openxmlformats.org/drawingml/2006/main" noChangeAspect="1"/>
@@ -7980,164 +9263,6 @@
                 <pic:pic xmlns:pic="http://schemas.openxmlformats.org/drawingml/2006/picture">
                   <pic:nvPicPr>
                     <pic:cNvPr id="1162038797" name="Picture 5" descr="A group of boxes with different colored squares&#10;&#10;AI-generated content may be incorrect."/>
-                    <pic:cNvPicPr>
-                      <a:picLocks noChangeAspect="1" noChangeArrowheads="1"/>
-                    </pic:cNvPicPr>
-                  </pic:nvPicPr>
-                  <pic:blipFill>
-                    <a:blip r:embed="rId30" cstate="print">
-                      <a:extLst>
-                        <a:ext uri="{28A0092B-C50C-407E-A947-70E740481C1C}">
-                          <a14:useLocalDpi xmlns:a14="http://schemas.microsoft.com/office/drawing/2010/main" val="0"/>
-                        </a:ext>
-                      </a:extLst>
-                    </a:blip>
-                    <a:srcRect/>
-                    <a:stretch>
-                      <a:fillRect/>
-                    </a:stretch>
-                  </pic:blipFill>
-                  <pic:spPr bwMode="auto">
-                    <a:xfrm>
-                      <a:off x="0" y="0"/>
-                      <a:ext cx="3332521" cy="2521822"/>
-                    </a:xfrm>
-                    <a:prstGeom prst="rect">
-                      <a:avLst/>
-                    </a:prstGeom>
-                    <a:noFill/>
-                    <a:ln>
-                      <a:noFill/>
-                    </a:ln>
-                  </pic:spPr>
-                </pic:pic>
-              </a:graphicData>
-            </a:graphic>
-          </wp:inline>
-        </w:drawing>
-      </w:r>
-    </w:p>
-    <w:p>
-      <w:pPr>
-        <w:jc w:val="center"/>
-      </w:pPr>
-    </w:p>
-    <w:p>
-      <w:pPr>
-        <w:jc w:val="center"/>
-        <w:rPr>
-          <w:color w:val="0D0D0D"/>
-          <w:sz w:val="16"/>
-          <w:szCs w:val="16"/>
-          <w:shd w:val="clear" w:color="auto" w:fill="FFFFFF"/>
-        </w:rPr>
-      </w:pPr>
-      <w:r>
-        <w:rPr>
-          <w:b/>
-          <w:bCs/>
-          <w:color w:val="0D0D0D"/>
-          <w:sz w:val="16"/>
-          <w:szCs w:val="16"/>
-          <w:shd w:val="clear" w:color="auto" w:fill="FFFFFF"/>
-        </w:rPr>
-        <w:t xml:space="preserve">Figure </w:t>
-      </w:r>
-      <w:r>
-        <w:rPr>
-          <w:b/>
-          <w:bCs/>
-          <w:color w:val="0D0D0D"/>
-          <w:sz w:val="16"/>
-          <w:szCs w:val="16"/>
-          <w:shd w:val="clear" w:color="auto" w:fill="FFFFFF"/>
-        </w:rPr>
-        <w:t>8</w:t>
-      </w:r>
-      <w:r>
-        <w:rPr>
-          <w:color w:val="0D0D0D"/>
-          <w:sz w:val="16"/>
-          <w:szCs w:val="16"/>
-          <w:shd w:val="clear" w:color="auto" w:fill="FFFFFF"/>
-        </w:rPr>
-        <w:t xml:space="preserve">: </w:t>
-      </w:r>
-      <w:r>
-        <w:rPr>
-          <w:color w:val="0D0D0D"/>
-          <w:sz w:val="16"/>
-          <w:szCs w:val="16"/>
-          <w:shd w:val="clear" w:color="auto" w:fill="FFFFFF"/>
-        </w:rPr>
-        <w:t>C</w:t>
-      </w:r>
-      <w:r>
-        <w:rPr>
-          <w:color w:val="0D0D0D"/>
-          <w:sz w:val="16"/>
-          <w:szCs w:val="16"/>
-          <w:shd w:val="clear" w:color="auto" w:fill="FFFFFF"/>
-        </w:rPr>
-        <w:t xml:space="preserve">omparison between initialization time (InitParallel_Time) and computation time (ComputeParallel_Time) </w:t>
-      </w:r>
-      <w:r>
-        <w:rPr>
-          <w:color w:val="0D0D0D"/>
-          <w:sz w:val="16"/>
-          <w:szCs w:val="16"/>
-          <w:shd w:val="clear" w:color="auto" w:fill="FFFFFF"/>
-        </w:rPr>
-        <w:t>for CPU core</w:t>
-      </w:r>
-      <w:r>
-        <w:rPr>
-          <w:color w:val="0D0D0D"/>
-          <w:sz w:val="16"/>
-          <w:szCs w:val="16"/>
-          <w:shd w:val="clear" w:color="auto" w:fill="FFFFFF"/>
-        </w:rPr>
-        <w:t xml:space="preserve"> 8 &amp;10 </w:t>
-      </w:r>
-      <w:r>
-        <w:rPr>
-          <w:color w:val="0D0D0D"/>
-          <w:sz w:val="16"/>
-          <w:szCs w:val="16"/>
-          <w:shd w:val="clear" w:color="auto" w:fill="FFFFFF"/>
-        </w:rPr>
-        <w:t>configurations across multiple PCs</w:t>
-      </w:r>
-      <w:r>
-        <w:rPr>
-          <w:color w:val="0D0D0D"/>
-          <w:sz w:val="16"/>
-          <w:szCs w:val="16"/>
-          <w:shd w:val="clear" w:color="auto" w:fill="FFFFFF"/>
-        </w:rPr>
-        <w:t>.</w:t>
-      </w:r>
-    </w:p>
-    <w:p/>
-    <w:p/>
-    <w:p>
-      <w:r>
-        <w:rPr>
-          <w:noProof/>
-        </w:rPr>
-        <w:drawing>
-          <wp:inline distT="0" distB="0" distL="0" distR="0" wp14:anchorId="34371C27" wp14:editId="199DA628">
-            <wp:extent cx="3147695" cy="1966364"/>
-            <wp:effectExtent l="0" t="0" r="0" b="0"/>
-            <wp:docPr id="2104649091" name="Picture 6" descr="A graph with a line and a line&#10;&#10;AI-generated content may be incorrect."/>
-            <wp:cNvGraphicFramePr>
-              <a:graphicFrameLocks xmlns:a="http://schemas.openxmlformats.org/drawingml/2006/main" noChangeAspect="1"/>
-            </wp:cNvGraphicFramePr>
-            <a:graphic xmlns:a="http://schemas.openxmlformats.org/drawingml/2006/main">
-              <a:graphicData uri="http://schemas.openxmlformats.org/drawingml/2006/picture">
-                <pic:pic xmlns:pic="http://schemas.openxmlformats.org/drawingml/2006/picture">
-                  <pic:nvPicPr>
-                    <pic:cNvPr id="2104649091" name="Picture 6" descr="A graph with a line and a line&#10;&#10;AI-generated content may be incorrect."/>
                     <pic:cNvPicPr>
                       <a:picLocks noChangeAspect="1" noChangeArrowheads="1"/>
                     </pic:cNvPicPr>
@@ -8158,7 +9283,7 @@
                   <pic:spPr bwMode="auto">
                     <a:xfrm>
                       <a:off x="0" y="0"/>
-                      <a:ext cx="3159647" cy="1973831"/>
+                      <a:ext cx="3332529" cy="2168657"/>
                     </a:xfrm>
                     <a:prstGeom prst="rect">
                       <a:avLst/>
@@ -8183,6 +9308,12 @@
     <w:p>
       <w:pPr>
         <w:jc w:val="center"/>
+        <w:rPr>
+          <w:color w:val="0D0D0D"/>
+          <w:sz w:val="16"/>
+          <w:szCs w:val="16"/>
+          <w:shd w:val="clear" w:color="auto" w:fill="FFFFFF"/>
+        </w:rPr>
       </w:pPr>
       <w:r>
         <w:rPr>
@@ -8204,7 +9335,7 @@
           <w:szCs w:val="16"/>
           <w:shd w:val="clear" w:color="auto" w:fill="FFFFFF"/>
         </w:rPr>
-        <w:t>9</w:t>
+        <w:t>8</w:t>
       </w:r>
       <w:r>
         <w:rPr>
@@ -8231,8 +9362,9 @@
           <w:szCs w:val="16"/>
           <w:shd w:val="clear" w:color="auto" w:fill="FFFFFF"/>
         </w:rPr>
-        <w:t xml:space="preserve">omparison between initialization time (InitParallel_Time) and computation time (ComputeParallel_Time) </w:t>
-      </w:r>
+        <w:t>omparison between initialization time (</w:t>
+      </w:r>
+      <w:proofErr w:type="spellStart"/>
       <w:r>
         <w:rPr>
           <w:color w:val="0D0D0D"/>
@@ -8240,8 +9372,9 @@
           <w:szCs w:val="16"/>
           <w:shd w:val="clear" w:color="auto" w:fill="FFFFFF"/>
         </w:rPr>
-        <w:t xml:space="preserve">for CPU </w:t>
-      </w:r>
+        <w:t>InitParallel_Time</w:t>
+      </w:r>
+      <w:proofErr w:type="spellEnd"/>
       <w:r>
         <w:rPr>
           <w:color w:val="0D0D0D"/>
@@ -8249,8 +9382,9 @@
           <w:szCs w:val="16"/>
           <w:shd w:val="clear" w:color="auto" w:fill="FFFFFF"/>
         </w:rPr>
-        <w:t xml:space="preserve">16 </w:t>
-      </w:r>
+        <w:t>) and computation time (</w:t>
+      </w:r>
+      <w:proofErr w:type="spellStart"/>
       <w:r>
         <w:rPr>
           <w:color w:val="0D0D0D"/>
@@ -8258,8 +9392,9 @@
           <w:szCs w:val="16"/>
           <w:shd w:val="clear" w:color="auto" w:fill="FFFFFF"/>
         </w:rPr>
-        <w:t>core</w:t>
-      </w:r>
+        <w:t>ComputeParallel_Time</w:t>
+      </w:r>
+      <w:proofErr w:type="spellEnd"/>
       <w:r>
         <w:rPr>
           <w:color w:val="0D0D0D"/>
@@ -8267,7 +9402,7 @@
           <w:szCs w:val="16"/>
           <w:shd w:val="clear" w:color="auto" w:fill="FFFFFF"/>
         </w:rPr>
-        <w:t xml:space="preserve">  </w:t>
+        <w:t xml:space="preserve">) </w:t>
       </w:r>
       <w:r>
         <w:rPr>
@@ -8276,7 +9411,7 @@
           <w:szCs w:val="16"/>
           <w:shd w:val="clear" w:color="auto" w:fill="FFFFFF"/>
         </w:rPr>
-        <w:t>configurations across multiple PCs</w:t>
+        <w:t>for CPU core</w:t>
       </w:r>
       <w:r>
         <w:rPr>
@@ -8285,7 +9420,7 @@
           <w:szCs w:val="16"/>
           <w:shd w:val="clear" w:color="auto" w:fill="FFFFFF"/>
         </w:rPr>
-        <w:t xml:space="preserve"> </w:t>
+        <w:t xml:space="preserve"> 8 &amp;10 </w:t>
       </w:r>
       <w:r>
         <w:rPr>
@@ -8294,8 +9429,258 @@
           <w:szCs w:val="16"/>
           <w:shd w:val="clear" w:color="auto" w:fill="FFFFFF"/>
         </w:rPr>
+        <w:t>configurations across multiple PCs</w:t>
+      </w:r>
+      <w:r>
+        <w:rPr>
+          <w:color w:val="0D0D0D"/>
+          <w:sz w:val="16"/>
+          <w:szCs w:val="16"/>
+          <w:shd w:val="clear" w:color="auto" w:fill="FFFFFF"/>
+        </w:rPr>
         <w:t>.</w:t>
       </w:r>
+    </w:p>
+    <w:p/>
+    <w:p/>
+    <w:p>
+      <w:r>
+        <w:rPr>
+          <w:noProof/>
+        </w:rPr>
+        <w:drawing>
+          <wp:inline distT="0" distB="0" distL="0" distR="0" wp14:anchorId="34371C27" wp14:editId="00021926">
+            <wp:extent cx="3147047" cy="1882140"/>
+            <wp:effectExtent l="0" t="0" r="0" b="3810"/>
+            <wp:docPr id="2104649091" name="Picture 6" descr="A graph with a line and a line&#10;&#10;AI-generated content may be incorrect."/>
+            <wp:cNvGraphicFramePr>
+              <a:graphicFrameLocks xmlns:a="http://schemas.openxmlformats.org/drawingml/2006/main" noChangeAspect="1"/>
+            </wp:cNvGraphicFramePr>
+            <a:graphic xmlns:a="http://schemas.openxmlformats.org/drawingml/2006/main">
+              <a:graphicData uri="http://schemas.openxmlformats.org/drawingml/2006/picture">
+                <pic:pic xmlns:pic="http://schemas.openxmlformats.org/drawingml/2006/picture">
+                  <pic:nvPicPr>
+                    <pic:cNvPr id="2104649091" name="Picture 6" descr="A graph with a line and a line&#10;&#10;AI-generated content may be incorrect."/>
+                    <pic:cNvPicPr>
+                      <a:picLocks noChangeAspect="1" noChangeArrowheads="1"/>
+                    </pic:cNvPicPr>
+                  </pic:nvPicPr>
+                  <pic:blipFill>
+                    <a:blip r:embed="rId32" cstate="print">
+                      <a:extLst>
+                        <a:ext uri="{28A0092B-C50C-407E-A947-70E740481C1C}">
+                          <a14:useLocalDpi xmlns:a14="http://schemas.microsoft.com/office/drawing/2010/main" val="0"/>
+                        </a:ext>
+                      </a:extLst>
+                    </a:blip>
+                    <a:srcRect/>
+                    <a:stretch>
+                      <a:fillRect/>
+                    </a:stretch>
+                  </pic:blipFill>
+                  <pic:spPr bwMode="auto">
+                    <a:xfrm>
+                      <a:off x="0" y="0"/>
+                      <a:ext cx="3167151" cy="1894163"/>
+                    </a:xfrm>
+                    <a:prstGeom prst="rect">
+                      <a:avLst/>
+                    </a:prstGeom>
+                    <a:noFill/>
+                    <a:ln>
+                      <a:noFill/>
+                    </a:ln>
+                  </pic:spPr>
+                </pic:pic>
+              </a:graphicData>
+            </a:graphic>
+          </wp:inline>
+        </w:drawing>
+      </w:r>
+    </w:p>
+    <w:p>
+      <w:pPr>
+        <w:jc w:val="center"/>
+      </w:pPr>
+    </w:p>
+    <w:p>
+      <w:pPr>
+        <w:jc w:val="center"/>
+      </w:pPr>
+      <w:r>
+        <w:rPr>
+          <w:b/>
+          <w:bCs/>
+          <w:color w:val="0D0D0D"/>
+          <w:sz w:val="16"/>
+          <w:szCs w:val="16"/>
+          <w:shd w:val="clear" w:color="auto" w:fill="FFFFFF"/>
+        </w:rPr>
+        <w:t xml:space="preserve">Figure </w:t>
+      </w:r>
+      <w:r>
+        <w:rPr>
+          <w:b/>
+          <w:bCs/>
+          <w:color w:val="0D0D0D"/>
+          <w:sz w:val="16"/>
+          <w:szCs w:val="16"/>
+          <w:shd w:val="clear" w:color="auto" w:fill="FFFFFF"/>
+        </w:rPr>
+        <w:t>9</w:t>
+      </w:r>
+      <w:r>
+        <w:rPr>
+          <w:color w:val="0D0D0D"/>
+          <w:sz w:val="16"/>
+          <w:szCs w:val="16"/>
+          <w:shd w:val="clear" w:color="auto" w:fill="FFFFFF"/>
+        </w:rPr>
+        <w:t xml:space="preserve">: </w:t>
+      </w:r>
+      <w:r>
+        <w:rPr>
+          <w:color w:val="0D0D0D"/>
+          <w:sz w:val="16"/>
+          <w:szCs w:val="16"/>
+          <w:shd w:val="clear" w:color="auto" w:fill="FFFFFF"/>
+        </w:rPr>
+        <w:t>C</w:t>
+      </w:r>
+      <w:r>
+        <w:rPr>
+          <w:color w:val="0D0D0D"/>
+          <w:sz w:val="16"/>
+          <w:szCs w:val="16"/>
+          <w:shd w:val="clear" w:color="auto" w:fill="FFFFFF"/>
+        </w:rPr>
+        <w:t>omparison between initialization time (</w:t>
+      </w:r>
+      <w:proofErr w:type="spellStart"/>
+      <w:r>
+        <w:rPr>
+          <w:color w:val="0D0D0D"/>
+          <w:sz w:val="16"/>
+          <w:szCs w:val="16"/>
+          <w:shd w:val="clear" w:color="auto" w:fill="FFFFFF"/>
+        </w:rPr>
+        <w:t>InitParallel_Time</w:t>
+      </w:r>
+      <w:proofErr w:type="spellEnd"/>
+      <w:r>
+        <w:rPr>
+          <w:color w:val="0D0D0D"/>
+          <w:sz w:val="16"/>
+          <w:szCs w:val="16"/>
+          <w:shd w:val="clear" w:color="auto" w:fill="FFFFFF"/>
+        </w:rPr>
+        <w:t>) and computation time (</w:t>
+      </w:r>
+      <w:proofErr w:type="spellStart"/>
+      <w:r>
+        <w:rPr>
+          <w:color w:val="0D0D0D"/>
+          <w:sz w:val="16"/>
+          <w:szCs w:val="16"/>
+          <w:shd w:val="clear" w:color="auto" w:fill="FFFFFF"/>
+        </w:rPr>
+        <w:t>ComputeParallel_Time</w:t>
+      </w:r>
+      <w:proofErr w:type="spellEnd"/>
+      <w:r>
+        <w:rPr>
+          <w:color w:val="0D0D0D"/>
+          <w:sz w:val="16"/>
+          <w:szCs w:val="16"/>
+          <w:shd w:val="clear" w:color="auto" w:fill="FFFFFF"/>
+        </w:rPr>
+        <w:t xml:space="preserve">) </w:t>
+      </w:r>
+      <w:r>
+        <w:rPr>
+          <w:color w:val="0D0D0D"/>
+          <w:sz w:val="16"/>
+          <w:szCs w:val="16"/>
+          <w:shd w:val="clear" w:color="auto" w:fill="FFFFFF"/>
+        </w:rPr>
+        <w:t xml:space="preserve">for CPU </w:t>
+      </w:r>
+      <w:r>
+        <w:rPr>
+          <w:color w:val="0D0D0D"/>
+          <w:sz w:val="16"/>
+          <w:szCs w:val="16"/>
+          <w:shd w:val="clear" w:color="auto" w:fill="FFFFFF"/>
+        </w:rPr>
+        <w:t xml:space="preserve">16 </w:t>
+      </w:r>
+      <w:proofErr w:type="gramStart"/>
+      <w:r>
+        <w:rPr>
+          <w:color w:val="0D0D0D"/>
+          <w:sz w:val="16"/>
+          <w:szCs w:val="16"/>
+          <w:shd w:val="clear" w:color="auto" w:fill="FFFFFF"/>
+        </w:rPr>
+        <w:t>core</w:t>
+      </w:r>
+      <w:r>
+        <w:rPr>
+          <w:color w:val="0D0D0D"/>
+          <w:sz w:val="16"/>
+          <w:szCs w:val="16"/>
+          <w:shd w:val="clear" w:color="auto" w:fill="FFFFFF"/>
+        </w:rPr>
+        <w:t xml:space="preserve">  </w:t>
+      </w:r>
+      <w:r>
+        <w:rPr>
+          <w:color w:val="0D0D0D"/>
+          <w:sz w:val="16"/>
+          <w:szCs w:val="16"/>
+          <w:shd w:val="clear" w:color="auto" w:fill="FFFFFF"/>
+        </w:rPr>
+        <w:t>configurations</w:t>
+      </w:r>
+      <w:proofErr w:type="gramEnd"/>
+      <w:r>
+        <w:rPr>
+          <w:color w:val="0D0D0D"/>
+          <w:sz w:val="16"/>
+          <w:szCs w:val="16"/>
+          <w:shd w:val="clear" w:color="auto" w:fill="FFFFFF"/>
+        </w:rPr>
+        <w:t xml:space="preserve"> across multiple </w:t>
+      </w:r>
+      <w:proofErr w:type="gramStart"/>
+      <w:r>
+        <w:rPr>
+          <w:color w:val="0D0D0D"/>
+          <w:sz w:val="16"/>
+          <w:szCs w:val="16"/>
+          <w:shd w:val="clear" w:color="auto" w:fill="FFFFFF"/>
+        </w:rPr>
+        <w:t>PCs</w:t>
+      </w:r>
+      <w:r>
+        <w:rPr>
+          <w:color w:val="0D0D0D"/>
+          <w:sz w:val="16"/>
+          <w:szCs w:val="16"/>
+          <w:shd w:val="clear" w:color="auto" w:fill="FFFFFF"/>
+        </w:rPr>
+        <w:t xml:space="preserve"> </w:t>
+      </w:r>
+      <w:r>
+        <w:rPr>
+          <w:color w:val="0D0D0D"/>
+          <w:sz w:val="16"/>
+          <w:szCs w:val="16"/>
+          <w:shd w:val="clear" w:color="auto" w:fill="FFFFFF"/>
+        </w:rPr>
+        <w:t>.</w:t>
+      </w:r>
+      <w:proofErr w:type="gramEnd"/>
     </w:p>
     <w:p/>
     <w:p>
@@ -8319,9 +9704,11 @@
         </w:rPr>
         <w:t xml:space="preserve"> (</w:t>
       </w:r>
+      <w:proofErr w:type="spellStart"/>
       <w:r>
         <w:t>InitParallel</w:t>
       </w:r>
+      <w:proofErr w:type="spellEnd"/>
       <w:r>
         <w:rPr>
           <w:sz w:val="22"/>
@@ -8343,7 +9730,15 @@
     </w:p>
     <w:p>
       <w:r>
-        <w:t>This graph compares the performance of both the new multi-threaded method (InitParallel) and the old single-threaded method (Init) across various CPU configurations (4, 6, 8, 10, and All cores) on different PCs. The goal is to evaluate how the number of cores affects the execution time of both methods</w:t>
+        <w:t>This graph compares the performance of both the new multi-threaded method (</w:t>
+      </w:r>
+      <w:proofErr w:type="spellStart"/>
+      <w:r>
+        <w:t>InitParallel</w:t>
+      </w:r>
+      <w:proofErr w:type="spellEnd"/>
+      <w:r>
+        <w:t>) and the old single-threaded method (Init) across various CPU configurations (4, 6, 8, 10, and All cores) on different PCs. The goal is to evaluate how the number of cores affects the execution time of both methods</w:t>
       </w:r>
       <w:r>
         <w:t xml:space="preserve"> [Figure 10</w:t>
@@ -8388,7 +9783,7 @@
                     </pic:cNvPicPr>
                   </pic:nvPicPr>
                   <pic:blipFill>
-                    <a:blip r:embed="rId32" cstate="print">
+                    <a:blip r:embed="rId33" cstate="print">
                       <a:extLst>
                         <a:ext uri="{28A0092B-C50C-407E-A947-70E740481C1C}">
                           <a14:useLocalDpi xmlns:a14="http://schemas.microsoft.com/office/drawing/2010/main" val="0"/>
@@ -8493,7 +9888,23 @@
           <w:sz w:val="16"/>
           <w:szCs w:val="16"/>
         </w:rPr>
-        <w:t xml:space="preserve">of both the new multi-threaded method (InitParallel) and the old single-threaded method (Init) across </w:t>
+        <w:t>of both the new multi-threaded method (</w:t>
+      </w:r>
+      <w:proofErr w:type="spellStart"/>
+      <w:r>
+        <w:rPr>
+          <w:sz w:val="16"/>
+          <w:szCs w:val="16"/>
+        </w:rPr>
+        <w:t>InitParallel</w:t>
+      </w:r>
+      <w:proofErr w:type="spellEnd"/>
+      <w:r>
+        <w:rPr>
+          <w:sz w:val="16"/>
+          <w:szCs w:val="16"/>
+        </w:rPr>
+        <w:t xml:space="preserve">) and the old single-threaded method (Init) across </w:t>
       </w:r>
       <w:r>
         <w:rPr>
@@ -8548,7 +9959,7 @@
                     </pic:cNvPicPr>
                   </pic:nvPicPr>
                   <pic:blipFill>
-                    <a:blip r:embed="rId33" cstate="print">
+                    <a:blip r:embed="rId34" cstate="print">
                       <a:extLst>
                         <a:ext uri="{28A0092B-C50C-407E-A947-70E740481C1C}">
                           <a14:useLocalDpi xmlns:a14="http://schemas.microsoft.com/office/drawing/2010/main" val="0"/>
@@ -8661,7 +10072,23 @@
           <w:sz w:val="16"/>
           <w:szCs w:val="16"/>
         </w:rPr>
-        <w:t xml:space="preserve">of both the new multi-threaded method (InitParallel) and the old single-threaded method (Init) across </w:t>
+        <w:t>of both the new multi-threaded method (</w:t>
+      </w:r>
+      <w:proofErr w:type="spellStart"/>
+      <w:r>
+        <w:rPr>
+          <w:sz w:val="16"/>
+          <w:szCs w:val="16"/>
+        </w:rPr>
+        <w:t>InitParallel</w:t>
+      </w:r>
+      <w:proofErr w:type="spellEnd"/>
+      <w:r>
+        <w:rPr>
+          <w:sz w:val="16"/>
+          <w:szCs w:val="16"/>
+        </w:rPr>
+        <w:t xml:space="preserve">) and the old single-threaded method (Init) across </w:t>
       </w:r>
       <w:r>
         <w:rPr>
@@ -8695,7 +10122,7 @@
                     </pic:cNvPicPr>
                   </pic:nvPicPr>
                   <pic:blipFill>
-                    <a:blip r:embed="rId34" cstate="print">
+                    <a:blip r:embed="rId35" cstate="print">
                       <a:extLst>
                         <a:ext uri="{28A0092B-C50C-407E-A947-70E740481C1C}">
                           <a14:useLocalDpi xmlns:a14="http://schemas.microsoft.com/office/drawing/2010/main" val="0"/>
@@ -8811,23 +10238,39 @@
           <w:sz w:val="16"/>
           <w:szCs w:val="16"/>
         </w:rPr>
-        <w:t xml:space="preserve">of both the new multi-threaded method (InitParallel) and the old single-threaded method (Init) across </w:t>
-      </w:r>
+        <w:t>of both the new multi-threaded method (</w:t>
+      </w:r>
+      <w:proofErr w:type="spellStart"/>
       <w:r>
         <w:rPr>
           <w:sz w:val="16"/>
           <w:szCs w:val="16"/>
         </w:rPr>
-        <w:t>16 CPU Cores.</w:t>
-      </w:r>
-    </w:p>
-    <w:p>
-      <w:pPr>
-        <w:jc w:val="center"/>
+        <w:t>InitParallel</w:t>
+      </w:r>
+      <w:proofErr w:type="spellEnd"/>
+      <w:r>
         <w:rPr>
           <w:sz w:val="16"/>
           <w:szCs w:val="16"/>
         </w:rPr>
+        <w:t xml:space="preserve">) and the old single-threaded method (Init) across </w:t>
+      </w:r>
+      <w:r>
+        <w:rPr>
+          <w:sz w:val="16"/>
+          <w:szCs w:val="16"/>
+        </w:rPr>
+        <w:t>16 CPU Cores.</w:t>
+      </w:r>
+    </w:p>
+    <w:p>
+      <w:pPr>
+        <w:jc w:val="center"/>
+        <w:rPr>
+          <w:sz w:val="16"/>
+          <w:szCs w:val="16"/>
+        </w:rPr>
       </w:pPr>
     </w:p>
     <w:p>
@@ -8862,7 +10305,39 @@
           <w:color w:val="0D0D0D"/>
           <w:shd w:val="clear" w:color="auto" w:fill="FFFFFF"/>
         </w:rPr>
-        <w:t>The successful parallelization of the Temporal Memory algorithm marks a significant step forward in enhancing the efficiency and scalability of Hierarchical Temporal Memory (HTM) systems. By transitioning from a single-threaded to a multithreaded architecture, we have demonstrated substantial improvements in computational performance while preserving the algorithm’s core functionality and accuracy. Our implementation leveraged modern parallel programming techniques, including Parallel.ForEach and thread-safe data structures like ConcurrentDictionary, to distribute workloads efficiently across multiple CPU cores.</w:t>
+        <w:t>The successful parallelization of the Temporal Memory algorithm marks a significant step forward in enhancing the efficiency and scalability of Hierarchical Temporal Memory (HTM) systems. By transitioning from a single-threaded to a multithreaded architecture, we have demonstrated substantial improvements in computational performance while preserving the algorithm’s core functionality and accuracy. Our implementation leveraged modern parallel programming techniques, including </w:t>
+      </w:r>
+      <w:proofErr w:type="spellStart"/>
+      <w:r>
+        <w:rPr>
+          <w:color w:val="0D0D0D"/>
+          <w:shd w:val="clear" w:color="auto" w:fill="FFFFFF"/>
+        </w:rPr>
+        <w:t>Parallel.ForEach</w:t>
+      </w:r>
+      <w:proofErr w:type="spellEnd"/>
+      <w:r>
+        <w:rPr>
+          <w:color w:val="0D0D0D"/>
+          <w:shd w:val="clear" w:color="auto" w:fill="FFFFFF"/>
+        </w:rPr>
+        <w:t> and thread-safe data structures like </w:t>
+      </w:r>
+      <w:proofErr w:type="spellStart"/>
+      <w:r>
+        <w:rPr>
+          <w:color w:val="0D0D0D"/>
+          <w:shd w:val="clear" w:color="auto" w:fill="FFFFFF"/>
+        </w:rPr>
+        <w:t>ConcurrentDictionary</w:t>
+      </w:r>
+      <w:proofErr w:type="spellEnd"/>
+      <w:r>
+        <w:rPr>
+          <w:color w:val="0D0D0D"/>
+          <w:shd w:val="clear" w:color="auto" w:fill="FFFFFF"/>
+        </w:rPr>
+        <w:t>, to distribute workloads efficiently across multiple CPU cores.</w:t>
       </w:r>
     </w:p>
     <w:p>
@@ -8895,6 +10370,8 @@
         </w:rPr>
         <w:t>Key findings from our experiments highlight that the </w:t>
       </w:r>
+      <w:proofErr w:type="spellStart"/>
+      <w:proofErr w:type="gramStart"/>
       <w:r>
         <w:rPr>
           <w:b/>
@@ -8902,7 +10379,27 @@
           <w:color w:val="0D0D0D"/>
           <w:shd w:val="clear" w:color="auto" w:fill="FFFFFF"/>
         </w:rPr>
-        <w:t>InitParallelWithConcurrentDictionary()</w:t>
+        <w:t>InitParallelWithConcurrentDictionary</w:t>
+      </w:r>
+      <w:proofErr w:type="spellEnd"/>
+      <w:r>
+        <w:rPr>
+          <w:b/>
+          <w:bCs/>
+          <w:color w:val="0D0D0D"/>
+          <w:shd w:val="clear" w:color="auto" w:fill="FFFFFF"/>
+        </w:rPr>
+        <w:t>(</w:t>
+      </w:r>
+      <w:proofErr w:type="gramEnd"/>
+      <w:r>
+        <w:rPr>
+          <w:b/>
+          <w:bCs/>
+          <w:color w:val="0D0D0D"/>
+          <w:shd w:val="clear" w:color="auto" w:fill="FFFFFF"/>
+        </w:rPr>
+        <w:t>)</w:t>
       </w:r>
       <w:r>
         <w:rPr>
@@ -11842,8 +13339,8 @@
       </w:pPr>
     </w:p>
     <w:sectPr>
-      <w:headerReference w:type="default" r:id="rId35"/>
-      <w:footerReference w:type="default" r:id="rId36"/>
+      <w:headerReference w:type="default" r:id="rId36"/>
+      <w:footerReference w:type="default" r:id="rId37"/>
       <w:type w:val="continuous"/>
       <w:pgSz w:w="11906" w:h="16838" w:code="9"/>
       <w:pgMar w:top="1080" w:right="907" w:bottom="1440" w:left="907" w:header="720" w:footer="720" w:gutter="0"/>
@@ -16656,7 +18153,6 @@
   <w:style w:type="character" w:default="1" w:styleId="DefaultParagraphFont">
     <w:name w:val="Default Paragraph Font"/>
     <w:uiPriority w:val="1"/>
-    <w:semiHidden/>
     <w:unhideWhenUsed/>
   </w:style>
   <w:style w:type="table" w:default="1" w:styleId="TableNormal">
@@ -17533,6 +19029,15 @@
 </file>
 
 <file path=customXml/item1.xml><?xml version="1.0" encoding="utf-8"?>
+<?mso-contentType ?>
+<FormTemplates xmlns="http://schemas.microsoft.com/sharepoint/v3/contenttype/forms">
+  <Display>DocumentLibraryForm</Display>
+  <Edit>DocumentLibraryForm</Edit>
+  <New>DocumentLibraryForm</New>
+</FormTemplates>
+</file>
+
+<file path=customXml/item2.xml><?xml version="1.0" encoding="utf-8"?>
 <b:Sources xmlns:b="http://schemas.openxmlformats.org/officeDocument/2006/bibliography" xmlns="http://schemas.openxmlformats.org/officeDocument/2006/bibliography" SelectedStyle="\IEEE2006OfficeOnline.xsl" StyleName="IEEE" Version="2006">
   <b:Source>
     <b:Tag>Dam21</b:Tag>
@@ -18092,16 +19597,13 @@
 </b:Sources>
 </file>
 
-<file path=customXml/item2.xml><?xml version="1.0" encoding="utf-8"?>
-<?mso-contentType ?>
-<FormTemplates xmlns="http://schemas.microsoft.com/sharepoint/v3/contenttype/forms">
-  <Display>DocumentLibraryForm</Display>
-  <Edit>DocumentLibraryForm</Edit>
-  <New>DocumentLibraryForm</New>
-</FormTemplates>
+<file path=customXml/item3.xml><?xml version="1.0" encoding="utf-8"?>
+<p:properties xmlns:p="http://schemas.microsoft.com/office/2006/metadata/properties" xmlns:xsi="http://www.w3.org/2001/XMLSchema-instance" xmlns:pc="http://schemas.microsoft.com/office/infopath/2007/PartnerControls">
+  <documentManagement/>
+</p:properties>
 </file>
 
-<file path=customXml/item3.xml><?xml version="1.0" encoding="utf-8"?>
+<file path=customXml/item4.xml><?xml version="1.0" encoding="utf-8"?>
 <ct:contentTypeSchema xmlns:ct="http://schemas.microsoft.com/office/2006/metadata/contentType" xmlns:ma="http://schemas.microsoft.com/office/2006/metadata/properties/metaAttributes" ct:_="" ma:_="" ma:contentTypeName="Document" ma:contentTypeID="0x010100244DA4597C2DA943933A249CF35A3C17" ma:contentTypeVersion="5" ma:contentTypeDescription="Create a new document." ma:contentTypeScope="" ma:versionID="79cd3048bded257ca59f28facd802837">
   <xsd:schema xmlns:xsd="http://www.w3.org/2001/XMLSchema" xmlns:xs="http://www.w3.org/2001/XMLSchema" xmlns:p="http://schemas.microsoft.com/office/2006/metadata/properties" xmlns:ns3="936daadb-6db6-4468-bf48-4ae045496840" targetNamespace="http://schemas.microsoft.com/office/2006/metadata/properties" ma:root="true" ma:fieldsID="e924f1278865bce780dcb264ecb06437" ns3:_="">
     <xsd:import namespace="936daadb-6db6-4468-bf48-4ae045496840"/>
@@ -18251,13 +19753,15 @@
 </ct:contentTypeSchema>
 </file>
 
-<file path=customXml/item4.xml><?xml version="1.0" encoding="utf-8"?>
-<p:properties xmlns:p="http://schemas.microsoft.com/office/2006/metadata/properties" xmlns:xsi="http://www.w3.org/2001/XMLSchema-instance" xmlns:pc="http://schemas.microsoft.com/office/infopath/2007/PartnerControls">
-  <documentManagement/>
-</p:properties>
+<file path=customXml/itemProps1.xml><?xml version="1.0" encoding="utf-8"?>
+<ds:datastoreItem xmlns:ds="http://schemas.openxmlformats.org/officeDocument/2006/customXml" ds:itemID="{88F3F4E0-067B-40FB-A48B-6269F4A0D664}">
+  <ds:schemaRefs>
+    <ds:schemaRef ds:uri="http://schemas.microsoft.com/sharepoint/v3/contenttype/forms"/>
+  </ds:schemaRefs>
+</ds:datastoreItem>
 </file>
 
-<file path=customXml/itemProps1.xml><?xml version="1.0" encoding="utf-8"?>
+<file path=customXml/itemProps2.xml><?xml version="1.0" encoding="utf-8"?>
 <ds:datastoreItem xmlns:ds="http://schemas.openxmlformats.org/officeDocument/2006/customXml" ds:itemID="{9E93547A-5D10-4E37-8A3C-6D2A2F7F390C}">
   <ds:schemaRefs>
     <ds:schemaRef ds:uri="http://schemas.openxmlformats.org/officeDocument/2006/bibliography"/>
@@ -18265,15 +19769,16 @@
 </ds:datastoreItem>
 </file>
 
-<file path=customXml/itemProps2.xml><?xml version="1.0" encoding="utf-8"?>
-<ds:datastoreItem xmlns:ds="http://schemas.openxmlformats.org/officeDocument/2006/customXml" ds:itemID="{88F3F4E0-067B-40FB-A48B-6269F4A0D664}">
+<file path=customXml/itemProps3.xml><?xml version="1.0" encoding="utf-8"?>
+<ds:datastoreItem xmlns:ds="http://schemas.openxmlformats.org/officeDocument/2006/customXml" ds:itemID="{AF927845-869C-4CF7-85EE-10A8386E5F92}">
   <ds:schemaRefs>
-    <ds:schemaRef ds:uri="http://schemas.microsoft.com/sharepoint/v3/contenttype/forms"/>
+    <ds:schemaRef ds:uri="http://schemas.microsoft.com/office/2006/metadata/properties"/>
+    <ds:schemaRef ds:uri="http://schemas.microsoft.com/office/infopath/2007/PartnerControls"/>
   </ds:schemaRefs>
 </ds:datastoreItem>
 </file>
 
-<file path=customXml/itemProps3.xml><?xml version="1.0" encoding="utf-8"?>
+<file path=customXml/itemProps4.xml><?xml version="1.0" encoding="utf-8"?>
 <ds:datastoreItem xmlns:ds="http://schemas.openxmlformats.org/officeDocument/2006/customXml" ds:itemID="{82C9358B-E3D9-4C38-A803-67F51DB06356}">
   <ds:schemaRefs>
     <ds:schemaRef ds:uri="http://schemas.microsoft.com/office/2006/metadata/contentType"/>
@@ -18289,13 +19794,4 @@
     <ds:schemaRef ds:uri="http://schemas.microsoft.com/internal/obd"/>
   </ds:schemaRefs>
 </ds:datastoreItem>
-</file>
-
-<file path=customXml/itemProps4.xml><?xml version="1.0" encoding="utf-8"?>
-<ds:datastoreItem xmlns:ds="http://schemas.openxmlformats.org/officeDocument/2006/customXml" ds:itemID="{AF927845-869C-4CF7-85EE-10A8386E5F92}">
-  <ds:schemaRefs>
-    <ds:schemaRef ds:uri="http://schemas.microsoft.com/office/2006/metadata/properties"/>
-    <ds:schemaRef ds:uri="http://schemas.microsoft.com/office/infopath/2007/PartnerControls"/>
-  </ds:schemaRefs>
-</ds:datastoreItem>
 </file>
</xml_diff>

<commit_message>
feedback changes in documentation
</commit_message>
<xml_diff>
--- a/source/MySEProject/Documentation/ML 2425-06 Implement_Temporal_Memory_Parallel_Version_Alabaster_Neo.docx
+++ b/source/MySEProject/Documentation/ML 2425-06 Implement_Temporal_Memory_Parallel_Version_Alabaster_Neo.docx
@@ -161,7 +161,6 @@
         <w:rPr>
           <w:sz w:val="18"/>
           <w:szCs w:val="18"/>
-          <w:lang w:val="en-IN"/>
         </w:rPr>
         <w:br w:type="column"/>
       </w:r>
@@ -418,8 +417,9 @@
           <w:sz w:val="18"/>
           <w:szCs w:val="18"/>
         </w:rPr>
-        <w:t>I</w:t>
-      </w:r>
+        <w:t xml:space="preserve">Imagine if computers could learn patterns and predict sequences as effortlessly as the human brain. Our software engineering implementation delivers this capability through optimized parallel processing. That's the promise of Hierarchical Temporal Memory (HTM) - a brain-inspired AI system. But there's a catch: traditional HTM implementations are stuck in the slow lane, processing everything one step at a time. We changed that. In this work, we present a parallelized Temporal Memory algorithm that leverages </w:t>
+      </w:r>
+      <w:proofErr w:type="spellStart"/>
       <w:r>
         <w:rPr>
           <w:b/>
@@ -429,8 +429,9 @@
           <w:sz w:val="18"/>
           <w:szCs w:val="18"/>
         </w:rPr>
-        <w:t>magine if computers could learn patterns and predict sequences as effortlessly as the human brain. That's the promise of Hierarchical Temporal Memory (HTM) - a brain-inspired AI system. But there's a catch: traditional HTM implementations are stuck in the slow lane, processing everything one step at a time. We changed that.</w:t>
-      </w:r>
+        <w:t>ConcurrentDictionary</w:t>
+      </w:r>
+      <w:proofErr w:type="spellEnd"/>
       <w:r>
         <w:rPr>
           <w:b/>
@@ -440,8 +441,9 @@
           <w:sz w:val="18"/>
           <w:szCs w:val="18"/>
         </w:rPr>
-        <w:t xml:space="preserve"> </w:t>
-      </w:r>
+        <w:t xml:space="preserve"> for thread-safe operations and </w:t>
+      </w:r>
+      <w:proofErr w:type="spellStart"/>
       <w:r>
         <w:rPr>
           <w:b/>
@@ -451,8 +453,9 @@
           <w:sz w:val="18"/>
           <w:szCs w:val="18"/>
         </w:rPr>
-        <w:t>In this work, we present a parallel computing approach to HTM that significantly accelerates temporal sequence processing. Our optimized implementation demonstrates a 57% reduction in initialization time and up to 3× faster overall performance while maintaining algorithmic accuracy. Rigorous testing across multi-core processors (4-16 cores) validated the scalability of our approach, with the most efficient method showing remarkable consistency (variance = 7.56) under varying workloads.</w:t>
-      </w:r>
+        <w:t>Parallel.For</w:t>
+      </w:r>
+      <w:proofErr w:type="spellEnd"/>
       <w:r>
         <w:rPr>
           <w:b/>
@@ -462,9 +465,15 @@
           <w:sz w:val="18"/>
           <w:szCs w:val="18"/>
         </w:rPr>
-        <w:t xml:space="preserve"> </w:t>
-      </w:r>
-      <w:r>
+        <w:t xml:space="preserve"> for workload distribution, achieving a 57% reduction in initialization time and 3× faster processing on 16-core architectures while maintaining algorithmic accuracy (&lt;1% prediction variance). Rigorous multi-core testing (4-16 cores) demonstrated exceptional consistency (variance = 7.56), enabling practical real-time applications in critical domains like anomaly detection and predictive maintenance systems. These improvements address HTM's scalability challenges while preserving its biological fidelity.</w:t>
+      </w:r>
+    </w:p>
+    <w:p>
+      <w:pPr>
+        <w:tabs>
+          <w:tab w:val="left" w:pos="288"/>
+        </w:tabs>
+        <w:jc w:val="both"/>
         <w:rPr>
           <w:b/>
           <w:bCs/>
@@ -473,39 +482,6 @@
           <w:sz w:val="18"/>
           <w:szCs w:val="18"/>
         </w:rPr>
-        <w:t>These performance improvements enable practical real-time applications of HTM in critical domains such as anomaly detection and predictive maintenance systems. Our work bridges the gap between neuroscience-inspired algorithms and modern computing architectures, making brain-like temporal processing feasible for industrial-scale applications.</w:t>
-      </w:r>
-    </w:p>
-    <w:p>
-      <w:pPr>
-        <w:tabs>
-          <w:tab w:val="left" w:pos="288"/>
-        </w:tabs>
-        <w:jc w:val="both"/>
-        <w:rPr>
-          <w:b/>
-          <w:bCs/>
-          <w:i/>
-          <w:iCs/>
-          <w:sz w:val="18"/>
-          <w:szCs w:val="18"/>
-        </w:rPr>
-      </w:pPr>
-    </w:p>
-    <w:p>
-      <w:pPr>
-        <w:tabs>
-          <w:tab w:val="left" w:pos="288"/>
-        </w:tabs>
-        <w:jc w:val="both"/>
-        <w:rPr>
-          <w:b/>
-          <w:bCs/>
-          <w:i/>
-          <w:iCs/>
-          <w:sz w:val="18"/>
-          <w:szCs w:val="18"/>
-        </w:rPr>
       </w:pPr>
     </w:p>
     <w:p>
@@ -535,14 +511,14 @@
           <w:sz w:val="20"/>
           <w:szCs w:val="20"/>
         </w:rPr>
-        <w:t xml:space="preserve"> Hie</w:t>
+        <w:t xml:space="preserve"> </w:t>
       </w:r>
       <w:r>
         <w:rPr>
           <w:sz w:val="20"/>
           <w:szCs w:val="20"/>
         </w:rPr>
-        <w:t>rarchical Temporal Memory, Parallel Computing, Neural Networks, Performance Optimization, Real-Time Systems</w:t>
+        <w:t>Hierarchical Temporal Memory, Parallel Computing, Neural Networks, Performance Optimization, Real-Time Systems</w:t>
       </w:r>
     </w:p>
     <w:p>
@@ -717,14 +693,14 @@
           <w:sz w:val="20"/>
           <w:szCs w:val="20"/>
         </w:rPr>
-        <w:t xml:space="preserve">The Temporal Memory algorithm is a fundamental component of hierarchical temporal memory (HTM) systems, </w:t>
+        <w:t xml:space="preserve">The Temporal Memory algorithm is a fundamental component of hierarchical temporal memory (HTM) systems, which are designed to mimic the functionality of the human neocortex. This algorithm plays a crucial role in pattern recognition, sequence learning, and anomaly detection by </w:t>
       </w:r>
       <w:r>
         <w:rPr>
           <w:sz w:val="20"/>
           <w:szCs w:val="20"/>
         </w:rPr>
-        <w:t xml:space="preserve">which are designed to mimic the functionality of the human neocortex. This algorithm plays a crucial role in pattern recognition, sequence learning, and anomaly detection by processing and storing spatial and temporal patterns. </w:t>
+        <w:t xml:space="preserve">processing and storing spatial and temporal patterns. </w:t>
       </w:r>
       <w:r>
         <w:rPr>
@@ -995,61 +971,64 @@
         <w:jc w:val="center"/>
       </w:pPr>
       <w:r>
+        <w:t>literature review</w:t>
+      </w:r>
+    </w:p>
+    <w:p>
+      <w:pPr>
+        <w:tabs>
+          <w:tab w:val="left" w:pos="288"/>
+        </w:tabs>
+        <w:jc w:val="both"/>
+      </w:pPr>
+      <w:r>
+        <w:tab/>
+      </w:r>
+      <w:r>
+        <w:t>The aim of this section is to understand the functioning of HTM</w:t>
+      </w:r>
+      <w:r>
+        <w:t xml:space="preserve"> algorithms – Temporal memory and </w:t>
+      </w:r>
+      <w:r>
+        <w:t>S</w:t>
+      </w:r>
+      <w:r>
+        <w:t xml:space="preserve">patial </w:t>
+      </w:r>
+      <w:r>
+        <w:t>P</w:t>
+      </w:r>
+      <w:r>
+        <w:t>ooler</w:t>
+      </w:r>
+      <w:r>
+        <w:t xml:space="preserve"> </w:t>
+      </w:r>
+      <w:r>
+        <w:t xml:space="preserve">and </w:t>
+      </w:r>
+      <w:r>
+        <w:t>the process of generating SDRs</w:t>
+      </w:r>
+      <w:r>
+        <w:t xml:space="preserve"> </w:t>
+      </w:r>
+      <w:r>
+        <w:t>and parallelization</w:t>
+      </w:r>
+      <w:r>
+        <w:t>,</w:t>
+      </w:r>
+      <w:r>
+        <w:t xml:space="preserve"> </w:t>
+      </w:r>
+      <w:r>
+        <w:t xml:space="preserve">which </w:t>
+      </w:r>
+      <w:r>
         <w:lastRenderedPageBreak/>
-        <w:t>literature review</w:t>
-      </w:r>
-    </w:p>
-    <w:p>
-      <w:pPr>
-        <w:tabs>
-          <w:tab w:val="left" w:pos="288"/>
-        </w:tabs>
-        <w:jc w:val="both"/>
-      </w:pPr>
-      <w:r>
-        <w:tab/>
-      </w:r>
-      <w:r>
-        <w:t>The aim of this section is to understand the functioning of HTM</w:t>
-      </w:r>
-      <w:r>
-        <w:t xml:space="preserve"> algorithms – Temporal memory and </w:t>
-      </w:r>
-      <w:r>
-        <w:t>S</w:t>
-      </w:r>
-      <w:r>
-        <w:t xml:space="preserve">patial </w:t>
-      </w:r>
-      <w:r>
-        <w:t>P</w:t>
-      </w:r>
-      <w:r>
-        <w:t>ooler</w:t>
-      </w:r>
-      <w:r>
-        <w:t xml:space="preserve"> </w:t>
-      </w:r>
-      <w:r>
-        <w:t xml:space="preserve">and </w:t>
-      </w:r>
-      <w:r>
-        <w:t>the process of generating SDRs</w:t>
-      </w:r>
-      <w:r>
-        <w:t xml:space="preserve"> </w:t>
-      </w:r>
-      <w:r>
-        <w:t>and parallelization</w:t>
-      </w:r>
-      <w:r>
-        <w:t>,</w:t>
-      </w:r>
-      <w:r>
-        <w:t xml:space="preserve"> </w:t>
-      </w:r>
-      <w:r>
-        <w:t>which forms the basis of this paper, exploring various avenues to achieve a more efficient system.</w:t>
+        <w:t>forms the basis of this paper, exploring various avenues to achieve a more efficient system.</w:t>
       </w:r>
       <w:r>
         <w:t xml:space="preserve"> </w:t>
@@ -1520,10 +1499,7 @@
         <w:t xml:space="preserve"> T</w:t>
       </w:r>
       <w:r>
-        <w:t xml:space="preserve">he Spatial Pooler's column-based computations naturally lend themselves to </w:t>
-      </w:r>
-      <w:r>
-        <w:t>parallelization, as each column's activation can be processed independently</w:t>
+        <w:t>he Spatial Pooler's column-based computations naturally lend themselves to parallelization, as each column's activation can be processed independently</w:t>
       </w:r>
       <w:r>
         <w:t xml:space="preserve"> </w:t>
@@ -1549,7 +1525,10 @@
         <w:t xml:space="preserve">. </w:t>
       </w:r>
       <w:r>
-        <w:t>HTM’s reliance on Hebbian learning for synaptic updates introduces thread-safety challenges in shared-memory systems, necessitating careful synchronization to avoid race conditions</w:t>
+        <w:t xml:space="preserve">HTM’s reliance on Hebbian learning for synaptic updates introduces thread-safety </w:t>
+      </w:r>
+      <w:r>
+        <w:t>challenges in shared-memory systems, necessitating careful synchronization to avoid race conditions</w:t>
       </w:r>
       <w:r>
         <w:rPr>
@@ -1960,7 +1939,6 @@
         <w:jc w:val="center"/>
       </w:pPr>
       <w:r>
-        <w:lastRenderedPageBreak/>
         <w:t>methodology</w:t>
       </w:r>
     </w:p>
@@ -1980,7 +1958,15 @@
           <w:spacing w:val="-1"/>
           <w:lang w:eastAsia="x-none"/>
         </w:rPr>
-        <w:t xml:space="preserve">The methodology for this research was designed to systematically improve the performance of the Temporal Memory algorithm by introducing parallelization techniques. The goal was to identify and optimize critical sections of the code that could benefit from concurrent execution, thereby reducing overall execution time and improving efficiency. </w:t>
+        <w:t xml:space="preserve">The methodology for this research was designed to systematically improve the performance of the Temporal Memory algorithm by introducing parallelization techniques. The goal was to identify and optimize critical sections of the code that could benefit from concurrent execution, thereby </w:t>
+      </w:r>
+      <w:r>
+        <w:rPr>
+          <w:spacing w:val="-1"/>
+          <w:lang w:eastAsia="x-none"/>
+        </w:rPr>
+        <w:lastRenderedPageBreak/>
+        <w:t xml:space="preserve">reducing overall execution time and improving efficiency. </w:t>
       </w:r>
       <w:r>
         <w:rPr>
@@ -2374,7 +2360,6 @@
         </w:rPr>
         <w:t xml:space="preserve"> </w:t>
       </w:r>
-      <w:proofErr w:type="gramStart"/>
       <w:r>
         <w:rPr>
           <w:b/>
@@ -2393,7 +2378,6 @@
         </w:rPr>
         <w:t>  loops</w:t>
       </w:r>
-      <w:proofErr w:type="gramEnd"/>
       <w:r>
         <w:rPr>
           <w:iCs/>
@@ -2819,9 +2803,8 @@
           <w:spacing w:val="5"/>
           <w:lang w:val="en-US"/>
         </w:rPr>
-        <w:t>B.</w:t>
-      </w:r>
-      <w:proofErr w:type="gramStart"/>
+        <w:t xml:space="preserve">B.1  </w:t>
+      </w:r>
       <w:r>
         <w:rPr>
           <w:i/>
@@ -2829,8 +2812,9 @@
           <w:spacing w:val="5"/>
           <w:lang w:val="en-US"/>
         </w:rPr>
-        <w:t xml:space="preserve">1  </w:t>
-      </w:r>
+        <w:t xml:space="preserve">Why </w:t>
+      </w:r>
+      <w:proofErr w:type="spellStart"/>
       <w:r>
         <w:rPr>
           <w:i/>
@@ -2838,9 +2822,9 @@
           <w:spacing w:val="5"/>
           <w:lang w:val="en-US"/>
         </w:rPr>
-        <w:t>Why</w:t>
-      </w:r>
-      <w:proofErr w:type="gramEnd"/>
+        <w:t>Parallel.For</w:t>
+      </w:r>
+      <w:proofErr w:type="spellEnd"/>
       <w:r>
         <w:rPr>
           <w:i/>
@@ -2848,9 +2832,8 @@
           <w:spacing w:val="5"/>
           <w:lang w:val="en-US"/>
         </w:rPr>
-        <w:t xml:space="preserve"> </w:t>
-      </w:r>
-      <w:proofErr w:type="spellStart"/>
+        <w:t xml:space="preserve"> Outperforms Async and Manual Threading for CPU-Bound Tasks</w:t>
+      </w:r>
       <w:r>
         <w:rPr>
           <w:i/>
@@ -2858,38 +2841,184 @@
           <w:spacing w:val="5"/>
           <w:lang w:val="en-US"/>
         </w:rPr>
-        <w:t>Parallel.For</w:t>
-      </w:r>
-      <w:proofErr w:type="spellEnd"/>
-      <w:r>
-        <w:rPr>
-          <w:i/>
+        <w:t>?</w:t>
+      </w:r>
+    </w:p>
+    <w:p>
+      <w:pPr>
+        <w:pStyle w:val="BodyText"/>
+        <w:spacing w:after="0"/>
+        <w:ind w:firstLine="0"/>
+        <w:rPr>
           <w:iCs/>
           <w:spacing w:val="5"/>
           <w:lang w:val="en-US"/>
         </w:rPr>
-        <w:t xml:space="preserve"> is the Better </w:t>
-      </w:r>
-      <w:proofErr w:type="gramStart"/>
-      <w:r>
-        <w:rPr>
-          <w:i/>
+      </w:pPr>
+      <w:r>
+        <w:rPr>
           <w:iCs/>
           <w:spacing w:val="5"/>
           <w:lang w:val="en-US"/>
         </w:rPr>
-        <w:t>Choice</w:t>
-      </w:r>
-      <w:r>
-        <w:rPr>
-          <w:i/>
+        <w:t xml:space="preserve">       </w:t>
+      </w:r>
+      <w:proofErr w:type="spellStart"/>
+      <w:r>
+        <w:rPr>
           <w:iCs/>
           <w:spacing w:val="5"/>
           <w:lang w:val="en-US"/>
         </w:rPr>
-        <w:t xml:space="preserve"> ?</w:t>
-      </w:r>
-      <w:proofErr w:type="gramEnd"/>
+        <w:t>Parallel.For</w:t>
+      </w:r>
+      <w:proofErr w:type="spellEnd"/>
+      <w:r>
+        <w:rPr>
+          <w:iCs/>
+          <w:spacing w:val="5"/>
+          <w:lang w:val="en-US"/>
+        </w:rPr>
+        <w:t xml:space="preserve"> is the preferred choice for CPU-bound tasks due to its efficient load balancing and scalability. </w:t>
+      </w:r>
+      <w:r>
+        <w:rPr>
+          <w:iCs/>
+          <w:spacing w:val="5"/>
+          <w:lang w:val="en-US"/>
+        </w:rPr>
+        <w:t>It automatically divides tasks across CPU cores without explicit thread management. This approach:</w:t>
+      </w:r>
+      <w:r>
+        <w:rPr>
+          <w:iCs/>
+          <w:spacing w:val="5"/>
+          <w:lang w:val="en-US"/>
+        </w:rPr>
+        <w:t xml:space="preserve"> </w:t>
+      </w:r>
+    </w:p>
+    <w:p>
+      <w:pPr>
+        <w:pStyle w:val="BodyText"/>
+        <w:numPr>
+          <w:ilvl w:val="0"/>
+          <w:numId w:val="28"/>
+        </w:numPr>
+        <w:rPr>
+          <w:iCs/>
+          <w:spacing w:val="5"/>
+          <w:sz w:val="18"/>
+          <w:szCs w:val="18"/>
+        </w:rPr>
+      </w:pPr>
+      <w:r>
+        <w:rPr>
+          <w:b/>
+          <w:bCs/>
+          <w:iCs/>
+          <w:spacing w:val="5"/>
+          <w:sz w:val="18"/>
+          <w:szCs w:val="18"/>
+        </w:rPr>
+        <w:t>Beats </w:t>
+      </w:r>
+      <w:r>
+        <w:rPr>
+          <w:iCs/>
+          <w:spacing w:val="5"/>
+          <w:sz w:val="18"/>
+          <w:szCs w:val="18"/>
+        </w:rPr>
+        <w:t>async: Avoids unnecessary task scheduling overhead (async is for I/O, not CPU work).</w:t>
+      </w:r>
+    </w:p>
+    <w:p>
+      <w:pPr>
+        <w:pStyle w:val="BodyText"/>
+        <w:numPr>
+          <w:ilvl w:val="0"/>
+          <w:numId w:val="28"/>
+        </w:numPr>
+        <w:rPr>
+          <w:iCs/>
+          <w:spacing w:val="5"/>
+          <w:sz w:val="18"/>
+          <w:szCs w:val="18"/>
+        </w:rPr>
+      </w:pPr>
+      <w:r>
+        <w:rPr>
+          <w:b/>
+          <w:bCs/>
+          <w:iCs/>
+          <w:spacing w:val="5"/>
+          <w:sz w:val="18"/>
+          <w:szCs w:val="18"/>
+        </w:rPr>
+        <w:t>Beats manual threading</w:t>
+      </w:r>
+      <w:r>
+        <w:rPr>
+          <w:iCs/>
+          <w:spacing w:val="5"/>
+          <w:sz w:val="18"/>
+          <w:szCs w:val="18"/>
+        </w:rPr>
+        <w:t>: Eliminates complex lock statements (race condition risks).</w:t>
+      </w:r>
+    </w:p>
+    <w:p>
+      <w:pPr>
+        <w:pStyle w:val="BodyText"/>
+        <w:numPr>
+          <w:ilvl w:val="0"/>
+          <w:numId w:val="28"/>
+        </w:numPr>
+        <w:rPr>
+          <w:iCs/>
+          <w:spacing w:val="5"/>
+        </w:rPr>
+      </w:pPr>
+      <w:r>
+        <w:rPr>
+          <w:b/>
+          <w:bCs/>
+          <w:iCs/>
+          <w:spacing w:val="5"/>
+          <w:sz w:val="18"/>
+          <w:szCs w:val="18"/>
+        </w:rPr>
+        <w:t>Beats sequential loops</w:t>
+      </w:r>
+      <w:r>
+        <w:rPr>
+          <w:iCs/>
+          <w:spacing w:val="5"/>
+          <w:sz w:val="18"/>
+          <w:szCs w:val="18"/>
+        </w:rPr>
+        <w:t>: 3× faster initialization (Fig 3) with lower variance (7.56 vs 10.33).</w:t>
+      </w:r>
+      <w:r>
+        <w:rPr>
+          <w:iCs/>
+          <w:spacing w:val="5"/>
+          <w:sz w:val="18"/>
+          <w:szCs w:val="18"/>
+        </w:rPr>
+        <w:br/>
+        <w:t>Unlike manual threading, it dynamically adjusts threads for optimal performance on any system</w:t>
+      </w:r>
+      <w:r>
+        <w:rPr>
+          <w:iCs/>
+          <w:spacing w:val="5"/>
+          <w:sz w:val="18"/>
+          <w:szCs w:val="18"/>
+        </w:rPr>
+        <w:t>.</w:t>
+      </w:r>
     </w:p>
     <w:p>
       <w:pPr>
@@ -2908,105 +3037,106 @@
           <w:spacing w:val="5"/>
           <w:lang w:val="en-US"/>
         </w:rPr>
-        <w:t xml:space="preserve">       </w:t>
-      </w:r>
-      <w:proofErr w:type="spellStart"/>
+        <w:t>This approach is particularly beneficial for computationally expensive yet short-lived operations like matrix initialization. By</w:t>
+      </w:r>
       <w:r>
         <w:rPr>
           <w:iCs/>
           <w:spacing w:val="5"/>
           <w:lang w:val="en-US"/>
         </w:rPr>
-        <w:t>Parallel.For</w:t>
-      </w:r>
-      <w:proofErr w:type="spellEnd"/>
+        <w:t xml:space="preserve"> </w:t>
+      </w:r>
       <w:r>
         <w:rPr>
           <w:iCs/>
           <w:spacing w:val="5"/>
           <w:lang w:val="en-US"/>
         </w:rPr>
-        <w:t xml:space="preserve"> is the preferred choice for CPU-bound tasks due to its efficient load balancing and scalability. It automatically divides tasks into chunks and distributes them across available CPU cores, optimizing execution without requiring explicit thread management. This approach is particularly beneficial for computationally expensive yet short-lived operations like matrix initialization. By</w:t>
-      </w:r>
+        <w:t xml:space="preserve">reducing synchronization overhead, </w:t>
+      </w:r>
+      <w:proofErr w:type="spellStart"/>
       <w:r>
         <w:rPr>
           <w:iCs/>
           <w:spacing w:val="5"/>
           <w:lang w:val="en-US"/>
         </w:rPr>
-        <w:t xml:space="preserve"> </w:t>
-      </w:r>
+        <w:t>Parallel.For</w:t>
+      </w:r>
+      <w:proofErr w:type="spellEnd"/>
       <w:r>
         <w:rPr>
           <w:iCs/>
           <w:spacing w:val="5"/>
           <w:lang w:val="en-US"/>
         </w:rPr>
-        <w:t xml:space="preserve">reducing synchronization overhead, </w:t>
-      </w:r>
-      <w:proofErr w:type="spellStart"/>
+        <w:t xml:space="preserve"> eliminates complex locking mechanisms, minimizing performance bottlenecks. Moreover, it dynamically adjusts the number of threads based on system resources, ensuring optimal performance </w:t>
+      </w:r>
       <w:r>
         <w:rPr>
           <w:iCs/>
           <w:spacing w:val="5"/>
           <w:lang w:val="en-US"/>
         </w:rPr>
-        <w:t>Parallel.For</w:t>
-      </w:r>
-      <w:proofErr w:type="spellEnd"/>
+        <w:lastRenderedPageBreak/>
+        <w:t xml:space="preserve">on both multi-core and single-core systems. Unlike manual threading, it abstracts thread management using the .NET </w:t>
+      </w:r>
+      <w:proofErr w:type="spellStart"/>
       <w:r>
         <w:rPr>
           <w:iCs/>
           <w:spacing w:val="5"/>
           <w:lang w:val="en-US"/>
         </w:rPr>
-        <w:t xml:space="preserve"> eliminates complex locking mechanisms, minimizing performance bottlenecks. Moreover, it dynamically adjusts the number of threads based on system resources, ensuring optimal performance on both multi-core and single-core systems. Unlike manual threading, it abstracts thread management using the .NET </w:t>
-      </w:r>
-      <w:proofErr w:type="spellStart"/>
+        <w:t>ThreadPool</w:t>
+      </w:r>
+      <w:proofErr w:type="spellEnd"/>
       <w:r>
         <w:rPr>
           <w:iCs/>
           <w:spacing w:val="5"/>
           <w:lang w:val="en-US"/>
         </w:rPr>
-        <w:lastRenderedPageBreak/>
-        <w:t>ThreadPool</w:t>
-      </w:r>
-      <w:proofErr w:type="spellEnd"/>
+        <w:t xml:space="preserve">, simplifying implementation while maintaining non-blocking execution. As a result, </w:t>
+      </w:r>
+      <w:proofErr w:type="spellStart"/>
       <w:r>
         <w:rPr>
           <w:iCs/>
           <w:spacing w:val="5"/>
           <w:lang w:val="en-US"/>
         </w:rPr>
-        <w:t xml:space="preserve">, simplifying implementation while maintaining non-blocking execution. As a result, </w:t>
-      </w:r>
-      <w:proofErr w:type="spellStart"/>
+        <w:t>Parallel.For</w:t>
+      </w:r>
+      <w:proofErr w:type="spellEnd"/>
       <w:r>
         <w:rPr>
           <w:iCs/>
           <w:spacing w:val="5"/>
           <w:lang w:val="en-US"/>
         </w:rPr>
-        <w:t>Parallel.For</w:t>
-      </w:r>
-      <w:proofErr w:type="spellEnd"/>
+        <w:t xml:space="preserve"> maximizes throughput by running multiple threads concurrently, making it an ideal solution for scalable parallel processing.</w:t>
+      </w:r>
       <w:r>
         <w:rPr>
           <w:iCs/>
           <w:spacing w:val="5"/>
           <w:lang w:val="en-US"/>
         </w:rPr>
-        <w:t xml:space="preserve"> maximizes throughput by running multiple threads concurrently, making it an ideal solution for scalable parallel processing.</w:t>
-      </w:r>
-      <w:r>
+        <w:t xml:space="preserve"> [Table 1]</w:t>
+      </w:r>
+    </w:p>
+    <w:p>
+      <w:pPr>
+        <w:pStyle w:val="BodyText"/>
+        <w:ind w:firstLine="0"/>
         <w:rPr>
           <w:iCs/>
           <w:spacing w:val="5"/>
           <w:lang w:val="en-US"/>
         </w:rPr>
-        <w:t xml:space="preserve"> [Table 1]</w:t>
-      </w:r>
+      </w:pPr>
     </w:p>
     <w:p>
       <w:pPr>
@@ -3018,513 +3148,48 @@
           <w:lang w:val="en-US"/>
         </w:rPr>
       </w:pPr>
-    </w:p>
-    <w:p>
-      <w:pPr>
-        <w:pStyle w:val="BodyText"/>
-        <w:ind w:firstLine="0"/>
+      <w:r>
         <w:rPr>
           <w:iCs/>
           <w:spacing w:val="5"/>
           <w:lang w:val="en-US"/>
         </w:rPr>
-      </w:pPr>
-    </w:p>
-    <w:tbl>
-      <w:tblPr>
-        <w:tblStyle w:val="TableGrid"/>
-        <w:tblW w:w="0" w:type="auto"/>
-        <w:tblLook w:val="04A0" w:firstRow="1" w:lastRow="0" w:firstColumn="1" w:lastColumn="0" w:noHBand="0" w:noVBand="1"/>
-      </w:tblPr>
-      <w:tblGrid>
-        <w:gridCol w:w="1579"/>
-        <w:gridCol w:w="1681"/>
-        <w:gridCol w:w="1596"/>
-      </w:tblGrid>
-      <w:tr>
-        <w:tc>
-          <w:tcPr>
-            <w:tcW w:w="1618" w:type="dxa"/>
-          </w:tcPr>
-          <w:p>
-            <w:pPr>
-              <w:pStyle w:val="BodyText"/>
-              <w:ind w:firstLine="0"/>
-              <w:rPr>
-                <w:b/>
-                <w:bCs/>
-                <w:iCs/>
-                <w:spacing w:val="5"/>
-                <w:lang w:val="en-US"/>
-              </w:rPr>
-            </w:pPr>
-            <w:r>
-              <w:rPr>
-                <w:b/>
-                <w:bCs/>
-                <w:iCs/>
-                <w:spacing w:val="5"/>
-                <w:lang w:val="en-US"/>
-              </w:rPr>
-              <w:t>Aspect</w:t>
-            </w:r>
-          </w:p>
-        </w:tc>
-        <w:tc>
-          <w:tcPr>
-            <w:tcW w:w="1619" w:type="dxa"/>
-          </w:tcPr>
-          <w:p>
-            <w:pPr>
-              <w:pStyle w:val="BodyText"/>
-              <w:ind w:firstLine="0"/>
-              <w:rPr>
-                <w:iCs/>
-                <w:spacing w:val="5"/>
-                <w:lang w:val="en-US"/>
-              </w:rPr>
-            </w:pPr>
-            <w:proofErr w:type="spellStart"/>
-            <w:r>
-              <w:rPr>
-                <w:b/>
-                <w:bCs/>
-                <w:iCs/>
-                <w:spacing w:val="5"/>
-                <w:lang w:val="en-US"/>
-              </w:rPr>
-              <w:t>Parallel.For</w:t>
-            </w:r>
-            <w:proofErr w:type="spellEnd"/>
-            <w:r>
-              <w:rPr>
-                <w:b/>
-                <w:bCs/>
-                <w:iCs/>
-                <w:spacing w:val="5"/>
-                <w:lang w:val="en-US"/>
-              </w:rPr>
-              <w:t xml:space="preserve"> (Recommended)</w:t>
-            </w:r>
-          </w:p>
-        </w:tc>
-        <w:tc>
-          <w:tcPr>
-            <w:tcW w:w="1619" w:type="dxa"/>
-          </w:tcPr>
-          <w:p>
-            <w:pPr>
-              <w:pStyle w:val="BodyText"/>
-              <w:ind w:firstLine="0"/>
-              <w:rPr>
-                <w:iCs/>
-                <w:spacing w:val="5"/>
-                <w:lang w:val="en-US"/>
-              </w:rPr>
-            </w:pPr>
-            <w:r>
-              <w:rPr>
-                <w:b/>
-                <w:bCs/>
-                <w:iCs/>
-                <w:spacing w:val="5"/>
-                <w:lang w:val="en-US"/>
-              </w:rPr>
-              <w:t>Async (Unnecessary Overhead)</w:t>
-            </w:r>
-          </w:p>
-        </w:tc>
-      </w:tr>
-      <w:tr>
-        <w:tc>
-          <w:tcPr>
-            <w:tcW w:w="1618" w:type="dxa"/>
-          </w:tcPr>
-          <w:p>
-            <w:pPr>
-              <w:pStyle w:val="BodyText"/>
-              <w:ind w:firstLine="0"/>
-              <w:rPr>
-                <w:iCs/>
-                <w:spacing w:val="5"/>
-                <w:lang w:val="en-US"/>
-              </w:rPr>
-            </w:pPr>
-            <w:r>
-              <w:rPr>
-                <w:iCs/>
-                <w:spacing w:val="5"/>
-                <w:lang w:val="en-US"/>
-              </w:rPr>
-              <w:t>Best for</w:t>
-            </w:r>
-          </w:p>
-        </w:tc>
-        <w:tc>
-          <w:tcPr>
-            <w:tcW w:w="1619" w:type="dxa"/>
-          </w:tcPr>
-          <w:p>
-            <w:pPr>
-              <w:pStyle w:val="BodyText"/>
-              <w:ind w:firstLine="0"/>
-              <w:rPr>
-                <w:iCs/>
-                <w:spacing w:val="5"/>
-                <w:lang w:val="en-US"/>
-              </w:rPr>
-            </w:pPr>
-            <w:r>
-              <w:rPr>
-                <w:iCs/>
-                <w:spacing w:val="5"/>
-                <w:lang w:val="en-US"/>
-              </w:rPr>
-              <w:t>CPU-bound tasks</w:t>
-            </w:r>
-          </w:p>
-        </w:tc>
-        <w:tc>
-          <w:tcPr>
-            <w:tcW w:w="1619" w:type="dxa"/>
-          </w:tcPr>
-          <w:p>
-            <w:pPr>
-              <w:pStyle w:val="BodyText"/>
-              <w:ind w:firstLine="0"/>
-              <w:rPr>
-                <w:iCs/>
-                <w:spacing w:val="5"/>
-                <w:lang w:val="en-US"/>
-              </w:rPr>
-            </w:pPr>
-            <w:r>
-              <w:rPr>
-                <w:iCs/>
-                <w:spacing w:val="5"/>
-                <w:lang w:val="en-US"/>
-              </w:rPr>
-              <w:t>I/O-bound tasks</w:t>
-            </w:r>
-          </w:p>
-        </w:tc>
-      </w:tr>
-      <w:tr>
-        <w:tc>
-          <w:tcPr>
-            <w:tcW w:w="1618" w:type="dxa"/>
-          </w:tcPr>
-          <w:p>
-            <w:pPr>
-              <w:pStyle w:val="BodyText"/>
-              <w:ind w:firstLine="0"/>
-              <w:rPr>
-                <w:iCs/>
-                <w:spacing w:val="5"/>
-                <w:lang w:val="en-US"/>
-              </w:rPr>
-            </w:pPr>
-            <w:r>
-              <w:rPr>
-                <w:iCs/>
-                <w:spacing w:val="5"/>
-                <w:lang w:val="en-US"/>
-              </w:rPr>
-              <w:t>Execution Speed</w:t>
-            </w:r>
-          </w:p>
-        </w:tc>
-        <w:tc>
-          <w:tcPr>
-            <w:tcW w:w="1619" w:type="dxa"/>
-          </w:tcPr>
-          <w:p>
-            <w:pPr>
-              <w:pStyle w:val="BodyText"/>
-              <w:ind w:firstLine="0"/>
-              <w:rPr>
-                <w:iCs/>
-                <w:spacing w:val="5"/>
-                <w:lang w:val="en-US"/>
-              </w:rPr>
-            </w:pPr>
-            <w:r>
-              <w:rPr>
-                <w:iCs/>
-                <w:spacing w:val="5"/>
-                <w:lang w:val="en-US"/>
-              </w:rPr>
-              <w:t>Faster</w:t>
-            </w:r>
-          </w:p>
-        </w:tc>
-        <w:tc>
-          <w:tcPr>
-            <w:tcW w:w="1619" w:type="dxa"/>
-          </w:tcPr>
-          <w:p>
-            <w:pPr>
-              <w:pStyle w:val="BodyText"/>
-              <w:ind w:firstLine="0"/>
-              <w:rPr>
-                <w:iCs/>
-                <w:spacing w:val="5"/>
-                <w:lang w:val="en-US"/>
-              </w:rPr>
-            </w:pPr>
-            <w:r>
-              <w:rPr>
-                <w:iCs/>
-                <w:spacing w:val="5"/>
-                <w:lang w:val="en-US"/>
-              </w:rPr>
-              <w:t>Slower (Extra task scheduling)</w:t>
-            </w:r>
-          </w:p>
-        </w:tc>
-      </w:tr>
-      <w:tr>
-        <w:tc>
-          <w:tcPr>
-            <w:tcW w:w="1618" w:type="dxa"/>
-          </w:tcPr>
-          <w:p>
-            <w:pPr>
-              <w:pStyle w:val="BodyText"/>
-              <w:ind w:firstLine="0"/>
-              <w:rPr>
-                <w:iCs/>
-                <w:spacing w:val="5"/>
-                <w:lang w:val="en-US"/>
-              </w:rPr>
-            </w:pPr>
-            <w:r>
-              <w:rPr>
-                <w:iCs/>
-                <w:spacing w:val="5"/>
-                <w:lang w:val="en-US"/>
-              </w:rPr>
-              <w:t>CPU Utilization</w:t>
-            </w:r>
-          </w:p>
-        </w:tc>
-        <w:tc>
-          <w:tcPr>
-            <w:tcW w:w="1619" w:type="dxa"/>
-          </w:tcPr>
-          <w:p>
-            <w:pPr>
-              <w:pStyle w:val="BodyText"/>
-              <w:ind w:firstLine="0"/>
-              <w:rPr>
-                <w:iCs/>
-                <w:spacing w:val="5"/>
-                <w:lang w:val="en-US"/>
-              </w:rPr>
-            </w:pPr>
-            <w:r>
-              <w:rPr>
-                <w:iCs/>
-                <w:spacing w:val="5"/>
-                <w:lang w:val="en-US"/>
-              </w:rPr>
-              <w:t>Fully Utilized</w:t>
-            </w:r>
-          </w:p>
-        </w:tc>
-        <w:tc>
-          <w:tcPr>
-            <w:tcW w:w="1619" w:type="dxa"/>
-          </w:tcPr>
-          <w:p>
-            <w:pPr>
-              <w:pStyle w:val="BodyText"/>
-              <w:ind w:firstLine="0"/>
-              <w:rPr>
-                <w:iCs/>
-                <w:spacing w:val="5"/>
-                <w:lang w:val="en-US"/>
-              </w:rPr>
-            </w:pPr>
-            <w:r>
-              <w:rPr>
-                <w:iCs/>
-                <w:spacing w:val="5"/>
-                <w:lang w:val="en-US"/>
-              </w:rPr>
-              <w:t>Context switching overhead</w:t>
-            </w:r>
-          </w:p>
-        </w:tc>
-      </w:tr>
-      <w:tr>
-        <w:tc>
-          <w:tcPr>
-            <w:tcW w:w="1618" w:type="dxa"/>
-          </w:tcPr>
-          <w:p>
-            <w:pPr>
-              <w:pStyle w:val="BodyText"/>
-              <w:ind w:firstLine="0"/>
-              <w:rPr>
-                <w:iCs/>
-                <w:spacing w:val="5"/>
-                <w:lang w:val="en-US"/>
-              </w:rPr>
-            </w:pPr>
-            <w:r>
-              <w:rPr>
-                <w:iCs/>
-                <w:spacing w:val="5"/>
-                <w:lang w:val="en-US"/>
-              </w:rPr>
-              <w:t xml:space="preserve">Use of </w:t>
-            </w:r>
-            <w:proofErr w:type="spellStart"/>
-            <w:r>
-              <w:rPr>
-                <w:iCs/>
-                <w:spacing w:val="5"/>
-                <w:lang w:val="en-US"/>
-              </w:rPr>
-              <w:t>ThreadPool</w:t>
-            </w:r>
-            <w:proofErr w:type="spellEnd"/>
-          </w:p>
-        </w:tc>
-        <w:tc>
-          <w:tcPr>
-            <w:tcW w:w="1619" w:type="dxa"/>
-          </w:tcPr>
-          <w:p>
-            <w:pPr>
-              <w:pStyle w:val="BodyText"/>
-              <w:ind w:firstLine="0"/>
-              <w:rPr>
-                <w:iCs/>
-                <w:spacing w:val="5"/>
-                <w:lang w:val="en-US"/>
-              </w:rPr>
-            </w:pPr>
-            <w:r>
-              <w:rPr>
-                <w:iCs/>
-                <w:spacing w:val="5"/>
-                <w:lang w:val="en-US"/>
-              </w:rPr>
-              <w:t>Yes (Efficient)</w:t>
-            </w:r>
-          </w:p>
-        </w:tc>
-        <w:tc>
-          <w:tcPr>
-            <w:tcW w:w="1619" w:type="dxa"/>
-          </w:tcPr>
-          <w:p>
-            <w:pPr>
-              <w:spacing w:after="168"/>
-              <w:jc w:val="both"/>
-              <w:rPr>
-                <w:color w:val="292929"/>
-              </w:rPr>
-            </w:pPr>
-            <w:r>
-              <w:rPr>
-                <w:color w:val="292929"/>
-              </w:rPr>
-              <w:t>Yes, but unnecessary overhead</w:t>
-            </w:r>
-          </w:p>
-        </w:tc>
-      </w:tr>
-      <w:tr>
-        <w:tc>
-          <w:tcPr>
-            <w:tcW w:w="1618" w:type="dxa"/>
-          </w:tcPr>
-          <w:p>
-            <w:pPr>
-              <w:pStyle w:val="BodyText"/>
-              <w:ind w:firstLine="0"/>
-              <w:rPr>
-                <w:iCs/>
-                <w:spacing w:val="5"/>
-                <w:lang w:val="en-US"/>
-              </w:rPr>
-            </w:pPr>
-            <w:r>
-              <w:rPr>
-                <w:iCs/>
-                <w:spacing w:val="5"/>
-                <w:lang w:val="en-US"/>
-              </w:rPr>
-              <w:t>Performance</w:t>
-            </w:r>
-          </w:p>
-        </w:tc>
-        <w:tc>
-          <w:tcPr>
-            <w:tcW w:w="1619" w:type="dxa"/>
-          </w:tcPr>
-          <w:p>
-            <w:pPr>
-              <w:pStyle w:val="BodyText"/>
-              <w:ind w:firstLine="0"/>
-              <w:rPr>
-                <w:iCs/>
-                <w:spacing w:val="5"/>
-                <w:lang w:val="en-US"/>
-              </w:rPr>
-            </w:pPr>
-            <w:r>
-              <w:rPr>
-                <w:iCs/>
-                <w:spacing w:val="5"/>
-                <w:lang w:val="en-US"/>
-              </w:rPr>
-              <w:t>Optimized for multi-threading</w:t>
-            </w:r>
-          </w:p>
-        </w:tc>
-        <w:tc>
-          <w:tcPr>
-            <w:tcW w:w="1619" w:type="dxa"/>
-          </w:tcPr>
-          <w:p>
-            <w:pPr>
-              <w:pStyle w:val="BodyText"/>
-              <w:ind w:firstLine="0"/>
-              <w:rPr>
-                <w:iCs/>
-                <w:spacing w:val="5"/>
-                <w:lang w:val="en-US"/>
-              </w:rPr>
-            </w:pPr>
-            <w:r>
-              <w:rPr>
-                <w:iCs/>
-                <w:spacing w:val="5"/>
-                <w:lang w:val="en-US"/>
-              </w:rPr>
-              <w:t>Adds delay without benefits</w:t>
-            </w:r>
-          </w:p>
-        </w:tc>
-      </w:tr>
-    </w:tbl>
-    <w:p>
-      <w:pPr>
-        <w:tabs>
-          <w:tab w:val="left" w:pos="288"/>
-        </w:tabs>
-        <w:jc w:val="both"/>
-        <w:rPr>
-          <w:color w:val="0D0D0D"/>
-          <w:sz w:val="16"/>
-          <w:szCs w:val="16"/>
-          <w:shd w:val="clear" w:color="auto" w:fill="FFFFFF"/>
-        </w:rPr>
-      </w:pPr>
+        <w:drawing>
+          <wp:inline distT="0" distB="0" distL="0" distR="0" wp14:anchorId="30FD8949" wp14:editId="65D1431B">
+            <wp:extent cx="3089910" cy="2090420"/>
+            <wp:effectExtent l="0" t="0" r="0" b="5080"/>
+            <wp:docPr id="968019593" name="Picture 1" descr="A white sheet with black text&#10;&#10;AI-generated content may be incorrect."/>
+            <wp:cNvGraphicFramePr>
+              <a:graphicFrameLocks xmlns:a="http://schemas.openxmlformats.org/drawingml/2006/main" noChangeAspect="1"/>
+            </wp:cNvGraphicFramePr>
+            <a:graphic xmlns:a="http://schemas.openxmlformats.org/drawingml/2006/main">
+              <a:graphicData uri="http://schemas.openxmlformats.org/drawingml/2006/picture">
+                <pic:pic xmlns:pic="http://schemas.openxmlformats.org/drawingml/2006/picture">
+                  <pic:nvPicPr>
+                    <pic:cNvPr id="968019593" name="Picture 1" descr="A white sheet with black text&#10;&#10;AI-generated content may be incorrect."/>
+                    <pic:cNvPicPr/>
+                  </pic:nvPicPr>
+                  <pic:blipFill>
+                    <a:blip r:embed="rId20"/>
+                    <a:stretch>
+                      <a:fillRect/>
+                    </a:stretch>
+                  </pic:blipFill>
+                  <pic:spPr>
+                    <a:xfrm>
+                      <a:off x="0" y="0"/>
+                      <a:ext cx="3089910" cy="2090420"/>
+                    </a:xfrm>
+                    <a:prstGeom prst="rect">
+                      <a:avLst/>
+                    </a:prstGeom>
+                  </pic:spPr>
+                </pic:pic>
+              </a:graphicData>
+            </a:graphic>
+          </wp:inline>
+        </w:drawing>
+      </w:r>
     </w:p>
     <w:p>
       <w:pPr>
@@ -3669,34 +3334,16 @@
           <w:bCs/>
           <w:lang w:val="en-US"/>
         </w:rPr>
-        <w:t>Single_Threaded_Optimized_</w:t>
-      </w:r>
-      <w:proofErr w:type="gramStart"/>
+        <w:t>Single_Threaded_Optimized_Init</w:t>
+      </w:r>
+      <w:proofErr w:type="spellEnd"/>
       <w:r>
         <w:rPr>
           <w:b/>
           <w:bCs/>
           <w:lang w:val="en-US"/>
         </w:rPr>
-        <w:t>Init</w:t>
-      </w:r>
-      <w:proofErr w:type="spellEnd"/>
-      <w:r>
-        <w:rPr>
-          <w:b/>
-          <w:bCs/>
-          <w:lang w:val="en-US"/>
-        </w:rPr>
-        <w:t>(</w:t>
-      </w:r>
-      <w:proofErr w:type="gramEnd"/>
-      <w:r>
-        <w:rPr>
-          <w:b/>
-          <w:bCs/>
-          <w:lang w:val="en-US"/>
-        </w:rPr>
-        <w:t>)</w:t>
+        <w:t>()</w:t>
       </w:r>
       <w:r>
         <w:rPr>
@@ -3717,7 +3364,6 @@
         </w:rPr>
       </w:pPr>
       <w:proofErr w:type="spellStart"/>
-      <w:proofErr w:type="gramStart"/>
       <w:r>
         <w:rPr>
           <w:b/>
@@ -3733,16 +3379,7 @@
           <w:bCs/>
           <w:lang w:val="en-US"/>
         </w:rPr>
-        <w:t>(</w:t>
-      </w:r>
-      <w:proofErr w:type="gramEnd"/>
-      <w:r>
-        <w:rPr>
-          <w:b/>
-          <w:bCs/>
-          <w:lang w:val="en-US"/>
-        </w:rPr>
-        <w:t>)</w:t>
+        <w:t>()</w:t>
       </w:r>
       <w:r>
         <w:rPr>
@@ -3777,7 +3414,6 @@
         </w:rPr>
       </w:pPr>
       <w:proofErr w:type="spellStart"/>
-      <w:proofErr w:type="gramStart"/>
       <w:r>
         <w:rPr>
           <w:b/>
@@ -3793,16 +3429,7 @@
           <w:bCs/>
           <w:lang w:val="en-US"/>
         </w:rPr>
-        <w:t>(</w:t>
-      </w:r>
-      <w:proofErr w:type="gramEnd"/>
-      <w:r>
-        <w:rPr>
-          <w:b/>
-          <w:bCs/>
-          <w:lang w:val="en-US"/>
-        </w:rPr>
-        <w:t>)</w:t>
+        <w:t>()</w:t>
       </w:r>
       <w:r>
         <w:rPr>
@@ -3885,7 +3512,6 @@
         </w:rPr>
       </w:pPr>
       <w:proofErr w:type="spellStart"/>
-      <w:proofErr w:type="gramStart"/>
       <w:r>
         <w:rPr>
           <w:b/>
@@ -3901,32 +3527,14 @@
           <w:bCs/>
           <w:lang w:val="en-US"/>
         </w:rPr>
-        <w:t>(</w:t>
-      </w:r>
-      <w:proofErr w:type="gramEnd"/>
-      <w:r>
-        <w:rPr>
-          <w:b/>
-          <w:bCs/>
+        <w:t>()</w:t>
+      </w:r>
+      <w:r>
+        <w:rPr>
           <w:lang w:val="en-US"/>
         </w:rPr>
-        <w:t>)</w:t>
-      </w:r>
-      <w:r>
-        <w:rPr>
-          <w:lang w:val="en-US"/>
-        </w:rPr>
         <w:t>: This method further optimized parallel execution by partitioning the workload into smaller chunks. This approach was particularly effective for large datasets, as it minimized overhead and improved resource utilization.</w:t>
       </w:r>
-    </w:p>
-    <w:p>
-      <w:pPr>
-        <w:pStyle w:val="BodyText"/>
-        <w:ind w:left="720" w:firstLine="0"/>
-        <w:rPr>
-          <w:lang w:val="en-US"/>
-        </w:rPr>
-      </w:pPr>
     </w:p>
     <w:p>
       <w:pPr>
@@ -3951,7 +3559,10 @@
         <w:jc w:val="both"/>
       </w:pPr>
       <w:r>
-        <w:t>After implementing the parallelized methods, we conducted a thorough performance analysis to evaluate their effectiveness. Key metrics such as execution time, CPU utilization, and memory usage were measured for each method. Additionally, statistical measures such as mean, maximum, minimum, variance, and standard deviation were calculated to assess the consistency and reliability of each approach. These metrics provided valuable insights into the performance improvements achieved through parallelization and helped identify the most efficient method.</w:t>
+        <w:t xml:space="preserve">After implementing the parallelized methods, we conducted a thorough performance analysis to evaluate their effectiveness. Key metrics such as execution time, CPU utilization, and memory usage were measured for each </w:t>
+      </w:r>
+      <w:r>
+        <w:t>method. Additionally, statistical measures such as mean, maximum, minimum, variance, and standard deviation were calculated to assess the consistency and reliability of each approach. These metrics provided valuable insights into the performance improvements achieved through parallelization and helped identify the most efficient method.</w:t>
       </w:r>
     </w:p>
     <w:p>
@@ -4078,6 +3689,9 @@
     </w:p>
     <w:p/>
     <w:p>
+      <w:pPr>
+        <w:jc w:val="both"/>
+      </w:pPr>
       <w:r>
         <w:t>The implementation phase of this research focused on refactoring the Temporal Memory algorithm to leverage parallel processing capabilities. The goal was to optimize the initialization process by replacing synchronous code with parallelized versions, thereby reducing execution time and improving overall performance. This section details the implementation of four distinct methods, each designed to test different parallelization strategies and optimizations. Additionally, we explain what is happening in the code at each step to provide a clear understanding of the implementation.</w:t>
       </w:r>
@@ -4091,27 +3705,14 @@
         <w:spacing w:before="160" w:after="80"/>
       </w:pPr>
       <w:r>
-        <w:lastRenderedPageBreak/>
         <w:t>Single_Threaded_Optimized_Init()</w:t>
       </w:r>
-      <w:hyperlink r:id="rId20" w:anchor="L44-L83" w:history="1">
+      <w:hyperlink r:id="rId21" w:anchor="L44-L83" w:history="1">
         <w:r>
           <w:rPr>
             <w:rStyle w:val="Hyperlink"/>
           </w:rPr>
-          <w:t>[GitH</w:t>
-        </w:r>
-        <w:r>
-          <w:rPr>
-            <w:rStyle w:val="Hyperlink"/>
-          </w:rPr>
-          <w:t>u</w:t>
-        </w:r>
-        <w:r>
-          <w:rPr>
-            <w:rStyle w:val="Hyperlink"/>
-          </w:rPr>
-          <w:t>b</w:t>
+          <w:t>[GitHub</w:t>
         </w:r>
         <w:r>
           <w:rPr>
@@ -4142,19 +3743,15 @@
       </w:r>
       <w:proofErr w:type="spellStart"/>
       <w:r>
-        <w:t>Single_Threaded_Optimized_</w:t>
-      </w:r>
-      <w:proofErr w:type="gramStart"/>
-      <w:r>
-        <w:t>Init</w:t>
+        <w:t>Single_Threaded_Optimized_Init</w:t>
       </w:r>
       <w:proofErr w:type="spellEnd"/>
       <w:r>
-        <w:t>(</w:t>
-      </w:r>
-      <w:proofErr w:type="gramEnd"/>
-      <w:r>
-        <w:t xml:space="preserve">), served as a baseline for comparison. It refines the original single-threaded implementation by reducing redundant checks and improving efficiency without introducing parallelism. </w:t>
+        <w:t xml:space="preserve">(), served as a baseline for comparison. It refines the original single-threaded implementation by reducing redundant </w:t>
+      </w:r>
+      <w:r>
+        <w:lastRenderedPageBreak/>
+        <w:t xml:space="preserve">checks and improving efficiency without introducing parallelism. </w:t>
       </w:r>
     </w:p>
     <w:p/>
@@ -4178,13 +3775,8 @@
         <w:t xml:space="preserve"> The null-coalescing operator is used to simplify the assignment of the matrix variable. If </w:t>
       </w:r>
       <w:proofErr w:type="spellStart"/>
-      <w:proofErr w:type="gramStart"/>
-      <w:r>
-        <w:t>this.connections</w:t>
-      </w:r>
-      <w:proofErr w:type="gramEnd"/>
-      <w:r>
-        <w:t>.Memory</w:t>
+      <w:r>
+        <w:t>this.connections.Memory</w:t>
       </w:r>
       <w:proofErr w:type="spellEnd"/>
       <w:r>
@@ -4273,12 +3865,10 @@
         <w:t> flag is introduced to store the result of </w:t>
       </w:r>
       <w:proofErr w:type="spellStart"/>
-      <w:proofErr w:type="gramStart"/>
       <w:r>
         <w:t>matrix.GetObject</w:t>
       </w:r>
       <w:proofErr w:type="spellEnd"/>
-      <w:proofErr w:type="gramEnd"/>
       <w:r>
         <w:t>(0) == null. This avoids repeated checks inside the loop, reducing overhead.</w:t>
       </w:r>
@@ -4394,12 +3984,10 @@
         <w:t xml:space="preserve"> is assigned the value of the first column in the matrix using </w:t>
       </w:r>
       <w:proofErr w:type="spellStart"/>
-      <w:proofErr w:type="gramStart"/>
       <w:r>
         <w:t>matrix.GetObject</w:t>
       </w:r>
       <w:proofErr w:type="spellEnd"/>
-      <w:proofErr w:type="gramEnd"/>
       <w:r>
         <w:t xml:space="preserve">(0). </w:t>
       </w:r>
@@ -4486,12 +4074,10 @@
         <w:t xml:space="preserve"> variable was removed to simplify the logic. The check for whether the first column is null has been streamlined into a direct check with </w:t>
       </w:r>
       <w:proofErr w:type="spellStart"/>
-      <w:proofErr w:type="gramStart"/>
       <w:r>
         <w:t>matrix.GetObject</w:t>
       </w:r>
       <w:proofErr w:type="spellEnd"/>
-      <w:proofErr w:type="gramEnd"/>
       <w:r>
         <w:t>(0) == null.</w:t>
       </w:r>
@@ -4515,24 +4101,12 @@
       <w:r>
         <w:t>InitParallelRegularDictionary()</w:t>
       </w:r>
-      <w:hyperlink r:id="rId21" w:anchor="L96-L166" w:history="1">
+      <w:hyperlink r:id="rId22" w:anchor="L96-L166" w:history="1">
         <w:r>
           <w:rPr>
             <w:rStyle w:val="Hyperlink"/>
           </w:rPr>
-          <w:t>[GitH</w:t>
-        </w:r>
-        <w:r>
-          <w:rPr>
-            <w:rStyle w:val="Hyperlink"/>
-          </w:rPr>
-          <w:t>u</w:t>
-        </w:r>
-        <w:r>
-          <w:rPr>
-            <w:rStyle w:val="Hyperlink"/>
-          </w:rPr>
-          <w:t>b</w:t>
+          <w:t>[GitHub</w:t>
         </w:r>
         <w:r>
           <w:rPr>
@@ -4571,17 +4145,12 @@
         <w:t xml:space="preserve">The second method, </w:t>
       </w:r>
       <w:proofErr w:type="spellStart"/>
-      <w:proofErr w:type="gramStart"/>
       <w:r>
         <w:t>InitParallelRegularDictionary</w:t>
       </w:r>
       <w:proofErr w:type="spellEnd"/>
       <w:r>
-        <w:t>(</w:t>
-      </w:r>
-      <w:proofErr w:type="gramEnd"/>
-      <w:r>
-        <w:t xml:space="preserve">), introduces parallel execution using </w:t>
+        <w:t xml:space="preserve">(), introduces parallel execution using </w:t>
       </w:r>
       <w:proofErr w:type="spellStart"/>
       <w:r>
@@ -4637,10 +4206,7 @@
         <w:t>Thread Safety with Locks</w:t>
       </w:r>
       <w:r>
-        <w:t xml:space="preserve">: Since multiple threads are accessing and modifying shared resources </w:t>
-      </w:r>
-      <w:r>
-        <w:t>(the matrix and cells array), locks are used to ensure thread safety. This prevents race conditions where multiple threads might try to update the same resource simultaneously.</w:t>
+        <w:t>: Since multiple threads are accessing and modifying shared resources (the matrix and cells array), locks are used to ensure thread safety. This prevents race conditions where multiple threads might try to update the same resource simultaneously.</w:t>
       </w:r>
     </w:p>
     <w:p>
@@ -4650,24 +4216,12 @@
       <w:r>
         <w:t>InitParallelWithConcurrentDictionary()</w:t>
       </w:r>
-      <w:hyperlink r:id="rId22" w:anchor="L180-L238" w:history="1">
+      <w:hyperlink r:id="rId23" w:anchor="L180-L238" w:history="1">
         <w:r>
           <w:rPr>
             <w:rStyle w:val="Hyperlink"/>
           </w:rPr>
-          <w:t>[Git</w:t>
-        </w:r>
-        <w:r>
-          <w:rPr>
-            <w:rStyle w:val="Hyperlink"/>
-          </w:rPr>
-          <w:t>H</w:t>
-        </w:r>
-        <w:r>
-          <w:rPr>
-            <w:rStyle w:val="Hyperlink"/>
-          </w:rPr>
-          <w:t>ub</w:t>
+          <w:t>[GitHub</w:t>
         </w:r>
         <w:r>
           <w:rPr>
@@ -4697,17 +4251,12 @@
         <w:t>The third method, </w:t>
       </w:r>
       <w:proofErr w:type="spellStart"/>
-      <w:proofErr w:type="gramStart"/>
       <w:r>
         <w:t>InitParallelWithConcurrentDictionary</w:t>
       </w:r>
       <w:proofErr w:type="spellEnd"/>
       <w:r>
-        <w:t>(</w:t>
-      </w:r>
-      <w:proofErr w:type="gramEnd"/>
-      <w:r>
-        <w:t>), improves upon the previous approach by using </w:t>
+        <w:t>(), improves upon the previous approach by using </w:t>
       </w:r>
       <w:proofErr w:type="spellStart"/>
       <w:r>
@@ -4803,24 +4352,12 @@
       <w:r>
         <w:t>InitParallelPartitioned()</w:t>
       </w:r>
-      <w:hyperlink r:id="rId23" w:anchor="L250-L334" w:history="1">
+      <w:hyperlink r:id="rId24" w:anchor="L250-L334" w:history="1">
         <w:r>
           <w:rPr>
             <w:rStyle w:val="Hyperlink"/>
           </w:rPr>
-          <w:t>[GitH</w:t>
-        </w:r>
-        <w:r>
-          <w:rPr>
-            <w:rStyle w:val="Hyperlink"/>
-          </w:rPr>
-          <w:t>u</w:t>
-        </w:r>
-        <w:r>
-          <w:rPr>
-            <w:rStyle w:val="Hyperlink"/>
-          </w:rPr>
-          <w:t>b</w:t>
+          <w:t>[GitHub</w:t>
         </w:r>
         <w:r>
           <w:rPr>
@@ -4846,21 +4383,19 @@
     </w:p>
     <w:p/>
     <w:p>
+      <w:pPr>
+        <w:jc w:val="both"/>
+      </w:pPr>
       <w:r>
         <w:t>The fourth method, </w:t>
       </w:r>
       <w:proofErr w:type="spellStart"/>
-      <w:proofErr w:type="gramStart"/>
       <w:r>
         <w:t>InitParallelPartitioned</w:t>
       </w:r>
       <w:proofErr w:type="spellEnd"/>
       <w:r>
-        <w:t>(</w:t>
-      </w:r>
-      <w:proofErr w:type="gramEnd"/>
-      <w:r>
-        <w:t xml:space="preserve">), further optimizes parallel execution by partitioning the workload into smaller chunks. </w:t>
+        <w:t xml:space="preserve">(), further optimizes parallel execution by partitioning the workload into smaller chunks. </w:t>
       </w:r>
     </w:p>
     <w:p>
@@ -4869,6 +4404,7 @@
           <w:ilvl w:val="0"/>
           <w:numId w:val="16"/>
         </w:numPr>
+        <w:jc w:val="both"/>
       </w:pPr>
       <w:r>
         <w:rPr>
@@ -4889,7 +4425,11 @@
         <w:t> method is used to divide the workload into smaller partitions. This reduces overhead and improves performance for large datasets.</w:t>
       </w:r>
     </w:p>
-    <w:p/>
+    <w:p>
+      <w:pPr>
+        <w:jc w:val="both"/>
+      </w:pPr>
+    </w:p>
     <w:p>
       <w:pPr>
         <w:pStyle w:val="ListParagraph"/>
@@ -5036,7 +4576,7 @@
         </w:rPr>
         <w:t xml:space="preserve"> </w:t>
       </w:r>
-      <w:hyperlink r:id="rId24" w:history="1">
+      <w:hyperlink r:id="rId25" w:history="1">
         <w:r>
           <w:rPr>
             <w:rStyle w:val="Hyperlink"/>
@@ -5048,28 +4588,7 @@
             <w:rStyle w:val="Hyperlink"/>
             <w:bCs/>
           </w:rPr>
-          <w:t>Performance No</w:t>
-        </w:r>
-        <w:r>
-          <w:rPr>
-            <w:rStyle w:val="Hyperlink"/>
-            <w:bCs/>
-          </w:rPr>
-          <w:t>t</w:t>
-        </w:r>
-        <w:r>
-          <w:rPr>
-            <w:rStyle w:val="Hyperlink"/>
-            <w:bCs/>
-          </w:rPr>
-          <w:t>ebook</w:t>
-        </w:r>
-        <w:r>
-          <w:rPr>
-            <w:rStyle w:val="Hyperlink"/>
-            <w:bCs/>
-          </w:rPr>
-          <w:t xml:space="preserve"> </w:t>
+          <w:t xml:space="preserve">Performance Notebook </w:t>
         </w:r>
         <w:r>
           <w:rPr>
@@ -5136,78 +4655,21 @@
         <w:rPr>
           <w:color w:val="0D0D0D" w:themeColor="text1" w:themeTint="F2"/>
         </w:rPr>
-        <w:t>Single_Threaded_Optimized_</w:t>
-      </w:r>
-      <w:proofErr w:type="gramStart"/>
+        <w:t>Single_Threaded_Optimized_Init(), InitParallelRegularDictionary(), InitParallelWithConcurrentDictionary(), and </w:t>
+      </w:r>
+      <w:proofErr w:type="spellStart"/>
       <w:r>
         <w:rPr>
           <w:color w:val="0D0D0D" w:themeColor="text1" w:themeTint="F2"/>
         </w:rPr>
-        <w:t>Init(</w:t>
-      </w:r>
-      <w:proofErr w:type="gramEnd"/>
+        <w:t>InitParallelPartitioned</w:t>
+      </w:r>
+      <w:proofErr w:type="spellEnd"/>
       <w:r>
         <w:rPr>
           <w:color w:val="0D0D0D" w:themeColor="text1" w:themeTint="F2"/>
         </w:rPr>
-        <w:t>), </w:t>
-      </w:r>
-      <w:proofErr w:type="gramStart"/>
-      <w:r>
-        <w:rPr>
-          <w:color w:val="0D0D0D" w:themeColor="text1" w:themeTint="F2"/>
-        </w:rPr>
-        <w:t>InitParallelRegularDictionary(</w:t>
-      </w:r>
-      <w:proofErr w:type="gramEnd"/>
-      <w:r>
-        <w:rPr>
-          <w:color w:val="0D0D0D" w:themeColor="text1" w:themeTint="F2"/>
-        </w:rPr>
-        <w:t>), </w:t>
-      </w:r>
-      <w:proofErr w:type="gramStart"/>
-      <w:r>
-        <w:rPr>
-          <w:color w:val="0D0D0D" w:themeColor="text1" w:themeTint="F2"/>
-        </w:rPr>
-        <w:t>InitParallelWithConcurrentDictionary(</w:t>
-      </w:r>
-      <w:proofErr w:type="gramEnd"/>
-      <w:r>
-        <w:rPr>
-          <w:color w:val="0D0D0D" w:themeColor="text1" w:themeTint="F2"/>
-        </w:rPr>
-        <w:t>), and </w:t>
-      </w:r>
-      <w:proofErr w:type="spellStart"/>
-      <w:proofErr w:type="gramStart"/>
-      <w:r>
-        <w:rPr>
-          <w:color w:val="0D0D0D" w:themeColor="text1" w:themeTint="F2"/>
-        </w:rPr>
-        <w:t>InitParallelPartitioned</w:t>
-      </w:r>
-      <w:proofErr w:type="spellEnd"/>
-      <w:r>
-        <w:rPr>
-          <w:color w:val="0D0D0D" w:themeColor="text1" w:themeTint="F2"/>
-        </w:rPr>
-        <w:t>(</w:t>
-      </w:r>
-      <w:proofErr w:type="gramEnd"/>
-      <w:r>
-        <w:rPr>
-          <w:color w:val="0D0D0D" w:themeColor="text1" w:themeTint="F2"/>
-        </w:rPr>
-        <w:t xml:space="preserve">). The performance metrics are </w:t>
-      </w:r>
-      <w:r>
-        <w:rPr>
-          <w:color w:val="0D0D0D" w:themeColor="text1" w:themeTint="F2"/>
-        </w:rPr>
-        <w:lastRenderedPageBreak/>
-        <w:t>visualized using bar charts and scatter plots to provide a clear understanding of the improvements.</w:t>
+        <w:t>(). The performance metrics are visualized using bar charts and scatter plots to provide a clear understanding of the improvements.</w:t>
       </w:r>
     </w:p>
     <w:p>
@@ -5248,7 +4710,15 @@
           <w:color w:val="0D0D0D"/>
           <w:shd w:val="clear" w:color="auto" w:fill="FFFFFF"/>
         </w:rPr>
-        <w:t xml:space="preserve">After implementing the four methods, we conducted a thorough performance analysis to evaluate their effectiveness. Key metrics such as </w:t>
+        <w:t xml:space="preserve">After implementing the four methods, we conducted a thorough performance analysis to evaluate their </w:t>
+      </w:r>
+      <w:r>
+        <w:rPr>
+          <w:color w:val="0D0D0D"/>
+          <w:shd w:val="clear" w:color="auto" w:fill="FFFFFF"/>
+        </w:rPr>
+        <w:lastRenderedPageBreak/>
+        <w:t xml:space="preserve">effectiveness. Key metrics such as </w:t>
       </w:r>
       <w:r>
         <w:rPr>
@@ -5382,7 +4852,6 @@
         </w:rPr>
       </w:pPr>
       <w:proofErr w:type="spellStart"/>
-      <w:proofErr w:type="gramStart"/>
       <w:r>
         <w:rPr>
           <w:b/>
@@ -5400,17 +4869,7 @@
           <w:color w:val="0D0D0D"/>
           <w:shd w:val="clear" w:color="auto" w:fill="FFFFFF"/>
         </w:rPr>
-        <w:t>(</w:t>
-      </w:r>
-      <w:proofErr w:type="gramEnd"/>
-      <w:r>
-        <w:rPr>
-          <w:b/>
-          <w:bCs/>
-          <w:color w:val="0D0D0D"/>
-          <w:shd w:val="clear" w:color="auto" w:fill="FFFFFF"/>
-        </w:rPr>
-        <w:t>)</w:t>
+        <w:t>()</w:t>
       </w:r>
       <w:r>
         <w:rPr>
@@ -5775,19 +5234,20 @@
       <w:tblPr>
         <w:tblStyle w:val="TableGrid"/>
         <w:tblW w:w="0" w:type="auto"/>
+        <w:tblLayout w:type="fixed"/>
         <w:tblLook w:val="04A0" w:firstRow="1" w:lastRow="0" w:firstColumn="1" w:lastColumn="0" w:noHBand="0" w:noVBand="1"/>
       </w:tblPr>
       <w:tblGrid>
-        <w:gridCol w:w="1881"/>
-        <w:gridCol w:w="709"/>
+        <w:gridCol w:w="1705"/>
+        <w:gridCol w:w="885"/>
         <w:gridCol w:w="720"/>
-        <w:gridCol w:w="773"/>
-        <w:gridCol w:w="773"/>
+        <w:gridCol w:w="735"/>
+        <w:gridCol w:w="811"/>
       </w:tblGrid>
       <w:tr>
         <w:tc>
           <w:tcPr>
-            <w:tcW w:w="1879" w:type="dxa"/>
+            <w:tcW w:w="1705" w:type="dxa"/>
           </w:tcPr>
           <w:p>
             <w:r>
@@ -5797,7 +5257,7 @@
         </w:tc>
         <w:tc>
           <w:tcPr>
-            <w:tcW w:w="1879" w:type="dxa"/>
+            <w:tcW w:w="885" w:type="dxa"/>
           </w:tcPr>
           <w:p>
             <w:r>
@@ -5807,7 +5267,7 @@
         </w:tc>
         <w:tc>
           <w:tcPr>
-            <w:tcW w:w="1879" w:type="dxa"/>
+            <w:tcW w:w="720" w:type="dxa"/>
           </w:tcPr>
           <w:p>
             <w:r>
@@ -5817,7 +5277,7 @@
         </w:tc>
         <w:tc>
           <w:tcPr>
-            <w:tcW w:w="1879" w:type="dxa"/>
+            <w:tcW w:w="735" w:type="dxa"/>
           </w:tcPr>
           <w:p>
             <w:r>
@@ -5827,7 +5287,7 @@
         </w:tc>
         <w:tc>
           <w:tcPr>
-            <w:tcW w:w="1880" w:type="dxa"/>
+            <w:tcW w:w="811" w:type="dxa"/>
           </w:tcPr>
           <w:p>
             <w:r>
@@ -5839,64 +5299,72 @@
       <w:tr>
         <w:tc>
           <w:tcPr>
-            <w:tcW w:w="1879" w:type="dxa"/>
+            <w:tcW w:w="1705" w:type="dxa"/>
           </w:tcPr>
           <w:p>
             <w:proofErr w:type="spellStart"/>
             <w:r>
-              <w:t>Single_Threaded_Optimized_</w:t>
-            </w:r>
-            <w:proofErr w:type="gramStart"/>
-            <w:r>
-              <w:t>Init</w:t>
+              <w:t>Single_Threaded_Optimized_Init</w:t>
             </w:r>
             <w:proofErr w:type="spellEnd"/>
             <w:r>
-              <w:t>(</w:t>
-            </w:r>
-            <w:proofErr w:type="gramEnd"/>
-            <w:r>
-              <w:t>)</w:t>
+              <w:t>()</w:t>
             </w:r>
           </w:p>
           <w:p/>
         </w:tc>
         <w:tc>
           <w:tcPr>
-            <w:tcW w:w="1879" w:type="dxa"/>
+            <w:tcW w:w="885" w:type="dxa"/>
           </w:tcPr>
           <w:p>
             <w:r>
+              <w:rPr>
+                <w:sz w:val="16"/>
+                <w:szCs w:val="16"/>
+              </w:rPr>
               <w:t>3.3529</w:t>
             </w:r>
           </w:p>
         </w:tc>
         <w:tc>
           <w:tcPr>
-            <w:tcW w:w="1879" w:type="dxa"/>
+            <w:tcW w:w="720" w:type="dxa"/>
           </w:tcPr>
           <w:p>
             <w:r>
+              <w:rPr>
+                <w:sz w:val="16"/>
+                <w:szCs w:val="16"/>
+              </w:rPr>
               <w:t>4.8810</w:t>
             </w:r>
           </w:p>
         </w:tc>
         <w:tc>
           <w:tcPr>
-            <w:tcW w:w="1879" w:type="dxa"/>
+            <w:tcW w:w="735" w:type="dxa"/>
           </w:tcPr>
           <w:p>
             <w:r>
+              <w:rPr>
+                <w:sz w:val="16"/>
+                <w:szCs w:val="16"/>
+              </w:rPr>
               <w:t>10.3280</w:t>
             </w:r>
           </w:p>
         </w:tc>
         <w:tc>
           <w:tcPr>
-            <w:tcW w:w="1880" w:type="dxa"/>
+            <w:tcW w:w="811" w:type="dxa"/>
           </w:tcPr>
           <w:p>
             <w:r>
+              <w:rPr>
+                <w:sz w:val="14"/>
+                <w:szCs w:val="14"/>
+              </w:rPr>
               <w:t>106.6683</w:t>
             </w:r>
           </w:p>
@@ -5905,61 +5373,78 @@
       <w:tr>
         <w:tc>
           <w:tcPr>
-            <w:tcW w:w="1879" w:type="dxa"/>
+            <w:tcW w:w="1705" w:type="dxa"/>
           </w:tcPr>
           <w:p>
             <w:proofErr w:type="spellStart"/>
-            <w:proofErr w:type="gramStart"/>
             <w:r>
               <w:t>InitParallelRegularDictionary</w:t>
             </w:r>
             <w:proofErr w:type="spellEnd"/>
             <w:r>
-              <w:t>(</w:t>
-            </w:r>
-            <w:proofErr w:type="gramEnd"/>
-            <w:r>
-              <w:t>)</w:t>
+              <w:t>()</w:t>
             </w:r>
           </w:p>
           <w:p/>
         </w:tc>
         <w:tc>
           <w:tcPr>
-            <w:tcW w:w="1879" w:type="dxa"/>
+            <w:tcW w:w="885" w:type="dxa"/>
           </w:tcPr>
           <w:p>
             <w:r>
+              <w:rPr>
+                <w:sz w:val="16"/>
+                <w:szCs w:val="16"/>
+              </w:rPr>
               <w:t>3.5418</w:t>
             </w:r>
           </w:p>
         </w:tc>
         <w:tc>
           <w:tcPr>
-            <w:tcW w:w="1879" w:type="dxa"/>
+            <w:tcW w:w="720" w:type="dxa"/>
           </w:tcPr>
           <w:p>
             <w:r>
+              <w:rPr>
+                <w:sz w:val="16"/>
+                <w:szCs w:val="16"/>
+              </w:rPr>
               <w:t>4.9795</w:t>
             </w:r>
           </w:p>
         </w:tc>
         <w:tc>
           <w:tcPr>
-            <w:tcW w:w="1879" w:type="dxa"/>
+            <w:tcW w:w="735" w:type="dxa"/>
           </w:tcPr>
           <w:p>
+            <w:pPr>
+              <w:rPr>
+                <w:sz w:val="16"/>
+                <w:szCs w:val="16"/>
+              </w:rPr>
+            </w:pPr>
             <w:r>
+              <w:rPr>
+                <w:sz w:val="16"/>
+                <w:szCs w:val="16"/>
+              </w:rPr>
               <w:t>9.9502</w:t>
             </w:r>
           </w:p>
         </w:tc>
         <w:tc>
           <w:tcPr>
-            <w:tcW w:w="1880" w:type="dxa"/>
+            <w:tcW w:w="811" w:type="dxa"/>
           </w:tcPr>
           <w:p>
             <w:r>
+              <w:rPr>
+                <w:sz w:val="16"/>
+                <w:szCs w:val="16"/>
+              </w:rPr>
               <w:t>99.0066</w:t>
             </w:r>
           </w:p>
@@ -5968,7 +5453,7 @@
       <w:tr>
         <w:tc>
           <w:tcPr>
-            <w:tcW w:w="1879" w:type="dxa"/>
+            <w:tcW w:w="1705" w:type="dxa"/>
           </w:tcPr>
           <w:p>
             <w:pPr>
@@ -5978,7 +5463,6 @@
               </w:rPr>
             </w:pPr>
             <w:proofErr w:type="spellStart"/>
-            <w:proofErr w:type="gramStart"/>
             <w:r>
               <w:rPr>
                 <w:b/>
@@ -5992,22 +5476,14 @@
                 <w:b/>
                 <w:bCs/>
               </w:rPr>
-              <w:t>(</w:t>
-            </w:r>
-            <w:proofErr w:type="gramEnd"/>
-            <w:r>
-              <w:rPr>
-                <w:b/>
-                <w:bCs/>
-              </w:rPr>
-              <w:t>)</w:t>
+              <w:t>()</w:t>
             </w:r>
           </w:p>
           <w:p/>
         </w:tc>
         <w:tc>
           <w:tcPr>
-            <w:tcW w:w="1879" w:type="dxa"/>
+            <w:tcW w:w="885" w:type="dxa"/>
           </w:tcPr>
           <w:p>
             <w:pPr>
@@ -6020,6 +5496,8 @@
               <w:rPr>
                 <w:b/>
                 <w:bCs/>
+                <w:sz w:val="16"/>
+                <w:szCs w:val="16"/>
               </w:rPr>
               <w:t>2.7113</w:t>
             </w:r>
@@ -6027,7 +5505,7 @@
         </w:tc>
         <w:tc>
           <w:tcPr>
-            <w:tcW w:w="1879" w:type="dxa"/>
+            <w:tcW w:w="720" w:type="dxa"/>
           </w:tcPr>
           <w:p>
             <w:pPr>
@@ -6040,6 +5518,8 @@
               <w:rPr>
                 <w:b/>
                 <w:bCs/>
+                <w:sz w:val="16"/>
+                <w:szCs w:val="16"/>
               </w:rPr>
               <w:t>5.8884</w:t>
             </w:r>
@@ -6047,7 +5527,7 @@
         </w:tc>
         <w:tc>
           <w:tcPr>
-            <w:tcW w:w="1879" w:type="dxa"/>
+            <w:tcW w:w="735" w:type="dxa"/>
           </w:tcPr>
           <w:p>
             <w:pPr>
@@ -6060,6 +5540,8 @@
               <w:rPr>
                 <w:b/>
                 <w:bCs/>
+                <w:sz w:val="16"/>
+                <w:szCs w:val="16"/>
               </w:rPr>
               <w:t>7.5676</w:t>
             </w:r>
@@ -6067,7 +5549,7 @@
         </w:tc>
         <w:tc>
           <w:tcPr>
-            <w:tcW w:w="1880" w:type="dxa"/>
+            <w:tcW w:w="811" w:type="dxa"/>
           </w:tcPr>
           <w:p>
             <w:pPr>
@@ -6080,6 +5562,8 @@
               <w:rPr>
                 <w:b/>
                 <w:bCs/>
+                <w:sz w:val="16"/>
+                <w:szCs w:val="16"/>
               </w:rPr>
               <w:t>57.2691</w:t>
             </w:r>
@@ -6089,61 +5573,72 @@
       <w:tr>
         <w:tc>
           <w:tcPr>
-            <w:tcW w:w="1879" w:type="dxa"/>
+            <w:tcW w:w="1705" w:type="dxa"/>
           </w:tcPr>
           <w:p>
             <w:proofErr w:type="spellStart"/>
-            <w:proofErr w:type="gramStart"/>
             <w:r>
               <w:t>InitParallelPartitioned</w:t>
             </w:r>
             <w:proofErr w:type="spellEnd"/>
             <w:r>
-              <w:t>(</w:t>
-            </w:r>
-            <w:proofErr w:type="gramEnd"/>
-            <w:r>
-              <w:t>)</w:t>
+              <w:t>()</w:t>
             </w:r>
           </w:p>
           <w:p/>
         </w:tc>
         <w:tc>
           <w:tcPr>
-            <w:tcW w:w="1879" w:type="dxa"/>
+            <w:tcW w:w="885" w:type="dxa"/>
           </w:tcPr>
           <w:p>
             <w:r>
+              <w:rPr>
+                <w:sz w:val="16"/>
+                <w:szCs w:val="16"/>
+              </w:rPr>
               <w:t>3.4371</w:t>
             </w:r>
           </w:p>
         </w:tc>
         <w:tc>
           <w:tcPr>
-            <w:tcW w:w="1879" w:type="dxa"/>
+            <w:tcW w:w="720" w:type="dxa"/>
           </w:tcPr>
           <w:p>
             <w:r>
+              <w:rPr>
+                <w:sz w:val="16"/>
+                <w:szCs w:val="16"/>
+              </w:rPr>
               <w:t>5.8980</w:t>
             </w:r>
           </w:p>
         </w:tc>
         <w:tc>
           <w:tcPr>
-            <w:tcW w:w="1879" w:type="dxa"/>
+            <w:tcW w:w="735" w:type="dxa"/>
           </w:tcPr>
           <w:p>
             <w:r>
+              <w:rPr>
+                <w:sz w:val="16"/>
+                <w:szCs w:val="16"/>
+              </w:rPr>
               <w:t>8.048</w:t>
             </w:r>
           </w:p>
         </w:tc>
         <w:tc>
           <w:tcPr>
-            <w:tcW w:w="1880" w:type="dxa"/>
+            <w:tcW w:w="811" w:type="dxa"/>
           </w:tcPr>
           <w:p>
             <w:r>
+              <w:rPr>
+                <w:sz w:val="16"/>
+                <w:szCs w:val="16"/>
+              </w:rPr>
               <w:t>64.7798</w:t>
             </w:r>
           </w:p>
@@ -6252,6 +5747,9 @@
     </w:p>
     <w:p/>
     <w:p>
+      <w:pPr>
+        <w:jc w:val="both"/>
+      </w:pPr>
       <w:r>
         <w:t>To further validate our parallelization approaches, we conducted detailed performance measurements comparing four initialization methods:</w:t>
       </w:r>
@@ -6265,19 +5763,11 @@
       </w:pPr>
       <w:proofErr w:type="spellStart"/>
       <w:r>
-        <w:t>Single_Threaded_Optimized_</w:t>
-      </w:r>
-      <w:proofErr w:type="gramStart"/>
-      <w:r>
-        <w:t>Init</w:t>
+        <w:t>Single_Threaded_Optimized_Init</w:t>
       </w:r>
       <w:proofErr w:type="spellEnd"/>
       <w:r>
-        <w:t>(</w:t>
-      </w:r>
-      <w:proofErr w:type="gramEnd"/>
-      <w:r>
-        <w:t>) - Our optimized baseline</w:t>
+        <w:t>() - Our optimized baseline</w:t>
       </w:r>
     </w:p>
     <w:p>
@@ -6288,17 +5778,12 @@
         </w:numPr>
       </w:pPr>
       <w:proofErr w:type="spellStart"/>
-      <w:proofErr w:type="gramStart"/>
       <w:r>
         <w:t>InitParallelRegularDictionary</w:t>
       </w:r>
       <w:proofErr w:type="spellEnd"/>
       <w:r>
-        <w:t>(</w:t>
-      </w:r>
-      <w:proofErr w:type="gramEnd"/>
-      <w:r>
-        <w:t>) - Parallel with locks</w:t>
+        <w:t>() - Parallel with locks</w:t>
       </w:r>
     </w:p>
     <w:p>
@@ -6309,17 +5794,12 @@
         </w:numPr>
       </w:pPr>
       <w:proofErr w:type="spellStart"/>
-      <w:proofErr w:type="gramStart"/>
       <w:r>
         <w:t>InitParallelWithConcurrentDictionary</w:t>
       </w:r>
       <w:proofErr w:type="spellEnd"/>
       <w:r>
-        <w:t>(</w:t>
-      </w:r>
-      <w:proofErr w:type="gramEnd"/>
-      <w:r>
-        <w:t xml:space="preserve">) - Parallel with </w:t>
+        <w:t xml:space="preserve">() - Parallel with </w:t>
       </w:r>
       <w:proofErr w:type="spellStart"/>
       <w:r>
@@ -6335,17 +5815,12 @@
         </w:numPr>
       </w:pPr>
       <w:proofErr w:type="spellStart"/>
-      <w:proofErr w:type="gramStart"/>
       <w:r>
         <w:t>InitParallelPartitioned</w:t>
       </w:r>
       <w:proofErr w:type="spellEnd"/>
       <w:r>
-        <w:t>(</w:t>
-      </w:r>
-      <w:proofErr w:type="gramEnd"/>
-      <w:r>
-        <w:t>) - Parallel with partitioned workload</w:t>
+        <w:t>() - Parallel with partitioned workload</w:t>
       </w:r>
     </w:p>
     <w:p>
@@ -6453,23 +5928,7 @@
                             </w:r>
                             <w:proofErr w:type="spellEnd"/>
                             <w:r>
-                              <w:t xml:space="preserve"> = new </w:t>
-                            </w:r>
-                            <w:proofErr w:type="gramStart"/>
-                            <w:r>
-                              <w:t>int[</w:t>
-                            </w:r>
-                            <w:proofErr w:type="gramEnd"/>
-                            <w:r>
-                              <w:t xml:space="preserve">] </w:t>
-                            </w:r>
-                            <w:proofErr w:type="gramStart"/>
-                            <w:r>
-                              <w:t>{ 100</w:t>
-                            </w:r>
-                            <w:proofErr w:type="gramEnd"/>
-                            <w:r>
-                              <w:t xml:space="preserve"> }, // Example dimensions</w:t>
+                              <w:t xml:space="preserve"> = new int[] { 100 }, // Example dimensions</w:t>
                             </w:r>
                           </w:p>
                           <w:p>
@@ -6549,8 +6008,29 @@
                     </w:p>
                     <w:p>
                       <w:r>
-                        <w:t xml:space="preserve"> HtmConfig htmConfig = new HtmConfig</w:t>
+                        <w:t xml:space="preserve"> </w:t>
                       </w:r>
+                      <w:proofErr w:type="spellStart"/>
+                      <w:r>
+                        <w:t>HtmConfig</w:t>
+                      </w:r>
+                      <w:proofErr w:type="spellEnd"/>
+                      <w:r>
+                        <w:t xml:space="preserve"> </w:t>
+                      </w:r>
+                      <w:proofErr w:type="spellStart"/>
+                      <w:r>
+                        <w:t>htmConfig</w:t>
+                      </w:r>
+                      <w:proofErr w:type="spellEnd"/>
+                      <w:r>
+                        <w:t xml:space="preserve"> = new </w:t>
+                      </w:r>
+                      <w:proofErr w:type="spellStart"/>
+                      <w:r>
+                        <w:t>HtmConfig</w:t>
+                      </w:r>
+                      <w:proofErr w:type="spellEnd"/>
                     </w:p>
                     <w:p>
                       <w:r>
@@ -6559,22 +6039,54 @@
                     </w:p>
                     <w:p>
                       <w:r>
-                        <w:t xml:space="preserve">     ColumnDimensions = new int[] { 100 }, // Example dimensions</w:t>
+                        <w:t xml:space="preserve">     </w:t>
+                      </w:r>
+                      <w:proofErr w:type="spellStart"/>
+                      <w:r>
+                        <w:t>ColumnDimensions</w:t>
+                      </w:r>
+                      <w:proofErr w:type="spellEnd"/>
+                      <w:r>
+                        <w:t xml:space="preserve"> = new int[] { 100 }, // Example dimensions</w:t>
                       </w:r>
                     </w:p>
                     <w:p>
                       <w:r>
-                        <w:t xml:space="preserve">     CellsPerColumn = 32,</w:t>
+                        <w:t xml:space="preserve">     </w:t>
+                      </w:r>
+                      <w:proofErr w:type="spellStart"/>
+                      <w:r>
+                        <w:t>CellsPerColumn</w:t>
+                      </w:r>
+                      <w:proofErr w:type="spellEnd"/>
+                      <w:r>
+                        <w:t xml:space="preserve"> = 32,</w:t>
                       </w:r>
                     </w:p>
                     <w:p>
                       <w:r>
-                        <w:t xml:space="preserve">     SynPermConnected = 0.1,</w:t>
+                        <w:t xml:space="preserve">     </w:t>
+                      </w:r>
+                      <w:proofErr w:type="spellStart"/>
+                      <w:r>
+                        <w:t>SynPermConnected</w:t>
+                      </w:r>
+                      <w:proofErr w:type="spellEnd"/>
+                      <w:r>
+                        <w:t xml:space="preserve"> = 0.1,</w:t>
                       </w:r>
                     </w:p>
                     <w:p>
                       <w:r>
-                        <w:t xml:space="preserve">     NumInputs = 100</w:t>
+                        <w:t xml:space="preserve">     </w:t>
+                      </w:r>
+                      <w:proofErr w:type="spellStart"/>
+                      <w:r>
+                        <w:t>NumInputs</w:t>
+                      </w:r>
+                      <w:proofErr w:type="spellEnd"/>
+                      <w:r>
+                        <w:t xml:space="preserve"> = 100</w:t>
                       </w:r>
                     </w:p>
                     <w:p>
@@ -6665,7 +6177,7 @@
                     <pic:cNvPicPr/>
                   </pic:nvPicPr>
                   <pic:blipFill>
-                    <a:blip r:embed="rId25"/>
+                    <a:blip r:embed="rId26"/>
                     <a:stretch>
                       <a:fillRect/>
                     </a:stretch>
@@ -6848,19 +6360,20 @@
     <w:tbl>
       <w:tblPr>
         <w:tblStyle w:val="TableGrid"/>
-        <w:tblW w:w="0" w:type="auto"/>
+        <w:tblW w:w="4855" w:type="dxa"/>
+        <w:tblLayout w:type="fixed"/>
         <w:tblLook w:val="04A0" w:firstRow="1" w:lastRow="0" w:firstColumn="1" w:lastColumn="0" w:noHBand="0" w:noVBand="1"/>
       </w:tblPr>
       <w:tblGrid>
-        <w:gridCol w:w="2291"/>
-        <w:gridCol w:w="884"/>
-        <w:gridCol w:w="884"/>
-        <w:gridCol w:w="797"/>
+        <w:gridCol w:w="2155"/>
+        <w:gridCol w:w="900"/>
+        <w:gridCol w:w="810"/>
+        <w:gridCol w:w="990"/>
       </w:tblGrid>
       <w:tr>
         <w:tc>
           <w:tcPr>
-            <w:tcW w:w="3196" w:type="dxa"/>
+            <w:tcW w:w="2155" w:type="dxa"/>
           </w:tcPr>
           <w:p>
             <w:r>
@@ -6870,40 +6383,30 @@
         </w:tc>
         <w:tc>
           <w:tcPr>
-            <w:tcW w:w="1558" w:type="dxa"/>
+            <w:tcW w:w="900" w:type="dxa"/>
           </w:tcPr>
           <w:p>
             <w:r>
-              <w:t xml:space="preserve">Max Initialization </w:t>
-            </w:r>
-            <w:r>
-              <w:lastRenderedPageBreak/>
-              <w:t>Time (s)</w:t>
+              <w:t>Max Initialization Time (s)</w:t>
             </w:r>
           </w:p>
         </w:tc>
         <w:tc>
           <w:tcPr>
-            <w:tcW w:w="1558" w:type="dxa"/>
+            <w:tcW w:w="810" w:type="dxa"/>
           </w:tcPr>
           <w:p>
             <w:r>
-              <w:lastRenderedPageBreak/>
-              <w:t xml:space="preserve">Min Initialization </w:t>
-            </w:r>
-            <w:r>
-              <w:lastRenderedPageBreak/>
-              <w:t>Time (s)</w:t>
+              <w:t>Min Initialization Time (s)</w:t>
             </w:r>
           </w:p>
         </w:tc>
         <w:tc>
           <w:tcPr>
-            <w:tcW w:w="1478" w:type="dxa"/>
+            <w:tcW w:w="990" w:type="dxa"/>
           </w:tcPr>
           <w:p>
             <w:r>
-              <w:lastRenderedPageBreak/>
               <w:t>Ratio (Max/Min)</w:t>
             </w:r>
           </w:p>
@@ -6912,30 +6415,22 @@
       <w:tr>
         <w:tc>
           <w:tcPr>
-            <w:tcW w:w="3196" w:type="dxa"/>
+            <w:tcW w:w="2155" w:type="dxa"/>
           </w:tcPr>
           <w:p>
             <w:proofErr w:type="spellStart"/>
             <w:r>
-              <w:t>Single_Threaded_Optimized_</w:t>
-            </w:r>
-            <w:proofErr w:type="gramStart"/>
-            <w:r>
-              <w:t>Init</w:t>
+              <w:t>Single_Threaded_Optimized_Init</w:t>
             </w:r>
             <w:proofErr w:type="spellEnd"/>
             <w:r>
-              <w:t>(</w:t>
-            </w:r>
-            <w:proofErr w:type="gramEnd"/>
-            <w:r>
-              <w:t>)</w:t>
+              <w:t>()</w:t>
             </w:r>
           </w:p>
         </w:tc>
         <w:tc>
           <w:tcPr>
-            <w:tcW w:w="1558" w:type="dxa"/>
+            <w:tcW w:w="900" w:type="dxa"/>
           </w:tcPr>
           <w:p>
             <w:r>
@@ -6945,7 +6440,7 @@
         </w:tc>
         <w:tc>
           <w:tcPr>
-            <w:tcW w:w="1558" w:type="dxa"/>
+            <w:tcW w:w="810" w:type="dxa"/>
           </w:tcPr>
           <w:p>
             <w:r>
@@ -6955,10 +6450,14 @@
         </w:tc>
         <w:tc>
           <w:tcPr>
-            <w:tcW w:w="1478" w:type="dxa"/>
+            <w:tcW w:w="990" w:type="dxa"/>
           </w:tcPr>
           <w:p>
             <w:r>
+              <w:rPr>
+                <w:sz w:val="18"/>
+                <w:szCs w:val="18"/>
+              </w:rPr>
               <w:t>1821.9328</w:t>
             </w:r>
           </w:p>
@@ -6967,27 +6466,22 @@
       <w:tr>
         <w:tc>
           <w:tcPr>
-            <w:tcW w:w="3196" w:type="dxa"/>
+            <w:tcW w:w="2155" w:type="dxa"/>
           </w:tcPr>
           <w:p>
             <w:proofErr w:type="spellStart"/>
-            <w:proofErr w:type="gramStart"/>
             <w:r>
               <w:t>InitParallelRegularDictionary</w:t>
             </w:r>
             <w:proofErr w:type="spellEnd"/>
             <w:r>
-              <w:t>(</w:t>
-            </w:r>
-            <w:proofErr w:type="gramEnd"/>
-            <w:r>
-              <w:t>)</w:t>
+              <w:t>()</w:t>
             </w:r>
           </w:p>
         </w:tc>
         <w:tc>
           <w:tcPr>
-            <w:tcW w:w="1558" w:type="dxa"/>
+            <w:tcW w:w="900" w:type="dxa"/>
           </w:tcPr>
           <w:p>
             <w:r>
@@ -6997,7 +6491,7 @@
         </w:tc>
         <w:tc>
           <w:tcPr>
-            <w:tcW w:w="1558" w:type="dxa"/>
+            <w:tcW w:w="810" w:type="dxa"/>
           </w:tcPr>
           <w:p>
             <w:r>
@@ -7007,10 +6501,14 @@
         </w:tc>
         <w:tc>
           <w:tcPr>
-            <w:tcW w:w="1478" w:type="dxa"/>
+            <w:tcW w:w="990" w:type="dxa"/>
           </w:tcPr>
           <w:p>
             <w:r>
+              <w:rPr>
+                <w:sz w:val="18"/>
+                <w:szCs w:val="18"/>
+              </w:rPr>
               <w:t>620.3035</w:t>
             </w:r>
           </w:p>
@@ -7019,27 +6517,23 @@
       <w:tr>
         <w:tc>
           <w:tcPr>
-            <w:tcW w:w="3196" w:type="dxa"/>
+            <w:tcW w:w="2155" w:type="dxa"/>
           </w:tcPr>
           <w:p>
             <w:proofErr w:type="spellStart"/>
-            <w:proofErr w:type="gramStart"/>
             <w:r>
+              <w:lastRenderedPageBreak/>
               <w:t>InitParallelWithConcurrentDictionary</w:t>
             </w:r>
             <w:proofErr w:type="spellEnd"/>
             <w:r>
-              <w:t>(</w:t>
-            </w:r>
-            <w:proofErr w:type="gramEnd"/>
-            <w:r>
-              <w:t>)</w:t>
+              <w:t>()</w:t>
             </w:r>
           </w:p>
         </w:tc>
         <w:tc>
           <w:tcPr>
-            <w:tcW w:w="1558" w:type="dxa"/>
+            <w:tcW w:w="900" w:type="dxa"/>
           </w:tcPr>
           <w:p>
             <w:r>
@@ -7049,7 +6543,7 @@
         </w:tc>
         <w:tc>
           <w:tcPr>
-            <w:tcW w:w="1558" w:type="dxa"/>
+            <w:tcW w:w="810" w:type="dxa"/>
           </w:tcPr>
           <w:p>
             <w:r>
@@ -7059,7 +6553,7 @@
         </w:tc>
         <w:tc>
           <w:tcPr>
-            <w:tcW w:w="1478" w:type="dxa"/>
+            <w:tcW w:w="990" w:type="dxa"/>
           </w:tcPr>
           <w:p>
             <w:pPr>
@@ -7072,6 +6566,8 @@
               <w:rPr>
                 <w:b/>
                 <w:bCs/>
+                <w:sz w:val="18"/>
+                <w:szCs w:val="18"/>
               </w:rPr>
               <w:t>457.4827</w:t>
             </w:r>
@@ -7081,27 +6577,22 @@
       <w:tr>
         <w:tc>
           <w:tcPr>
-            <w:tcW w:w="3196" w:type="dxa"/>
+            <w:tcW w:w="2155" w:type="dxa"/>
           </w:tcPr>
           <w:p>
             <w:proofErr w:type="spellStart"/>
-            <w:proofErr w:type="gramStart"/>
             <w:r>
               <w:t>InitParallelPartitioned</w:t>
             </w:r>
             <w:proofErr w:type="spellEnd"/>
             <w:r>
-              <w:t>(</w:t>
-            </w:r>
-            <w:proofErr w:type="gramEnd"/>
-            <w:r>
-              <w:t>)</w:t>
+              <w:t>()</w:t>
             </w:r>
           </w:p>
         </w:tc>
         <w:tc>
           <w:tcPr>
-            <w:tcW w:w="1558" w:type="dxa"/>
+            <w:tcW w:w="900" w:type="dxa"/>
           </w:tcPr>
           <w:p>
             <w:r>
@@ -7111,7 +6602,7 @@
         </w:tc>
         <w:tc>
           <w:tcPr>
-            <w:tcW w:w="1558" w:type="dxa"/>
+            <w:tcW w:w="810" w:type="dxa"/>
           </w:tcPr>
           <w:p>
             <w:r>
@@ -7121,10 +6612,14 @@
         </w:tc>
         <w:tc>
           <w:tcPr>
-            <w:tcW w:w="1478" w:type="dxa"/>
+            <w:tcW w:w="990" w:type="dxa"/>
           </w:tcPr>
           <w:p>
             <w:r>
+              <w:rPr>
+                <w:sz w:val="18"/>
+                <w:szCs w:val="18"/>
+              </w:rPr>
               <w:t>530.4263</w:t>
             </w:r>
           </w:p>
@@ -7226,7 +6721,6 @@
         <w:t>The </w:t>
       </w:r>
       <w:proofErr w:type="spellStart"/>
-      <w:proofErr w:type="gramStart"/>
       <w:r>
         <w:rPr>
           <w:color w:val="0D0D0D"/>
@@ -7240,15 +6734,7 @@
           <w:color w:val="0D0D0D"/>
           <w:shd w:val="clear" w:color="auto" w:fill="FFFFFF"/>
         </w:rPr>
-        <w:t>(</w:t>
-      </w:r>
-      <w:proofErr w:type="gramEnd"/>
-      <w:r>
-        <w:rPr>
-          <w:color w:val="0D0D0D"/>
-          <w:shd w:val="clear" w:color="auto" w:fill="FFFFFF"/>
-        </w:rPr>
-        <w:t>) method demonstrates the lowest max/min ratio, indicating that it offers the most consistent performance even in worst-case scenarios.</w:t>
+        <w:t>() method demonstrates the lowest max/min ratio, indicating that it offers the most consistent performance even in worst-case scenarios.</w:t>
       </w:r>
     </w:p>
     <w:p>
@@ -7344,7 +6830,6 @@
         </w:rPr>
       </w:pPr>
       <w:proofErr w:type="spellStart"/>
-      <w:proofErr w:type="gramStart"/>
       <w:r>
         <w:rPr>
           <w:color w:val="0D0D0D"/>
@@ -7358,15 +6843,7 @@
           <w:color w:val="0D0D0D"/>
           <w:shd w:val="clear" w:color="auto" w:fill="FFFFFF"/>
         </w:rPr>
-        <w:t>(</w:t>
-      </w:r>
-      <w:proofErr w:type="gramEnd"/>
-      <w:r>
-        <w:rPr>
-          <w:color w:val="0D0D0D"/>
-          <w:shd w:val="clear" w:color="auto" w:fill="FFFFFF"/>
-        </w:rPr>
-        <w:t>) method outperforms the other methods in terms of </w:t>
+        <w:t>() method outperforms the other methods in terms of </w:t>
       </w:r>
       <w:r>
         <w:rPr>
@@ -7479,7 +6956,6 @@
         <w:t>The </w:t>
       </w:r>
       <w:proofErr w:type="spellStart"/>
-      <w:proofErr w:type="gramStart"/>
       <w:r>
         <w:rPr>
           <w:color w:val="0D0D0D"/>
@@ -7493,15 +6969,7 @@
           <w:color w:val="0D0D0D"/>
           <w:shd w:val="clear" w:color="auto" w:fill="FFFFFF"/>
         </w:rPr>
-        <w:t>(</w:t>
-      </w:r>
-      <w:proofErr w:type="gramEnd"/>
-      <w:r>
-        <w:rPr>
-          <w:color w:val="0D0D0D"/>
-          <w:shd w:val="clear" w:color="auto" w:fill="FFFFFF"/>
-        </w:rPr>
-        <w:t>) meth</w:t>
+        <w:t>() meth</w:t>
       </w:r>
       <w:r>
         <w:rPr>
@@ -7729,44 +7197,19 @@
         </w:rPr>
         <w:t xml:space="preserve">compares the initialization and </w:t>
       </w:r>
-      <w:proofErr w:type="gramStart"/>
-      <w:r>
-        <w:rPr>
-          <w:color w:val="0D0D0D"/>
-          <w:shd w:val="clear" w:color="auto" w:fill="FFFFFF"/>
-        </w:rPr>
-        <w:t>computation  time</w:t>
-      </w:r>
-      <w:proofErr w:type="gramEnd"/>
-      <w:r>
-        <w:rPr>
-          <w:color w:val="0D0D0D"/>
-          <w:shd w:val="clear" w:color="auto" w:fill="FFFFFF"/>
-        </w:rPr>
-        <w:t> for </w:t>
-      </w:r>
-      <w:r>
-        <w:rPr>
-          <w:color w:val="0D0D0D"/>
-          <w:shd w:val="clear" w:color="auto" w:fill="FFFFFF"/>
-        </w:rPr>
-        <w:t>the </w:t>
-      </w:r>
-      <w:proofErr w:type="gramStart"/>
-      <w:r>
-        <w:rPr>
-          <w:color w:val="0D0D0D"/>
-          <w:shd w:val="clear" w:color="auto" w:fill="FFFFFF"/>
-        </w:rPr>
-        <w:t>InitParallelWithConcurrentDictionary(</w:t>
-      </w:r>
-      <w:proofErr w:type="gramEnd"/>
-      <w:r>
-        <w:rPr>
-          <w:color w:val="0D0D0D"/>
-          <w:shd w:val="clear" w:color="auto" w:fill="FFFFFF"/>
-        </w:rPr>
-        <w:t>) method across different test cases. The X-axis represents the test cases, and the Y-axis represents the time in seconds. The chart uses blue bars for initialization time and green bars for computation time.</w:t>
+      <w:r>
+        <w:rPr>
+          <w:color w:val="0D0D0D"/>
+          <w:shd w:val="clear" w:color="auto" w:fill="FFFFFF"/>
+        </w:rPr>
+        <w:t>computation  time for </w:t>
+      </w:r>
+      <w:r>
+        <w:rPr>
+          <w:color w:val="0D0D0D"/>
+          <w:shd w:val="clear" w:color="auto" w:fill="FFFFFF"/>
+        </w:rPr>
+        <w:t>the InitParallelWithConcurrentDictionary() method across different test cases. The X-axis represents the test cases, and the Y-axis represents the time in seconds. The chart uses blue bars for initialization time and green bars for computation time.</w:t>
       </w:r>
     </w:p>
     <w:p>
@@ -7792,7 +7235,6 @@
         <w:t>Initialization Time: The parallelized method (</w:t>
       </w:r>
       <w:proofErr w:type="spellStart"/>
-      <w:proofErr w:type="gramStart"/>
       <w:r>
         <w:rPr>
           <w:color w:val="0D0D0D"/>
@@ -7806,15 +7248,7 @@
           <w:color w:val="0D0D0D"/>
           <w:shd w:val="clear" w:color="auto" w:fill="FFFFFF"/>
         </w:rPr>
-        <w:t>(</w:t>
-      </w:r>
-      <w:proofErr w:type="gramEnd"/>
-      <w:r>
-        <w:rPr>
-          <w:color w:val="0D0D0D"/>
-          <w:shd w:val="clear" w:color="auto" w:fill="FFFFFF"/>
-        </w:rPr>
-        <w:t>)) consistently outperforms the single-threaded method, with a significant reduction in initialization time.</w:t>
+        <w:t>()) consistently outperforms the single-threaded method, with a significant reduction in initialization time.</w:t>
       </w:r>
     </w:p>
     <w:p>
@@ -7837,7 +7271,14 @@
           <w:color w:val="0D0D0D"/>
           <w:shd w:val="clear" w:color="auto" w:fill="FFFFFF"/>
         </w:rPr>
-        <w:t>Computation Time: The parallelized method also shows improvements in computation time, although the gains are less pronounced due to the overhead of parallel processing.</w:t>
+        <w:t xml:space="preserve">Computation Time: The parallelized method also shows improvements in computation time, although </w:t>
+      </w:r>
+      <w:r>
+        <w:rPr>
+          <w:color w:val="0D0D0D"/>
+          <w:shd w:val="clear" w:color="auto" w:fill="FFFFFF"/>
+        </w:rPr>
+        <w:t>the gains are less pronounced due to the overhead of parallel processing.</w:t>
       </w:r>
     </w:p>
     <w:p>
@@ -7895,7 +7336,6 @@
         <w:t> performance of the </w:t>
       </w:r>
       <w:proofErr w:type="spellStart"/>
-      <w:proofErr w:type="gramStart"/>
       <w:r>
         <w:rPr>
           <w:b/>
@@ -7913,47 +7353,21 @@
           <w:color w:val="0D0D0D"/>
           <w:shd w:val="clear" w:color="auto" w:fill="FFFFFF"/>
         </w:rPr>
-        <w:t>(</w:t>
-      </w:r>
-      <w:proofErr w:type="gramEnd"/>
-      <w:r>
-        <w:rPr>
-          <w:b/>
-          <w:bCs/>
-          <w:color w:val="0D0D0D"/>
-          <w:shd w:val="clear" w:color="auto" w:fill="FFFFFF"/>
-        </w:rPr>
-        <w:t>)</w:t>
-      </w:r>
-      <w:r>
-        <w:rPr>
-          <w:color w:val="0D0D0D"/>
-          <w:shd w:val="clear" w:color="auto" w:fill="FFFFFF"/>
-        </w:rPr>
-        <w:t xml:space="preserve"> method in relation to traditional </w:t>
-      </w:r>
-      <w:proofErr w:type="gramStart"/>
-      <w:r>
-        <w:rPr>
-          <w:color w:val="0D0D0D"/>
-          <w:shd w:val="clear" w:color="auto" w:fill="FFFFFF"/>
-        </w:rPr>
-        <w:t>methods.</w:t>
-      </w:r>
-      <w:r>
-        <w:rPr>
-          <w:color w:val="0D0D0D"/>
-          <w:shd w:val="clear" w:color="auto" w:fill="FFFFFF"/>
-        </w:rPr>
-        <w:t>[</w:t>
-      </w:r>
-      <w:proofErr w:type="gramEnd"/>
-      <w:r>
-        <w:rPr>
-          <w:color w:val="0D0D0D"/>
-          <w:shd w:val="clear" w:color="auto" w:fill="FFFFFF"/>
-        </w:rPr>
-        <w:t xml:space="preserve">Figure </w:t>
+        <w:t>()</w:t>
+      </w:r>
+      <w:r>
+        <w:rPr>
+          <w:color w:val="0D0D0D"/>
+          <w:shd w:val="clear" w:color="auto" w:fill="FFFFFF"/>
+        </w:rPr>
+        <w:t> method in relation to traditional methods.</w:t>
+      </w:r>
+      <w:r>
+        <w:rPr>
+          <w:color w:val="0D0D0D"/>
+          <w:shd w:val="clear" w:color="auto" w:fill="FFFFFF"/>
+        </w:rPr>
+        <w:t xml:space="preserve">[Figure </w:t>
       </w:r>
       <w:r>
         <w:rPr>
@@ -8042,7 +7456,7 @@
                     </pic:cNvPicPr>
                   </pic:nvPicPr>
                   <pic:blipFill>
-                    <a:blip r:embed="rId26" cstate="print">
+                    <a:blip r:embed="rId27" cstate="print">
                       <a:extLst>
                         <a:ext uri="{28A0092B-C50C-407E-A947-70E740481C1C}">
                           <a14:useLocalDpi xmlns:a14="http://schemas.microsoft.com/office/drawing/2010/main" val="0"/>
@@ -8175,7 +7589,7 @@
                     </pic:cNvPicPr>
                   </pic:nvPicPr>
                   <pic:blipFill>
-                    <a:blip r:embed="rId27" cstate="print">
+                    <a:blip r:embed="rId28" cstate="print">
                       <a:extLst>
                         <a:ext uri="{28A0092B-C50C-407E-A947-70E740481C1C}">
                           <a14:useLocalDpi xmlns:a14="http://schemas.microsoft.com/office/drawing/2010/main" val="0"/>
@@ -8334,7 +7748,6 @@
           <w:color w:val="0D0D0D"/>
           <w:shd w:val="clear" w:color="auto" w:fill="FFFFFF"/>
         </w:rPr>
-        <w:lastRenderedPageBreak/>
         <w:t xml:space="preserve">The </w:t>
       </w:r>
       <w:r>
@@ -8370,33 +7783,16 @@
           <w:color w:val="0D0D0D"/>
           <w:shd w:val="clear" w:color="auto" w:fill="FFFFFF"/>
         </w:rPr>
-        <w:t xml:space="preserve">ation </w:t>
-      </w:r>
-      <w:proofErr w:type="gramStart"/>
-      <w:r>
-        <w:rPr>
-          <w:color w:val="0D0D0D"/>
-          <w:shd w:val="clear" w:color="auto" w:fill="FFFFFF"/>
-        </w:rPr>
-        <w:t xml:space="preserve">of </w:t>
-      </w:r>
-      <w:r>
-        <w:rPr>
-          <w:color w:val="0D0D0D"/>
-          <w:shd w:val="clear" w:color="auto" w:fill="FFFFFF"/>
-        </w:rPr>
-        <w:t xml:space="preserve"> the</w:t>
-      </w:r>
-      <w:proofErr w:type="gramEnd"/>
-      <w:r>
-        <w:rPr>
-          <w:color w:val="0D0D0D"/>
-          <w:shd w:val="clear" w:color="auto" w:fill="FFFFFF"/>
-        </w:rPr>
-        <w:t xml:space="preserve"> relationship between initialization time and computation time for the </w:t>
+        <w:t xml:space="preserve">ation of </w:t>
+      </w:r>
+      <w:r>
+        <w:rPr>
+          <w:color w:val="0D0D0D"/>
+          <w:shd w:val="clear" w:color="auto" w:fill="FFFFFF"/>
+        </w:rPr>
+        <w:t xml:space="preserve"> the relationship between initialization time and computation time for the </w:t>
       </w:r>
       <w:proofErr w:type="spellStart"/>
-      <w:proofErr w:type="gramStart"/>
       <w:r>
         <w:rPr>
           <w:color w:val="0D0D0D"/>
@@ -8410,15 +7806,7 @@
           <w:color w:val="0D0D0D"/>
           <w:shd w:val="clear" w:color="auto" w:fill="FFFFFF"/>
         </w:rPr>
-        <w:t>(</w:t>
-      </w:r>
-      <w:proofErr w:type="gramEnd"/>
-      <w:r>
-        <w:rPr>
-          <w:color w:val="0D0D0D"/>
-          <w:shd w:val="clear" w:color="auto" w:fill="FFFFFF"/>
-        </w:rPr>
-        <w:t>) method. The X-axis represents the test cases, and the Y-axis represents the execution times in seconds. Blue circles represent the standard initialization time, while red crosses represent the parallel initialization time.</w:t>
+        <w:t>() method. The X-axis represents the test cases, and the Y-axis represents the execution times in seconds. Blue circles represent the standard initialization time, while red crosses represent the parallel initialization time.</w:t>
       </w:r>
     </w:p>
     <w:p>
@@ -8441,6 +7829,7 @@
           <w:color w:val="0D0D0D"/>
           <w:shd w:val="clear" w:color="auto" w:fill="FFFFFF"/>
         </w:rPr>
+        <w:lastRenderedPageBreak/>
         <w:t xml:space="preserve">Initialization Time: The scatter plot shows that the </w:t>
       </w:r>
       <w:r>
@@ -8458,7 +7847,6 @@
         <w:t xml:space="preserve"> method (</w:t>
       </w:r>
       <w:proofErr w:type="spellStart"/>
-      <w:proofErr w:type="gramStart"/>
       <w:r>
         <w:rPr>
           <w:color w:val="0D0D0D"/>
@@ -8472,15 +7860,7 @@
           <w:color w:val="0D0D0D"/>
           <w:shd w:val="clear" w:color="auto" w:fill="FFFFFF"/>
         </w:rPr>
-        <w:t>(</w:t>
-      </w:r>
-      <w:proofErr w:type="gramEnd"/>
-      <w:r>
-        <w:rPr>
-          <w:color w:val="0D0D0D"/>
-          <w:shd w:val="clear" w:color="auto" w:fill="FFFFFF"/>
-        </w:rPr>
-        <w:t>)) has a lower initialization time compared to the single-threaded method across all test cases.</w:t>
+        <w:t>()) has a lower initialization time compared to the single-threaded method across all test cases.</w:t>
       </w:r>
     </w:p>
     <w:p>
@@ -8503,30 +7883,14 @@
           <w:color w:val="0D0D0D"/>
           <w:shd w:val="clear" w:color="auto" w:fill="FFFFFF"/>
         </w:rPr>
-        <w:t xml:space="preserve">Computation Time: The scatter plot also highlights the consistency of the parallelized method, with most data points clustered around lower execution </w:t>
-      </w:r>
-      <w:proofErr w:type="gramStart"/>
-      <w:r>
-        <w:rPr>
-          <w:color w:val="0D0D0D"/>
-          <w:shd w:val="clear" w:color="auto" w:fill="FFFFFF"/>
-        </w:rPr>
-        <w:t>times.</w:t>
-      </w:r>
-      <w:r>
-        <w:rPr>
-          <w:color w:val="0D0D0D"/>
-          <w:shd w:val="clear" w:color="auto" w:fill="FFFFFF"/>
-        </w:rPr>
-        <w:t>[</w:t>
-      </w:r>
-      <w:proofErr w:type="gramEnd"/>
-      <w:r>
-        <w:rPr>
-          <w:color w:val="0D0D0D"/>
-          <w:shd w:val="clear" w:color="auto" w:fill="FFFFFF"/>
-        </w:rPr>
-        <w:t xml:space="preserve">Figure </w:t>
+        <w:t>Computation Time: The scatter plot also highlights the consistency of the parallelized method, with most data points clustered around lower execution times.</w:t>
+      </w:r>
+      <w:r>
+        <w:rPr>
+          <w:color w:val="0D0D0D"/>
+          <w:shd w:val="clear" w:color="auto" w:fill="FFFFFF"/>
+        </w:rPr>
+        <w:t xml:space="preserve">[Figure </w:t>
       </w:r>
       <w:r>
         <w:rPr>
@@ -8603,7 +7967,7 @@
                     </pic:cNvPicPr>
                   </pic:nvPicPr>
                   <pic:blipFill>
-                    <a:blip r:embed="rId28" cstate="print">
+                    <a:blip r:embed="rId29" cstate="print">
                       <a:extLst>
                         <a:ext uri="{28A0092B-C50C-407E-A947-70E740481C1C}">
                           <a14:useLocalDpi xmlns:a14="http://schemas.microsoft.com/office/drawing/2010/main" val="0"/>
@@ -8757,7 +8121,7 @@
                     </pic:cNvPicPr>
                   </pic:nvPicPr>
                   <pic:blipFill>
-                    <a:blip r:embed="rId29" cstate="print">
+                    <a:blip r:embed="rId30" cstate="print">
                       <a:extLst>
                         <a:ext uri="{28A0092B-C50C-407E-A947-70E740481C1C}">
                           <a14:useLocalDpi xmlns:a14="http://schemas.microsoft.com/office/drawing/2010/main" val="0"/>
@@ -8912,6 +8276,9 @@
     </w:p>
     <w:p/>
     <w:p>
+      <w:pPr>
+        <w:jc w:val="both"/>
+      </w:pPr>
       <w:r>
         <w:t>In this section, we compare the performance of the new multi-threaded method (</w:t>
       </w:r>
@@ -9012,6 +8379,9 @@
     </w:p>
     <w:p/>
     <w:p>
+      <w:pPr>
+        <w:jc w:val="both"/>
+      </w:pPr>
       <w:r>
         <w:t>This graph visualizes the performance comparison between initialization time (</w:t>
       </w:r>
@@ -9077,7 +8447,7 @@
                     </pic:cNvPicPr>
                   </pic:nvPicPr>
                   <pic:blipFill>
-                    <a:blip r:embed="rId30" cstate="print">
+                    <a:blip r:embed="rId31" cstate="print">
                       <a:extLst>
                         <a:ext uri="{28A0092B-C50C-407E-A947-70E740481C1C}">
                           <a14:useLocalDpi xmlns:a14="http://schemas.microsoft.com/office/drawing/2010/main" val="0"/>
@@ -9268,7 +8638,7 @@
                     </pic:cNvPicPr>
                   </pic:nvPicPr>
                   <pic:blipFill>
-                    <a:blip r:embed="rId31" cstate="print">
+                    <a:blip r:embed="rId32" cstate="print">
                       <a:extLst>
                         <a:ext uri="{28A0092B-C50C-407E-A947-70E740481C1C}">
                           <a14:useLocalDpi xmlns:a14="http://schemas.microsoft.com/office/drawing/2010/main" val="0"/>
@@ -9448,6 +8818,7 @@
         <w:rPr>
           <w:noProof/>
         </w:rPr>
+        <w:lastRenderedPageBreak/>
         <w:drawing>
           <wp:inline distT="0" distB="0" distL="0" distR="0" wp14:anchorId="34371C27" wp14:editId="00021926">
             <wp:extent cx="3147047" cy="1882140"/>
@@ -9466,7 +8837,7 @@
                     </pic:cNvPicPr>
                   </pic:nvPicPr>
                   <pic:blipFill>
-                    <a:blip r:embed="rId32" cstate="print">
+                    <a:blip r:embed="rId33" cstate="print">
                       <a:extLst>
                         <a:ext uri="{28A0092B-C50C-407E-A947-70E740481C1C}">
                           <a14:useLocalDpi xmlns:a14="http://schemas.microsoft.com/office/drawing/2010/main" val="0"/>
@@ -9614,7 +8985,6 @@
         </w:rPr>
         <w:t xml:space="preserve">16 </w:t>
       </w:r>
-      <w:proofErr w:type="gramStart"/>
       <w:r>
         <w:rPr>
           <w:color w:val="0D0D0D"/>
@@ -9640,9 +9010,8 @@
           <w:szCs w:val="16"/>
           <w:shd w:val="clear" w:color="auto" w:fill="FFFFFF"/>
         </w:rPr>
-        <w:t>configurations</w:t>
-      </w:r>
-      <w:proofErr w:type="gramEnd"/>
+        <w:t>configurations across multiple PCs</w:t>
+      </w:r>
       <w:r>
         <w:rPr>
           <w:color w:val="0D0D0D"/>
@@ -9650,9 +9019,8 @@
           <w:szCs w:val="16"/>
           <w:shd w:val="clear" w:color="auto" w:fill="FFFFFF"/>
         </w:rPr>
-        <w:t xml:space="preserve"> across multiple </w:t>
-      </w:r>
-      <w:proofErr w:type="gramStart"/>
+        <w:t xml:space="preserve"> </w:t>
+      </w:r>
       <w:r>
         <w:rPr>
           <w:color w:val="0D0D0D"/>
@@ -9660,27 +9028,8 @@
           <w:szCs w:val="16"/>
           <w:shd w:val="clear" w:color="auto" w:fill="FFFFFF"/>
         </w:rPr>
-        <w:t>PCs</w:t>
-      </w:r>
-      <w:r>
-        <w:rPr>
-          <w:color w:val="0D0D0D"/>
-          <w:sz w:val="16"/>
-          <w:szCs w:val="16"/>
-          <w:shd w:val="clear" w:color="auto" w:fill="FFFFFF"/>
-        </w:rPr>
-        <w:t xml:space="preserve"> </w:t>
-      </w:r>
-      <w:r>
-        <w:rPr>
-          <w:color w:val="0D0D0D"/>
-          <w:sz w:val="16"/>
-          <w:szCs w:val="16"/>
-          <w:shd w:val="clear" w:color="auto" w:fill="FFFFFF"/>
-        </w:rPr>
         <w:t>.</w:t>
       </w:r>
-      <w:proofErr w:type="gramEnd"/>
     </w:p>
     <w:p/>
     <w:p>
@@ -9729,6 +9078,9 @@
       </w:pPr>
     </w:p>
     <w:p>
+      <w:pPr>
+        <w:jc w:val="both"/>
+      </w:pPr>
       <w:r>
         <w:t>This graph compares the performance of both the new multi-threaded method (</w:t>
       </w:r>
@@ -9759,7 +9111,11 @@
         <w:t>.</w:t>
       </w:r>
     </w:p>
-    <w:p/>
+    <w:p>
+      <w:pPr>
+        <w:jc w:val="both"/>
+      </w:pPr>
+    </w:p>
     <w:p>
       <w:r>
         <w:rPr>
@@ -9783,7 +9139,7 @@
                     </pic:cNvPicPr>
                   </pic:nvPicPr>
                   <pic:blipFill>
-                    <a:blip r:embed="rId33" cstate="print">
+                    <a:blip r:embed="rId34" cstate="print">
                       <a:extLst>
                         <a:ext uri="{28A0092B-C50C-407E-A947-70E740481C1C}">
                           <a14:useLocalDpi xmlns:a14="http://schemas.microsoft.com/office/drawing/2010/main" val="0"/>
@@ -9959,7 +9315,7 @@
                     </pic:cNvPicPr>
                   </pic:nvPicPr>
                   <pic:blipFill>
-                    <a:blip r:embed="rId34" cstate="print">
+                    <a:blip r:embed="rId35" cstate="print">
                       <a:extLst>
                         <a:ext uri="{28A0092B-C50C-407E-A947-70E740481C1C}">
                           <a14:useLocalDpi xmlns:a14="http://schemas.microsoft.com/office/drawing/2010/main" val="0"/>
@@ -10122,7 +9478,7 @@
                     </pic:cNvPicPr>
                   </pic:nvPicPr>
                   <pic:blipFill>
-                    <a:blip r:embed="rId35" cstate="print">
+                    <a:blip r:embed="rId36" cstate="print">
                       <a:extLst>
                         <a:ext uri="{28A0092B-C50C-407E-A947-70E740481C1C}">
                           <a14:useLocalDpi xmlns:a14="http://schemas.microsoft.com/office/drawing/2010/main" val="0"/>
@@ -10371,7 +9727,6 @@
         <w:t>Key findings from our experiments highlight that the </w:t>
       </w:r>
       <w:proofErr w:type="spellStart"/>
-      <w:proofErr w:type="gramStart"/>
       <w:r>
         <w:rPr>
           <w:b/>
@@ -10389,17 +9744,7 @@
           <w:color w:val="0D0D0D"/>
           <w:shd w:val="clear" w:color="auto" w:fill="FFFFFF"/>
         </w:rPr>
-        <w:t>(</w:t>
-      </w:r>
-      <w:proofErr w:type="gramEnd"/>
-      <w:r>
-        <w:rPr>
-          <w:b/>
-          <w:bCs/>
-          <w:color w:val="0D0D0D"/>
-          <w:shd w:val="clear" w:color="auto" w:fill="FFFFFF"/>
-        </w:rPr>
-        <w:t>)</w:t>
+        <w:t>()</w:t>
       </w:r>
       <w:r>
         <w:rPr>
@@ -10487,8 +9832,15 @@
           <w:color w:val="0D0D0D"/>
           <w:shd w:val="clear" w:color="auto" w:fill="FFFFFF"/>
         </w:rPr>
+        <w:t xml:space="preserve">Ultimately, our project underscores the transformative potential of multithreading in AI, enabling faster, more </w:t>
+      </w:r>
+      <w:r>
+        <w:rPr>
+          <w:color w:val="0D0D0D"/>
+          <w:shd w:val="clear" w:color="auto" w:fill="FFFFFF"/>
+        </w:rPr>
         <w:lastRenderedPageBreak/>
-        <w:t>Ultimately, our project underscores the transformative potential of multithreading in AI, enabling faster, more responsive, and resource-efficient algorithms that align with the growing demands of modern computing.</w:t>
+        <w:t>responsive, and resource-efficient algorithms that align with the growing demands of modern computing.</w:t>
       </w:r>
     </w:p>
     <w:p>
@@ -13339,8 +12691,8 @@
       </w:pPr>
     </w:p>
     <w:sectPr>
-      <w:headerReference w:type="default" r:id="rId36"/>
-      <w:footerReference w:type="default" r:id="rId37"/>
+      <w:headerReference w:type="default" r:id="rId37"/>
+      <w:footerReference w:type="default" r:id="rId38"/>
       <w:type w:val="continuous"/>
       <w:pgSz w:w="11906" w:h="16838" w:code="9"/>
       <w:pgMar w:top="1080" w:right="907" w:bottom="1440" w:left="907" w:header="720" w:footer="720" w:gutter="0"/>
@@ -14844,6 +14196,155 @@
     </w:lvl>
   </w:abstractNum>
   <w:abstractNum w:abstractNumId="5" w15:restartNumberingAfterBreak="0">
+    <w:nsid w:val="25310702"/>
+    <w:multiLevelType w:val="multilevel"/>
+    <w:tmpl w:val="F6C8EDFC"/>
+    <w:lvl w:ilvl="0">
+      <w:start w:val="1"/>
+      <w:numFmt w:val="bullet"/>
+      <w:lvlText w:val=""/>
+      <w:lvlJc w:val="left"/>
+      <w:pPr>
+        <w:tabs>
+          <w:tab w:val="num" w:pos="720"/>
+        </w:tabs>
+        <w:ind w:left="720" w:hanging="360"/>
+      </w:pPr>
+      <w:rPr>
+        <w:rFonts w:ascii="Symbol" w:hAnsi="Symbol" w:hint="default"/>
+        <w:sz w:val="20"/>
+      </w:rPr>
+    </w:lvl>
+    <w:lvl w:ilvl="1" w:tentative="1">
+      <w:start w:val="1"/>
+      <w:numFmt w:val="bullet"/>
+      <w:lvlText w:val="o"/>
+      <w:lvlJc w:val="left"/>
+      <w:pPr>
+        <w:tabs>
+          <w:tab w:val="num" w:pos="1440"/>
+        </w:tabs>
+        <w:ind w:left="1440" w:hanging="360"/>
+      </w:pPr>
+      <w:rPr>
+        <w:rFonts w:ascii="Courier New" w:hAnsi="Courier New" w:hint="default"/>
+        <w:sz w:val="20"/>
+      </w:rPr>
+    </w:lvl>
+    <w:lvl w:ilvl="2" w:tentative="1">
+      <w:start w:val="1"/>
+      <w:numFmt w:val="bullet"/>
+      <w:lvlText w:val=""/>
+      <w:lvlJc w:val="left"/>
+      <w:pPr>
+        <w:tabs>
+          <w:tab w:val="num" w:pos="2160"/>
+        </w:tabs>
+        <w:ind w:left="2160" w:hanging="360"/>
+      </w:pPr>
+      <w:rPr>
+        <w:rFonts w:ascii="Wingdings" w:hAnsi="Wingdings" w:hint="default"/>
+        <w:sz w:val="20"/>
+      </w:rPr>
+    </w:lvl>
+    <w:lvl w:ilvl="3" w:tentative="1">
+      <w:start w:val="1"/>
+      <w:numFmt w:val="bullet"/>
+      <w:lvlText w:val=""/>
+      <w:lvlJc w:val="left"/>
+      <w:pPr>
+        <w:tabs>
+          <w:tab w:val="num" w:pos="2880"/>
+        </w:tabs>
+        <w:ind w:left="2880" w:hanging="360"/>
+      </w:pPr>
+      <w:rPr>
+        <w:rFonts w:ascii="Wingdings" w:hAnsi="Wingdings" w:hint="default"/>
+        <w:sz w:val="20"/>
+      </w:rPr>
+    </w:lvl>
+    <w:lvl w:ilvl="4" w:tentative="1">
+      <w:start w:val="1"/>
+      <w:numFmt w:val="bullet"/>
+      <w:lvlText w:val=""/>
+      <w:lvlJc w:val="left"/>
+      <w:pPr>
+        <w:tabs>
+          <w:tab w:val="num" w:pos="3600"/>
+        </w:tabs>
+        <w:ind w:left="3600" w:hanging="360"/>
+      </w:pPr>
+      <w:rPr>
+        <w:rFonts w:ascii="Wingdings" w:hAnsi="Wingdings" w:hint="default"/>
+        <w:sz w:val="20"/>
+      </w:rPr>
+    </w:lvl>
+    <w:lvl w:ilvl="5" w:tentative="1">
+      <w:start w:val="1"/>
+      <w:numFmt w:val="bullet"/>
+      <w:lvlText w:val=""/>
+      <w:lvlJc w:val="left"/>
+      <w:pPr>
+        <w:tabs>
+          <w:tab w:val="num" w:pos="4320"/>
+        </w:tabs>
+        <w:ind w:left="4320" w:hanging="360"/>
+      </w:pPr>
+      <w:rPr>
+        <w:rFonts w:ascii="Wingdings" w:hAnsi="Wingdings" w:hint="default"/>
+        <w:sz w:val="20"/>
+      </w:rPr>
+    </w:lvl>
+    <w:lvl w:ilvl="6" w:tentative="1">
+      <w:start w:val="1"/>
+      <w:numFmt w:val="bullet"/>
+      <w:lvlText w:val=""/>
+      <w:lvlJc w:val="left"/>
+      <w:pPr>
+        <w:tabs>
+          <w:tab w:val="num" w:pos="5040"/>
+        </w:tabs>
+        <w:ind w:left="5040" w:hanging="360"/>
+      </w:pPr>
+      <w:rPr>
+        <w:rFonts w:ascii="Wingdings" w:hAnsi="Wingdings" w:hint="default"/>
+        <w:sz w:val="20"/>
+      </w:rPr>
+    </w:lvl>
+    <w:lvl w:ilvl="7" w:tentative="1">
+      <w:start w:val="1"/>
+      <w:numFmt w:val="bullet"/>
+      <w:lvlText w:val=""/>
+      <w:lvlJc w:val="left"/>
+      <w:pPr>
+        <w:tabs>
+          <w:tab w:val="num" w:pos="5760"/>
+        </w:tabs>
+        <w:ind w:left="5760" w:hanging="360"/>
+      </w:pPr>
+      <w:rPr>
+        <w:rFonts w:ascii="Wingdings" w:hAnsi="Wingdings" w:hint="default"/>
+        <w:sz w:val="20"/>
+      </w:rPr>
+    </w:lvl>
+    <w:lvl w:ilvl="8" w:tentative="1">
+      <w:start w:val="1"/>
+      <w:numFmt w:val="bullet"/>
+      <w:lvlText w:val=""/>
+      <w:lvlJc w:val="left"/>
+      <w:pPr>
+        <w:tabs>
+          <w:tab w:val="num" w:pos="6480"/>
+        </w:tabs>
+        <w:ind w:left="6480" w:hanging="360"/>
+      </w:pPr>
+      <w:rPr>
+        <w:rFonts w:ascii="Wingdings" w:hAnsi="Wingdings" w:hint="default"/>
+        <w:sz w:val="20"/>
+      </w:rPr>
+    </w:lvl>
+  </w:abstractNum>
+  <w:abstractNum w:abstractNumId="6" w15:restartNumberingAfterBreak="0">
     <w:nsid w:val="26FE1FCF"/>
     <w:multiLevelType w:val="hybridMultilevel"/>
     <w:tmpl w:val="33826962"/>
@@ -15004,7 +14505,7 @@
       </w:rPr>
     </w:lvl>
   </w:abstractNum>
-  <w:abstractNum w:abstractNumId="6" w15:restartNumberingAfterBreak="0">
+  <w:abstractNum w:abstractNumId="7" w15:restartNumberingAfterBreak="0">
     <w:nsid w:val="283C422F"/>
     <w:multiLevelType w:val="multilevel"/>
     <w:tmpl w:val="AC84B624"/>
@@ -15153,7 +14654,7 @@
       </w:rPr>
     </w:lvl>
   </w:abstractNum>
-  <w:abstractNum w:abstractNumId="7" w15:restartNumberingAfterBreak="0">
+  <w:abstractNum w:abstractNumId="8" w15:restartNumberingAfterBreak="0">
     <w:nsid w:val="295E475E"/>
     <w:multiLevelType w:val="multilevel"/>
     <w:tmpl w:val="55FE7FEE"/>
@@ -15266,7 +14767,7 @@
       </w:pPr>
     </w:lvl>
   </w:abstractNum>
-  <w:abstractNum w:abstractNumId="8" w15:restartNumberingAfterBreak="0">
+  <w:abstractNum w:abstractNumId="9" w15:restartNumberingAfterBreak="0">
     <w:nsid w:val="32DD0560"/>
     <w:multiLevelType w:val="multilevel"/>
     <w:tmpl w:val="AFA4D2DA"/>
@@ -15416,7 +14917,7 @@
       </w:rPr>
     </w:lvl>
   </w:abstractNum>
-  <w:abstractNum w:abstractNumId="9" w15:restartNumberingAfterBreak="0">
+  <w:abstractNum w:abstractNumId="10" w15:restartNumberingAfterBreak="0">
     <w:nsid w:val="37660336"/>
     <w:multiLevelType w:val="hybridMultilevel"/>
     <w:tmpl w:val="754EAC84"/>
@@ -15557,7 +15058,7 @@
       </w:rPr>
     </w:lvl>
   </w:abstractNum>
-  <w:abstractNum w:abstractNumId="10" w15:restartNumberingAfterBreak="0">
+  <w:abstractNum w:abstractNumId="11" w15:restartNumberingAfterBreak="0">
     <w:nsid w:val="37FE412E"/>
     <w:multiLevelType w:val="multilevel"/>
     <w:tmpl w:val="31C26738"/>
@@ -15707,7 +15208,7 @@
       </w:rPr>
     </w:lvl>
   </w:abstractNum>
-  <w:abstractNum w:abstractNumId="11" w15:restartNumberingAfterBreak="0">
+  <w:abstractNum w:abstractNumId="12" w15:restartNumberingAfterBreak="0">
     <w:nsid w:val="3DA05655"/>
     <w:multiLevelType w:val="multilevel"/>
     <w:tmpl w:val="0060CB02"/>
@@ -15857,7 +15358,7 @@
       </w:rPr>
     </w:lvl>
   </w:abstractNum>
-  <w:abstractNum w:abstractNumId="12" w15:restartNumberingAfterBreak="0">
+  <w:abstractNum w:abstractNumId="13" w15:restartNumberingAfterBreak="0">
     <w:nsid w:val="3ED65F7A"/>
     <w:multiLevelType w:val="multilevel"/>
     <w:tmpl w:val="5B74CA86"/>
@@ -16007,7 +15508,7 @@
       </w:rPr>
     </w:lvl>
   </w:abstractNum>
-  <w:abstractNum w:abstractNumId="13" w15:restartNumberingAfterBreak="0">
+  <w:abstractNum w:abstractNumId="14" w15:restartNumberingAfterBreak="0">
     <w:nsid w:val="4189603E"/>
     <w:multiLevelType w:val="multilevel"/>
     <w:tmpl w:val="1DE05D8E"/>
@@ -16213,7 +15714,7 @@
       </w:rPr>
     </w:lvl>
   </w:abstractNum>
-  <w:abstractNum w:abstractNumId="14" w15:restartNumberingAfterBreak="0">
+  <w:abstractNum w:abstractNumId="15" w15:restartNumberingAfterBreak="0">
     <w:nsid w:val="419248DC"/>
     <w:multiLevelType w:val="multilevel"/>
     <w:tmpl w:val="BA62EAE4"/>
@@ -16326,7 +15827,7 @@
       </w:pPr>
     </w:lvl>
   </w:abstractNum>
-  <w:abstractNum w:abstractNumId="15" w15:restartNumberingAfterBreak="0">
+  <w:abstractNum w:abstractNumId="16" w15:restartNumberingAfterBreak="0">
     <w:nsid w:val="493C3F76"/>
     <w:multiLevelType w:val="hybridMultilevel"/>
     <w:tmpl w:val="9A9E418C"/>
@@ -16437,7 +15938,7 @@
       </w:pPr>
     </w:lvl>
   </w:abstractNum>
-  <w:abstractNum w:abstractNumId="16" w15:restartNumberingAfterBreak="0">
+  <w:abstractNum w:abstractNumId="17" w15:restartNumberingAfterBreak="0">
     <w:nsid w:val="52CA544A"/>
     <w:multiLevelType w:val="singleLevel"/>
     <w:tmpl w:val="AED6D67E"/>
@@ -16464,7 +15965,7 @@
       </w:rPr>
     </w:lvl>
   </w:abstractNum>
-  <w:abstractNum w:abstractNumId="17" w15:restartNumberingAfterBreak="0">
+  <w:abstractNum w:abstractNumId="18" w15:restartNumberingAfterBreak="0">
     <w:nsid w:val="553D537D"/>
     <w:multiLevelType w:val="multilevel"/>
     <w:tmpl w:val="AA4E2132"/>
@@ -16614,7 +16115,7 @@
       </w:rPr>
     </w:lvl>
   </w:abstractNum>
-  <w:abstractNum w:abstractNumId="18" w15:restartNumberingAfterBreak="0">
+  <w:abstractNum w:abstractNumId="19" w15:restartNumberingAfterBreak="0">
     <w:nsid w:val="5DC47EBE"/>
     <w:multiLevelType w:val="multilevel"/>
     <w:tmpl w:val="03B6A792"/>
@@ -16727,7 +16228,7 @@
       </w:pPr>
     </w:lvl>
   </w:abstractNum>
-  <w:abstractNum w:abstractNumId="19" w15:restartNumberingAfterBreak="0">
+  <w:abstractNum w:abstractNumId="20" w15:restartNumberingAfterBreak="0">
     <w:nsid w:val="610F35F0"/>
     <w:multiLevelType w:val="multilevel"/>
     <w:tmpl w:val="E20A34CC"/>
@@ -16840,7 +16341,7 @@
       </w:pPr>
     </w:lvl>
   </w:abstractNum>
-  <w:abstractNum w:abstractNumId="20" w15:restartNumberingAfterBreak="0">
+  <w:abstractNum w:abstractNumId="21" w15:restartNumberingAfterBreak="0">
     <w:nsid w:val="62036563"/>
     <w:multiLevelType w:val="multilevel"/>
     <w:tmpl w:val="8108B7EE"/>
@@ -16989,7 +16490,7 @@
       </w:rPr>
     </w:lvl>
   </w:abstractNum>
-  <w:abstractNum w:abstractNumId="21" w15:restartNumberingAfterBreak="0">
+  <w:abstractNum w:abstractNumId="22" w15:restartNumberingAfterBreak="0">
     <w:nsid w:val="6C402C58"/>
     <w:multiLevelType w:val="hybridMultilevel"/>
     <w:tmpl w:val="9A1CA078"/>
@@ -17134,7 +16635,7 @@
       </w:rPr>
     </w:lvl>
   </w:abstractNum>
-  <w:abstractNum w:abstractNumId="22" w15:restartNumberingAfterBreak="0">
+  <w:abstractNum w:abstractNumId="23" w15:restartNumberingAfterBreak="0">
     <w:nsid w:val="6CD32DA8"/>
     <w:multiLevelType w:val="singleLevel"/>
     <w:tmpl w:val="166470C2"/>
@@ -17160,7 +16661,7 @@
       </w:rPr>
     </w:lvl>
   </w:abstractNum>
-  <w:abstractNum w:abstractNumId="23" w15:restartNumberingAfterBreak="0">
+  <w:abstractNum w:abstractNumId="24" w15:restartNumberingAfterBreak="0">
     <w:nsid w:val="78053159"/>
     <w:multiLevelType w:val="hybridMultilevel"/>
     <w:tmpl w:val="92C04ACC"/>
@@ -17275,7 +16776,7 @@
       </w:rPr>
     </w:lvl>
   </w:abstractNum>
-  <w:abstractNum w:abstractNumId="24" w15:restartNumberingAfterBreak="0">
+  <w:abstractNum w:abstractNumId="25" w15:restartNumberingAfterBreak="0">
     <w:nsid w:val="79F31FAD"/>
     <w:multiLevelType w:val="hybridMultilevel"/>
     <w:tmpl w:val="2FB8FFA8"/>
@@ -17390,7 +16891,7 @@
       </w:rPr>
     </w:lvl>
   </w:abstractNum>
-  <w:abstractNum w:abstractNumId="25" w15:restartNumberingAfterBreak="0">
+  <w:abstractNum w:abstractNumId="26" w15:restartNumberingAfterBreak="0">
     <w:nsid w:val="79F44603"/>
     <w:multiLevelType w:val="hybridMultilevel"/>
     <w:tmpl w:val="562A1320"/>
@@ -17477,7 +16978,7 @@
       </w:pPr>
     </w:lvl>
   </w:abstractNum>
-  <w:abstractNum w:abstractNumId="26" w15:restartNumberingAfterBreak="0">
+  <w:abstractNum w:abstractNumId="27" w15:restartNumberingAfterBreak="0">
     <w:nsid w:val="7DAA4735"/>
     <w:multiLevelType w:val="multilevel"/>
     <w:tmpl w:val="327040D8"/>
@@ -17628,46 +17129,46 @@
     </w:lvl>
   </w:abstractNum>
   <w:num w:numId="1" w16cid:durableId="201210135">
-    <w:abstractNumId w:val="9"/>
+    <w:abstractNumId w:val="10"/>
   </w:num>
   <w:num w:numId="2" w16cid:durableId="164590154">
-    <w:abstractNumId w:val="21"/>
+    <w:abstractNumId w:val="22"/>
   </w:num>
   <w:num w:numId="3" w16cid:durableId="1348554600">
-    <w:abstractNumId w:val="5"/>
+    <w:abstractNumId w:val="6"/>
   </w:num>
   <w:num w:numId="4" w16cid:durableId="1456287117">
+    <w:abstractNumId w:val="14"/>
+  </w:num>
+  <w:num w:numId="5" w16cid:durableId="261450582">
+    <w:abstractNumId w:val="17"/>
+  </w:num>
+  <w:num w:numId="6" w16cid:durableId="449059100">
+    <w:abstractNumId w:val="23"/>
+  </w:num>
+  <w:num w:numId="7" w16cid:durableId="964695844">
+    <w:abstractNumId w:val="16"/>
+  </w:num>
+  <w:num w:numId="8" w16cid:durableId="579994082">
+    <w:abstractNumId w:val="26"/>
+  </w:num>
+  <w:num w:numId="9" w16cid:durableId="362093316">
+    <w:abstractNumId w:val="19"/>
+  </w:num>
+  <w:num w:numId="10" w16cid:durableId="1086727680">
+    <w:abstractNumId w:val="25"/>
+  </w:num>
+  <w:num w:numId="11" w16cid:durableId="1505590616">
     <w:abstractNumId w:val="13"/>
   </w:num>
-  <w:num w:numId="5" w16cid:durableId="261450582">
-    <w:abstractNumId w:val="16"/>
+  <w:num w:numId="12" w16cid:durableId="1026640733">
+    <w:abstractNumId w:val="24"/>
   </w:num>
-  <w:num w:numId="6" w16cid:durableId="449059100">
-    <w:abstractNumId w:val="22"/>
-  </w:num>
-  <w:num w:numId="7" w16cid:durableId="964695844">
-    <w:abstractNumId w:val="15"/>
-  </w:num>
-  <w:num w:numId="8" w16cid:durableId="579994082">
-    <w:abstractNumId w:val="25"/>
-  </w:num>
-  <w:num w:numId="9" w16cid:durableId="362093316">
+  <w:num w:numId="13" w16cid:durableId="298347580">
     <w:abstractNumId w:val="18"/>
   </w:num>
-  <w:num w:numId="10" w16cid:durableId="1086727680">
-    <w:abstractNumId w:val="24"/>
-  </w:num>
-  <w:num w:numId="11" w16cid:durableId="1505590616">
-    <w:abstractNumId w:val="12"/>
-  </w:num>
-  <w:num w:numId="12" w16cid:durableId="1026640733">
-    <w:abstractNumId w:val="23"/>
-  </w:num>
-  <w:num w:numId="13" w16cid:durableId="298347580">
-    <w:abstractNumId w:val="17"/>
-  </w:num>
   <w:num w:numId="14" w16cid:durableId="1714772779">
-    <w:abstractNumId w:val="8"/>
+    <w:abstractNumId w:val="9"/>
   </w:num>
   <w:num w:numId="15" w16cid:durableId="533419177">
     <w:abstractNumId w:val="0"/>
@@ -17676,28 +17177,28 @@
     <w:abstractNumId w:val="2"/>
   </w:num>
   <w:num w:numId="17" w16cid:durableId="78139716">
-    <w:abstractNumId w:val="11"/>
+    <w:abstractNumId w:val="12"/>
   </w:num>
   <w:num w:numId="18" w16cid:durableId="2049334298">
-    <w:abstractNumId w:val="26"/>
+    <w:abstractNumId w:val="27"/>
   </w:num>
   <w:num w:numId="19" w16cid:durableId="1536771205">
     <w:abstractNumId w:val="1"/>
   </w:num>
   <w:num w:numId="20" w16cid:durableId="1237009252">
+    <w:abstractNumId w:val="21"/>
+  </w:num>
+  <w:num w:numId="21" w16cid:durableId="1507283509">
+    <w:abstractNumId w:val="15"/>
+  </w:num>
+  <w:num w:numId="22" w16cid:durableId="2072726708">
     <w:abstractNumId w:val="20"/>
   </w:num>
-  <w:num w:numId="21" w16cid:durableId="1507283509">
-    <w:abstractNumId w:val="14"/>
-  </w:num>
-  <w:num w:numId="22" w16cid:durableId="2072726708">
-    <w:abstractNumId w:val="19"/>
-  </w:num>
   <w:num w:numId="23" w16cid:durableId="340476981">
-    <w:abstractNumId w:val="10"/>
+    <w:abstractNumId w:val="11"/>
   </w:num>
   <w:num w:numId="24" w16cid:durableId="397871028">
-    <w:abstractNumId w:val="7"/>
+    <w:abstractNumId w:val="8"/>
   </w:num>
   <w:num w:numId="25" w16cid:durableId="576130007">
     <w:abstractNumId w:val="3"/>
@@ -17706,7 +17207,10 @@
     <w:abstractNumId w:val="4"/>
   </w:num>
   <w:num w:numId="27" w16cid:durableId="238059342">
-    <w:abstractNumId w:val="6"/>
+    <w:abstractNumId w:val="7"/>
+  </w:num>
+  <w:num w:numId="28" w16cid:durableId="948588609">
+    <w:abstractNumId w:val="5"/>
   </w:num>
   <w:numIdMacAtCleanup w:val="23"/>
 </w:numbering>
@@ -19029,15 +18533,6 @@
 </file>
 
 <file path=customXml/item1.xml><?xml version="1.0" encoding="utf-8"?>
-<?mso-contentType ?>
-<FormTemplates xmlns="http://schemas.microsoft.com/sharepoint/v3/contenttype/forms">
-  <Display>DocumentLibraryForm</Display>
-  <Edit>DocumentLibraryForm</Edit>
-  <New>DocumentLibraryForm</New>
-</FormTemplates>
-</file>
-
-<file path=customXml/item2.xml><?xml version="1.0" encoding="utf-8"?>
 <b:Sources xmlns:b="http://schemas.openxmlformats.org/officeDocument/2006/bibliography" xmlns="http://schemas.openxmlformats.org/officeDocument/2006/bibliography" SelectedStyle="\IEEE2006OfficeOnline.xsl" StyleName="IEEE" Version="2006">
   <b:Source>
     <b:Tag>Dam21</b:Tag>
@@ -19597,13 +19092,16 @@
 </b:Sources>
 </file>
 
-<file path=customXml/item3.xml><?xml version="1.0" encoding="utf-8"?>
-<p:properties xmlns:p="http://schemas.microsoft.com/office/2006/metadata/properties" xmlns:xsi="http://www.w3.org/2001/XMLSchema-instance" xmlns:pc="http://schemas.microsoft.com/office/infopath/2007/PartnerControls">
-  <documentManagement/>
-</p:properties>
+<file path=customXml/item2.xml><?xml version="1.0" encoding="utf-8"?>
+<?mso-contentType ?>
+<FormTemplates xmlns="http://schemas.microsoft.com/sharepoint/v3/contenttype/forms">
+  <Display>DocumentLibraryForm</Display>
+  <Edit>DocumentLibraryForm</Edit>
+  <New>DocumentLibraryForm</New>
+</FormTemplates>
 </file>
 
-<file path=customXml/item4.xml><?xml version="1.0" encoding="utf-8"?>
+<file path=customXml/item3.xml><?xml version="1.0" encoding="utf-8"?>
 <ct:contentTypeSchema xmlns:ct="http://schemas.microsoft.com/office/2006/metadata/contentType" xmlns:ma="http://schemas.microsoft.com/office/2006/metadata/properties/metaAttributes" ct:_="" ma:_="" ma:contentTypeName="Document" ma:contentTypeID="0x010100244DA4597C2DA943933A249CF35A3C17" ma:contentTypeVersion="5" ma:contentTypeDescription="Create a new document." ma:contentTypeScope="" ma:versionID="79cd3048bded257ca59f28facd802837">
   <xsd:schema xmlns:xsd="http://www.w3.org/2001/XMLSchema" xmlns:xs="http://www.w3.org/2001/XMLSchema" xmlns:p="http://schemas.microsoft.com/office/2006/metadata/properties" xmlns:ns3="936daadb-6db6-4468-bf48-4ae045496840" targetNamespace="http://schemas.microsoft.com/office/2006/metadata/properties" ma:root="true" ma:fieldsID="e924f1278865bce780dcb264ecb06437" ns3:_="">
     <xsd:import namespace="936daadb-6db6-4468-bf48-4ae045496840"/>
@@ -19753,7 +19251,21 @@
 </ct:contentTypeSchema>
 </file>
 
+<file path=customXml/item4.xml><?xml version="1.0" encoding="utf-8"?>
+<p:properties xmlns:p="http://schemas.microsoft.com/office/2006/metadata/properties" xmlns:xsi="http://www.w3.org/2001/XMLSchema-instance" xmlns:pc="http://schemas.microsoft.com/office/infopath/2007/PartnerControls">
+  <documentManagement/>
+</p:properties>
+</file>
+
 <file path=customXml/itemProps1.xml><?xml version="1.0" encoding="utf-8"?>
+<ds:datastoreItem xmlns:ds="http://schemas.openxmlformats.org/officeDocument/2006/customXml" ds:itemID="{9E93547A-5D10-4E37-8A3C-6D2A2F7F390C}">
+  <ds:schemaRefs>
+    <ds:schemaRef ds:uri="http://schemas.openxmlformats.org/officeDocument/2006/bibliography"/>
+  </ds:schemaRefs>
+</ds:datastoreItem>
+</file>
+
+<file path=customXml/itemProps2.xml><?xml version="1.0" encoding="utf-8"?>
 <ds:datastoreItem xmlns:ds="http://schemas.openxmlformats.org/officeDocument/2006/customXml" ds:itemID="{88F3F4E0-067B-40FB-A48B-6269F4A0D664}">
   <ds:schemaRefs>
     <ds:schemaRef ds:uri="http://schemas.microsoft.com/sharepoint/v3/contenttype/forms"/>
@@ -19761,24 +19273,7 @@
 </ds:datastoreItem>
 </file>
 
-<file path=customXml/itemProps2.xml><?xml version="1.0" encoding="utf-8"?>
-<ds:datastoreItem xmlns:ds="http://schemas.openxmlformats.org/officeDocument/2006/customXml" ds:itemID="{9E93547A-5D10-4E37-8A3C-6D2A2F7F390C}">
-  <ds:schemaRefs>
-    <ds:schemaRef ds:uri="http://schemas.openxmlformats.org/officeDocument/2006/bibliography"/>
-  </ds:schemaRefs>
-</ds:datastoreItem>
-</file>
-
 <file path=customXml/itemProps3.xml><?xml version="1.0" encoding="utf-8"?>
-<ds:datastoreItem xmlns:ds="http://schemas.openxmlformats.org/officeDocument/2006/customXml" ds:itemID="{AF927845-869C-4CF7-85EE-10A8386E5F92}">
-  <ds:schemaRefs>
-    <ds:schemaRef ds:uri="http://schemas.microsoft.com/office/2006/metadata/properties"/>
-    <ds:schemaRef ds:uri="http://schemas.microsoft.com/office/infopath/2007/PartnerControls"/>
-  </ds:schemaRefs>
-</ds:datastoreItem>
-</file>
-
-<file path=customXml/itemProps4.xml><?xml version="1.0" encoding="utf-8"?>
 <ds:datastoreItem xmlns:ds="http://schemas.openxmlformats.org/officeDocument/2006/customXml" ds:itemID="{82C9358B-E3D9-4C38-A803-67F51DB06356}">
   <ds:schemaRefs>
     <ds:schemaRef ds:uri="http://schemas.microsoft.com/office/2006/metadata/contentType"/>
@@ -19794,4 +19289,13 @@
     <ds:schemaRef ds:uri="http://schemas.microsoft.com/internal/obd"/>
   </ds:schemaRefs>
 </ds:datastoreItem>
+</file>
+
+<file path=customXml/itemProps4.xml><?xml version="1.0" encoding="utf-8"?>
+<ds:datastoreItem xmlns:ds="http://schemas.openxmlformats.org/officeDocument/2006/customXml" ds:itemID="{AF927845-869C-4CF7-85EE-10A8386E5F92}">
+  <ds:schemaRefs>
+    <ds:schemaRef ds:uri="http://schemas.microsoft.com/office/2006/metadata/properties"/>
+    <ds:schemaRef ds:uri="http://schemas.microsoft.com/office/infopath/2007/PartnerControls"/>
+  </ds:schemaRefs>
+</ds:datastoreItem>
 </file>
</xml_diff>